<commit_message>
Ajustes de formato y otros. Version previa a revisión final
</commit_message>
<xml_diff>
--- a/output/Propuesta.docx
+++ b/output/Propuesta.docx
@@ -3,12 +3,24 @@
 <w:document xmlns:wpc="http://schemas.microsoft.com/office/word/2010/wordprocessingCanvas" xmlns:mo="http://schemas.microsoft.com/office/mac/office/2008/main" xmlns:mc="http://schemas.openxmlformats.org/markup-compatibility/2006" xmlns:mv="urn:schemas-microsoft-com:mac:vml" xmlns:o="urn:schemas-microsoft-com:office:office" xmlns:r="http://schemas.openxmlformats.org/officeDocument/2006/relationships" xmlns:m="http://schemas.openxmlformats.org/officeDocument/2006/math" xmlns:v="urn:schemas-microsoft-com:vml" xmlns:wp14="http://schemas.microsoft.com/office/word/2010/wordprocessingDrawing" xmlns:wp="http://schemas.openxmlformats.org/drawingml/2006/wordprocessingDrawing" xmlns:w10="urn:schemas-microsoft-com:office:word" xmlns:w="http://schemas.openxmlformats.org/wordprocessingml/2006/main" xmlns:w14="http://schemas.microsoft.com/office/word/2010/wordml" xmlns:wpg="http://schemas.microsoft.com/office/word/2010/wordprocessingGroup" xmlns:wpi="http://schemas.microsoft.com/office/word/2010/wordprocessingInk" xmlns:wne="http://schemas.microsoft.com/office/word/2006/wordml" xmlns:wps="http://schemas.microsoft.com/office/word/2010/wordprocessingShape" mc:Ignorable="w14 wp14">
   <w:body>
     <w:p>
-      <w:r>
-        <w:rPr/>
+      <w:pPr>
+        <w:pStyle w:val="Heading1"/>
+        <w:spacing w:before="480" w:after="240"/>
+        <w:jc w:val="center"/>
+      </w:pPr>
+      <w:r>
+        <w:rPr>
+          <w:b/>
+          <w:color w:val="1B2C3E"/>
+          <w:sz w:val="48"/>
+        </w:rPr>
         <w:t>Control Arquitectónico Obligatorio y Manual de Imagen Urbana</w:t>
       </w:r>
     </w:p>
     <w:p>
+      <w:pPr>
+        <w:spacing w:after="160"/>
+      </w:pPr>
       <w:r>
         <w:rPr/>
       </w:r>
@@ -32,6 +44,9 @@
       </w:r>
     </w:p>
     <w:p>
+      <w:pPr>
+        <w:spacing w:after="160"/>
+      </w:pPr>
       <w:r>
         <w:rPr/>
       </w:r>
@@ -119,6 +134,7 @@
     <w:p>
       <w:pPr>
         <w:pStyle w:val="Heading1"/>
+        <w:pageBreakBefore/>
         <w:spacing w:before="480" w:after="240"/>
         <w:jc w:val="center"/>
       </w:pPr>
@@ -160,7 +176,7 @@
     <w:p>
       <w:pPr>
         <w:pBdr>
-          <w:bottom w:val="single" w:sz="6" w:space="1" w:color="AAAAAA"/>
+          <w:bottom w:val="single" w:sz="6" w:space="1" w:color="E2E8F0"/>
         </w:pBdr>
       </w:pPr>
     </w:p>
@@ -262,7 +278,7 @@
     <w:p>
       <w:pPr>
         <w:pBdr>
-          <w:bottom w:val="single" w:sz="6" w:space="1" w:color="AAAAAA"/>
+          <w:bottom w:val="single" w:sz="6" w:space="1" w:color="E2E8F0"/>
         </w:pBdr>
       </w:pPr>
     </w:p>
@@ -596,7 +612,7 @@
     <w:p>
       <w:pPr>
         <w:pBdr>
-          <w:bottom w:val="single" w:sz="6" w:space="1" w:color="AAAAAA"/>
+          <w:bottom w:val="single" w:sz="6" w:space="1" w:color="E2E8F0"/>
         </w:pBdr>
       </w:pPr>
     </w:p>
@@ -702,7 +718,7 @@
     <w:p>
       <w:pPr>
         <w:pBdr>
-          <w:bottom w:val="single" w:sz="6" w:space="1" w:color="AAAAAA"/>
+          <w:bottom w:val="single" w:sz="6" w:space="1" w:color="E2E8F0"/>
         </w:pBdr>
       </w:pPr>
     </w:p>
@@ -759,7 +775,7 @@
     <w:p>
       <w:pPr>
         <w:pBdr>
-          <w:bottom w:val="single" w:sz="6" w:space="1" w:color="AAAAAA"/>
+          <w:bottom w:val="single" w:sz="6" w:space="1" w:color="E2E8F0"/>
         </w:pBdr>
       </w:pPr>
     </w:p>
@@ -1223,6 +1239,9 @@
     <w:p>
       <w:pPr>
         <w:ind w:left="720"/>
+        <w:pBdr>
+          <w:left w:val="single" w:sz="12" w:space="8" w:color="E2E8F0"/>
+        </w:pBdr>
       </w:pPr>
       <w:r>
         <w:rPr>
@@ -1234,7 +1253,7 @@
     <w:p>
       <w:pPr>
         <w:pBdr>
-          <w:bottom w:val="single" w:sz="6" w:space="1" w:color="AAAAAA"/>
+          <w:bottom w:val="single" w:sz="6" w:space="1" w:color="E2E8F0"/>
         </w:pBdr>
       </w:pPr>
     </w:p>
@@ -1319,7 +1338,7 @@
     <w:p>
       <w:pPr>
         <w:pBdr>
-          <w:bottom w:val="single" w:sz="6" w:space="1" w:color="AAAAAA"/>
+          <w:bottom w:val="single" w:sz="6" w:space="1" w:color="E2E8F0"/>
         </w:pBdr>
       </w:pPr>
     </w:p>
@@ -1385,7 +1404,7 @@
     <w:p>
       <w:pPr>
         <w:pBdr>
-          <w:bottom w:val="single" w:sz="6" w:space="1" w:color="AAAAAA"/>
+          <w:bottom w:val="single" w:sz="6" w:space="1" w:color="E2E8F0"/>
         </w:pBdr>
       </w:pPr>
     </w:p>
@@ -1403,7 +1422,7 @@
     <w:p>
       <w:pPr>
         <w:pBdr>
-          <w:bottom w:val="single" w:sz="6" w:space="1" w:color="AAAAAA"/>
+          <w:bottom w:val="single" w:sz="6" w:space="1" w:color="E2E8F0"/>
         </w:pBdr>
       </w:pPr>
     </w:p>
@@ -1484,7 +1503,7 @@
     <w:p>
       <w:pPr>
         <w:pBdr>
-          <w:bottom w:val="single" w:sz="6" w:space="1" w:color="AAAAAA"/>
+          <w:bottom w:val="single" w:sz="6" w:space="1" w:color="E2E8F0"/>
         </w:pBdr>
       </w:pPr>
     </w:p>
@@ -2127,7 +2146,7 @@
     <w:p>
       <w:pPr>
         <w:pBdr>
-          <w:bottom w:val="single" w:sz="6" w:space="1" w:color="AAAAAA"/>
+          <w:bottom w:val="single" w:sz="6" w:space="1" w:color="E2E8F0"/>
         </w:pBdr>
       </w:pPr>
     </w:p>
@@ -2196,7 +2215,7 @@
     <w:p>
       <w:pPr>
         <w:pBdr>
-          <w:bottom w:val="single" w:sz="6" w:space="1" w:color="AAAAAA"/>
+          <w:bottom w:val="single" w:sz="6" w:space="1" w:color="E2E8F0"/>
         </w:pBdr>
       </w:pPr>
     </w:p>
@@ -2501,16 +2520,20 @@
       </w:r>
     </w:p>
     <w:p>
+      <w:r>
+        <w:br w:type="page"/>
+      </w:r>
+    </w:p>
+    <w:p>
       <w:pPr>
         <w:pBdr>
-          <w:bottom w:val="single" w:sz="6" w:space="1" w:color="AAAAAA"/>
+          <w:bottom w:val="single" w:sz="6" w:space="1" w:color="E2E8F0"/>
         </w:pBdr>
       </w:pPr>
     </w:p>
     <w:p>
       <w:pPr>
         <w:pStyle w:val="Heading1"/>
-        <w:pageBreakBefore/>
         <w:spacing w:before="480" w:after="240"/>
         <w:jc w:val="center"/>
       </w:pPr>
@@ -2661,9 +2684,14 @@
       </w:r>
     </w:p>
     <w:p>
+      <w:r>
+        <w:br w:type="page"/>
+      </w:r>
+    </w:p>
+    <w:p>
       <w:pPr>
         <w:pBdr>
-          <w:bottom w:val="single" w:sz="6" w:space="1" w:color="AAAAAA"/>
+          <w:bottom w:val="single" w:sz="6" w:space="1" w:color="E2E8F0"/>
         </w:pBdr>
       </w:pPr>
     </w:p>
@@ -3021,6 +3049,9 @@
     <w:p>
       <w:pPr>
         <w:ind w:left="720"/>
+        <w:pBdr>
+          <w:left w:val="single" w:sz="12" w:space="8" w:color="E2E8F0"/>
+        </w:pBdr>
       </w:pPr>
       <w:r>
         <w:rPr>
@@ -3117,14 +3148,19 @@
     <w:p>
       <w:pPr>
         <w:pBdr>
-          <w:bottom w:val="single" w:sz="6" w:space="1" w:color="AAAAAA"/>
+          <w:bottom w:val="single" w:sz="6" w:space="1" w:color="E2E8F0"/>
         </w:pBdr>
       </w:pPr>
     </w:p>
     <w:p>
+      <w:r>
+        <w:br w:type="page"/>
+      </w:r>
+    </w:p>
+    <w:p>
       <w:pPr>
         <w:pBdr>
-          <w:bottom w:val="single" w:sz="6" w:space="1" w:color="AAAAAA"/>
+          <w:bottom w:val="single" w:sz="6" w:space="1" w:color="E2E8F0"/>
         </w:pBdr>
       </w:pPr>
     </w:p>
@@ -3598,14 +3634,19 @@
     <w:p>
       <w:pPr>
         <w:pBdr>
-          <w:bottom w:val="single" w:sz="6" w:space="1" w:color="AAAAAA"/>
+          <w:bottom w:val="single" w:sz="6" w:space="1" w:color="E2E8F0"/>
         </w:pBdr>
       </w:pPr>
     </w:p>
     <w:p>
+      <w:r>
+        <w:br w:type="page"/>
+      </w:r>
+    </w:p>
+    <w:p>
       <w:pPr>
         <w:pBdr>
-          <w:bottom w:val="single" w:sz="6" w:space="1" w:color="AAAAAA"/>
+          <w:bottom w:val="single" w:sz="6" w:space="1" w:color="E2E8F0"/>
         </w:pBdr>
       </w:pPr>
     </w:p>
@@ -3919,14 +3960,19 @@
     <w:p>
       <w:pPr>
         <w:pBdr>
-          <w:bottom w:val="single" w:sz="6" w:space="1" w:color="AAAAAA"/>
+          <w:bottom w:val="single" w:sz="6" w:space="1" w:color="E2E8F0"/>
         </w:pBdr>
       </w:pPr>
     </w:p>
     <w:p>
+      <w:r>
+        <w:br w:type="page"/>
+      </w:r>
+    </w:p>
+    <w:p>
       <w:pPr>
         <w:pBdr>
-          <w:bottom w:val="single" w:sz="6" w:space="1" w:color="AAAAAA"/>
+          <w:bottom w:val="single" w:sz="6" w:space="1" w:color="E2E8F0"/>
         </w:pBdr>
       </w:pPr>
     </w:p>
@@ -4886,14 +4932,19 @@
     <w:p>
       <w:pPr>
         <w:pBdr>
-          <w:bottom w:val="single" w:sz="6" w:space="1" w:color="AAAAAA"/>
+          <w:bottom w:val="single" w:sz="6" w:space="1" w:color="E2E8F0"/>
         </w:pBdr>
       </w:pPr>
     </w:p>
     <w:p>
+      <w:r>
+        <w:br w:type="page"/>
+      </w:r>
+    </w:p>
+    <w:p>
       <w:pPr>
         <w:pBdr>
-          <w:bottom w:val="single" w:sz="6" w:space="1" w:color="AAAAAA"/>
+          <w:bottom w:val="single" w:sz="6" w:space="1" w:color="E2E8F0"/>
         </w:pBdr>
       </w:pPr>
     </w:p>
@@ -5033,7 +5084,7 @@
     <w:p>
       <w:pPr>
         <w:pBdr>
-          <w:bottom w:val="single" w:sz="6" w:space="1" w:color="AAAAAA"/>
+          <w:bottom w:val="single" w:sz="6" w:space="1" w:color="E2E8F0"/>
         </w:pBdr>
       </w:pPr>
     </w:p>
@@ -5154,7 +5205,7 @@
     <w:p>
       <w:pPr>
         <w:pBdr>
-          <w:bottom w:val="single" w:sz="6" w:space="1" w:color="AAAAAA"/>
+          <w:bottom w:val="single" w:sz="6" w:space="1" w:color="E2E8F0"/>
         </w:pBdr>
       </w:pPr>
     </w:p>
@@ -5811,14 +5862,19 @@
     <w:p>
       <w:pPr>
         <w:pBdr>
-          <w:bottom w:val="single" w:sz="6" w:space="1" w:color="AAAAAA"/>
+          <w:bottom w:val="single" w:sz="6" w:space="1" w:color="E2E8F0"/>
         </w:pBdr>
       </w:pPr>
     </w:p>
     <w:p>
+      <w:r>
+        <w:br w:type="page"/>
+      </w:r>
+    </w:p>
+    <w:p>
       <w:pPr>
         <w:pBdr>
-          <w:bottom w:val="single" w:sz="6" w:space="1" w:color="AAAAAA"/>
+          <w:bottom w:val="single" w:sz="6" w:space="1" w:color="E2E8F0"/>
         </w:pBdr>
       </w:pPr>
     </w:p>
@@ -6538,6 +6594,9 @@
     <w:p>
       <w:pPr>
         <w:ind w:left="720"/>
+        <w:pBdr>
+          <w:left w:val="single" w:sz="12" w:space="8" w:color="E2E8F0"/>
+        </w:pBdr>
       </w:pPr>
       <w:r>
         <w:rPr>
@@ -6948,9 +7007,14 @@
       </w:r>
     </w:p>
     <w:p>
+      <w:r>
+        <w:br w:type="page"/>
+      </w:r>
+    </w:p>
+    <w:p>
       <w:pPr>
         <w:pBdr>
-          <w:bottom w:val="single" w:sz="6" w:space="1" w:color="AAAAAA"/>
+          <w:bottom w:val="single" w:sz="6" w:space="1" w:color="E2E8F0"/>
         </w:pBdr>
       </w:pPr>
     </w:p>
@@ -7792,14 +7856,19 @@
     <w:p>
       <w:pPr>
         <w:pBdr>
-          <w:bottom w:val="single" w:sz="6" w:space="1" w:color="AAAAAA"/>
+          <w:bottom w:val="single" w:sz="6" w:space="1" w:color="E2E8F0"/>
         </w:pBdr>
       </w:pPr>
     </w:p>
     <w:p>
+      <w:r>
+        <w:br w:type="page"/>
+      </w:r>
+    </w:p>
+    <w:p>
       <w:pPr>
         <w:pBdr>
-          <w:bottom w:val="single" w:sz="6" w:space="1" w:color="AAAAAA"/>
+          <w:bottom w:val="single" w:sz="6" w:space="1" w:color="E2E8F0"/>
         </w:pBdr>
       </w:pPr>
     </w:p>
@@ -8388,6 +8457,9 @@
     <w:p>
       <w:pPr>
         <w:ind w:left="720"/>
+        <w:pBdr>
+          <w:left w:val="single" w:sz="12" w:space="8" w:color="E2E8F0"/>
+        </w:pBdr>
       </w:pPr>
       <w:r>
         <w:rPr/>
@@ -8800,6 +8872,9 @@
     <w:p>
       <w:pPr>
         <w:ind w:left="720"/>
+        <w:pBdr>
+          <w:left w:val="single" w:sz="12" w:space="8" w:color="E2E8F0"/>
+        </w:pBdr>
       </w:pPr>
       <w:r>
         <w:rPr/>
@@ -9267,9 +9342,14 @@
       </w:r>
     </w:p>
     <w:p>
+      <w:r>
+        <w:br w:type="page"/>
+      </w:r>
+    </w:p>
+    <w:p>
       <w:pPr>
         <w:pBdr>
-          <w:bottom w:val="single" w:sz="6" w:space="1" w:color="AAAAAA"/>
+          <w:bottom w:val="single" w:sz="6" w:space="1" w:color="E2E8F0"/>
         </w:pBdr>
       </w:pPr>
     </w:p>
@@ -9463,14 +9543,19 @@
     <w:p>
       <w:pPr>
         <w:pBdr>
-          <w:bottom w:val="single" w:sz="6" w:space="1" w:color="AAAAAA"/>
+          <w:bottom w:val="single" w:sz="6" w:space="1" w:color="E2E8F0"/>
         </w:pBdr>
       </w:pPr>
     </w:p>
     <w:p>
+      <w:r>
+        <w:br w:type="page"/>
+      </w:r>
+    </w:p>
+    <w:p>
       <w:pPr>
         <w:pBdr>
-          <w:bottom w:val="single" w:sz="6" w:space="1" w:color="AAAAAA"/>
+          <w:bottom w:val="single" w:sz="6" w:space="1" w:color="E2E8F0"/>
         </w:pBdr>
       </w:pPr>
     </w:p>
@@ -9978,14 +10063,19 @@
     <w:p>
       <w:pPr>
         <w:pBdr>
-          <w:bottom w:val="single" w:sz="6" w:space="1" w:color="AAAAAA"/>
+          <w:bottom w:val="single" w:sz="6" w:space="1" w:color="E2E8F0"/>
         </w:pBdr>
       </w:pPr>
     </w:p>
     <w:p>
+      <w:r>
+        <w:br w:type="page"/>
+      </w:r>
+    </w:p>
+    <w:p>
       <w:pPr>
         <w:pBdr>
-          <w:bottom w:val="single" w:sz="6" w:space="1" w:color="AAAAAA"/>
+          <w:bottom w:val="single" w:sz="6" w:space="1" w:color="E2E8F0"/>
         </w:pBdr>
       </w:pPr>
     </w:p>
@@ -10048,7 +10138,7 @@
     <w:p>
       <w:pPr>
         <w:pBdr>
-          <w:bottom w:val="single" w:sz="6" w:space="1" w:color="AAAAAA"/>
+          <w:bottom w:val="single" w:sz="6" w:space="1" w:color="E2E8F0"/>
         </w:pBdr>
       </w:pPr>
     </w:p>
@@ -10113,6 +10203,9 @@
     <w:p>
       <w:pPr>
         <w:ind w:left="720"/>
+        <w:pBdr>
+          <w:left w:val="single" w:sz="12" w:space="8" w:color="E2E8F0"/>
+        </w:pBdr>
       </w:pPr>
       <w:r>
         <w:rPr/>
@@ -10160,7 +10253,7 @@
     <w:p>
       <w:pPr>
         <w:pBdr>
-          <w:bottom w:val="single" w:sz="6" w:space="1" w:color="AAAAAA"/>
+          <w:bottom w:val="single" w:sz="6" w:space="1" w:color="E2E8F0"/>
         </w:pBdr>
       </w:pPr>
     </w:p>
@@ -10176,16 +10269,20 @@
       </w:r>
     </w:p>
     <w:p>
+      <w:r>
+        <w:br w:type="page"/>
+      </w:r>
+    </w:p>
+    <w:p>
       <w:pPr>
         <w:pBdr>
-          <w:bottom w:val="single" w:sz="6" w:space="1" w:color="AAAAAA"/>
+          <w:bottom w:val="single" w:sz="6" w:space="1" w:color="E2E8F0"/>
         </w:pBdr>
       </w:pPr>
     </w:p>
     <w:p>
       <w:pPr>
         <w:pStyle w:val="Heading1"/>
-        <w:pageBreakBefore/>
         <w:spacing w:before="480" w:after="240"/>
         <w:jc w:val="center"/>
       </w:pPr>
@@ -10201,7 +10298,7 @@
     <w:p>
       <w:pPr>
         <w:pBdr>
-          <w:bottom w:val="single" w:sz="6" w:space="1" w:color="AAAAAA"/>
+          <w:bottom w:val="single" w:sz="6" w:space="1" w:color="E2E8F0"/>
         </w:pBdr>
       </w:pPr>
     </w:p>
@@ -10234,7 +10331,7 @@
     <w:p>
       <w:pPr>
         <w:pBdr>
-          <w:bottom w:val="single" w:sz="6" w:space="1" w:color="AAAAAA"/>
+          <w:bottom w:val="single" w:sz="6" w:space="1" w:color="E2E8F0"/>
         </w:pBdr>
       </w:pPr>
     </w:p>
@@ -10259,7 +10356,7 @@
     <w:p>
       <w:pPr>
         <w:pBdr>
-          <w:bottom w:val="single" w:sz="6" w:space="1" w:color="AAAAAA"/>
+          <w:bottom w:val="single" w:sz="6" w:space="1" w:color="E2E8F0"/>
         </w:pBdr>
       </w:pPr>
     </w:p>
@@ -10648,16 +10745,20 @@
       </w:r>
     </w:p>
     <w:p>
+      <w:r>
+        <w:br w:type="page"/>
+      </w:r>
+    </w:p>
+    <w:p>
       <w:pPr>
         <w:pBdr>
-          <w:bottom w:val="single" w:sz="6" w:space="1" w:color="AAAAAA"/>
+          <w:bottom w:val="single" w:sz="6" w:space="1" w:color="E2E8F0"/>
         </w:pBdr>
       </w:pPr>
     </w:p>
     <w:p>
       <w:pPr>
         <w:pStyle w:val="Heading1"/>
-        <w:pageBreakBefore/>
         <w:spacing w:before="480" w:after="240"/>
         <w:jc w:val="center"/>
       </w:pPr>
@@ -10684,7 +10785,7 @@
     <w:p>
       <w:pPr>
         <w:pBdr>
-          <w:bottom w:val="single" w:sz="6" w:space="1" w:color="AAAAAA"/>
+          <w:bottom w:val="single" w:sz="6" w:space="1" w:color="E2E8F0"/>
         </w:pBdr>
       </w:pPr>
     </w:p>
@@ -10968,7 +11069,7 @@
     <w:p>
       <w:pPr>
         <w:pBdr>
-          <w:bottom w:val="single" w:sz="6" w:space="1" w:color="AAAAAA"/>
+          <w:bottom w:val="single" w:sz="6" w:space="1" w:color="E2E8F0"/>
         </w:pBdr>
       </w:pPr>
     </w:p>
@@ -11037,7 +11138,7 @@
     <w:p>
       <w:pPr>
         <w:pBdr>
-          <w:bottom w:val="single" w:sz="6" w:space="1" w:color="AAAAAA"/>
+          <w:bottom w:val="single" w:sz="6" w:space="1" w:color="E2E8F0"/>
         </w:pBdr>
       </w:pPr>
     </w:p>
@@ -11108,7 +11209,7 @@
     <w:p>
       <w:pPr>
         <w:pBdr>
-          <w:bottom w:val="single" w:sz="6" w:space="1" w:color="AAAAAA"/>
+          <w:bottom w:val="single" w:sz="6" w:space="1" w:color="E2E8F0"/>
         </w:pBdr>
       </w:pPr>
     </w:p>
@@ -11228,7 +11329,7 @@
     <w:p>
       <w:pPr>
         <w:pBdr>
-          <w:bottom w:val="single" w:sz="6" w:space="1" w:color="AAAAAA"/>
+          <w:bottom w:val="single" w:sz="6" w:space="1" w:color="E2E8F0"/>
         </w:pBdr>
       </w:pPr>
     </w:p>
@@ -11306,7 +11407,7 @@
     <w:p>
       <w:pPr>
         <w:pBdr>
-          <w:bottom w:val="single" w:sz="6" w:space="1" w:color="AAAAAA"/>
+          <w:bottom w:val="single" w:sz="6" w:space="1" w:color="E2E8F0"/>
         </w:pBdr>
       </w:pPr>
     </w:p>
@@ -11322,16 +11423,20 @@
       </w:r>
     </w:p>
     <w:p>
+      <w:r>
+        <w:br w:type="page"/>
+      </w:r>
+    </w:p>
+    <w:p>
       <w:pPr>
         <w:pBdr>
-          <w:bottom w:val="single" w:sz="6" w:space="1" w:color="AAAAAA"/>
+          <w:bottom w:val="single" w:sz="6" w:space="1" w:color="E2E8F0"/>
         </w:pBdr>
       </w:pPr>
     </w:p>
     <w:p>
       <w:pPr>
         <w:pStyle w:val="Heading1"/>
-        <w:pageBreakBefore/>
         <w:spacing w:before="480" w:after="240"/>
         <w:jc w:val="center"/>
       </w:pPr>
@@ -11358,7 +11463,7 @@
     <w:p>
       <w:pPr>
         <w:pBdr>
-          <w:bottom w:val="single" w:sz="6" w:space="1" w:color="AAAAAA"/>
+          <w:bottom w:val="single" w:sz="6" w:space="1" w:color="E2E8F0"/>
         </w:pBdr>
       </w:pPr>
     </w:p>
@@ -11513,7 +11618,7 @@
     <w:p>
       <w:pPr>
         <w:pBdr>
-          <w:bottom w:val="single" w:sz="6" w:space="1" w:color="AAAAAA"/>
+          <w:bottom w:val="single" w:sz="6" w:space="1" w:color="E2E8F0"/>
         </w:pBdr>
       </w:pPr>
     </w:p>
@@ -11655,7 +11760,7 @@
     <w:p>
       <w:pPr>
         <w:pBdr>
-          <w:bottom w:val="single" w:sz="6" w:space="1" w:color="AAAAAA"/>
+          <w:bottom w:val="single" w:sz="6" w:space="1" w:color="E2E8F0"/>
         </w:pBdr>
       </w:pPr>
     </w:p>
@@ -11721,6 +11826,9 @@
     <w:p>
       <w:pPr>
         <w:ind w:left="720"/>
+        <w:pBdr>
+          <w:left w:val="single" w:sz="12" w:space="8" w:color="E2E8F0"/>
+        </w:pBdr>
       </w:pPr>
       <w:r>
         <w:rPr/>
@@ -11739,7 +11847,7 @@
     <w:p>
       <w:pPr>
         <w:pBdr>
-          <w:bottom w:val="single" w:sz="6" w:space="1" w:color="AAAAAA"/>
+          <w:bottom w:val="single" w:sz="6" w:space="1" w:color="E2E8F0"/>
         </w:pBdr>
       </w:pPr>
     </w:p>
@@ -11837,7 +11945,7 @@
     <w:p>
       <w:pPr>
         <w:pBdr>
-          <w:bottom w:val="single" w:sz="6" w:space="1" w:color="AAAAAA"/>
+          <w:bottom w:val="single" w:sz="6" w:space="1" w:color="E2E8F0"/>
         </w:pBdr>
       </w:pPr>
     </w:p>
@@ -11906,7 +12014,7 @@
     <w:p>
       <w:pPr>
         <w:pBdr>
-          <w:bottom w:val="single" w:sz="6" w:space="1" w:color="AAAAAA"/>
+          <w:bottom w:val="single" w:sz="6" w:space="1" w:color="E2E8F0"/>
         </w:pBdr>
       </w:pPr>
     </w:p>
@@ -12121,7 +12229,7 @@
     <w:p>
       <w:pPr>
         <w:pBdr>
-          <w:bottom w:val="single" w:sz="6" w:space="1" w:color="AAAAAA"/>
+          <w:bottom w:val="single" w:sz="6" w:space="1" w:color="E2E8F0"/>
         </w:pBdr>
       </w:pPr>
     </w:p>
@@ -12137,16 +12245,20 @@
       </w:r>
     </w:p>
     <w:p>
+      <w:r>
+        <w:br w:type="page"/>
+      </w:r>
+    </w:p>
+    <w:p>
       <w:pPr>
         <w:pBdr>
-          <w:bottom w:val="single" w:sz="6" w:space="1" w:color="AAAAAA"/>
+          <w:bottom w:val="single" w:sz="6" w:space="1" w:color="E2E8F0"/>
         </w:pBdr>
       </w:pPr>
     </w:p>
     <w:p>
       <w:pPr>
         <w:pStyle w:val="Heading1"/>
-        <w:pageBreakBefore/>
         <w:spacing w:before="480" w:after="240"/>
         <w:jc w:val="center"/>
       </w:pPr>
@@ -12173,7 +12285,7 @@
     <w:p>
       <w:pPr>
         <w:pBdr>
-          <w:bottom w:val="single" w:sz="6" w:space="1" w:color="AAAAAA"/>
+          <w:bottom w:val="single" w:sz="6" w:space="1" w:color="E2E8F0"/>
         </w:pBdr>
       </w:pPr>
     </w:p>
@@ -12328,7 +12440,7 @@
     <w:p>
       <w:pPr>
         <w:pBdr>
-          <w:bottom w:val="single" w:sz="6" w:space="1" w:color="AAAAAA"/>
+          <w:bottom w:val="single" w:sz="6" w:space="1" w:color="E2E8F0"/>
         </w:pBdr>
       </w:pPr>
     </w:p>
@@ -12470,7 +12582,7 @@
     <w:p>
       <w:pPr>
         <w:pBdr>
-          <w:bottom w:val="single" w:sz="6" w:space="1" w:color="AAAAAA"/>
+          <w:bottom w:val="single" w:sz="6" w:space="1" w:color="E2E8F0"/>
         </w:pBdr>
       </w:pPr>
     </w:p>
@@ -12700,7 +12812,7 @@
     <w:p>
       <w:pPr>
         <w:pBdr>
-          <w:bottom w:val="single" w:sz="6" w:space="1" w:color="AAAAAA"/>
+          <w:bottom w:val="single" w:sz="6" w:space="1" w:color="E2E8F0"/>
         </w:pBdr>
       </w:pPr>
     </w:p>
@@ -12798,7 +12910,7 @@
     <w:p>
       <w:pPr>
         <w:pBdr>
-          <w:bottom w:val="single" w:sz="6" w:space="1" w:color="AAAAAA"/>
+          <w:bottom w:val="single" w:sz="6" w:space="1" w:color="E2E8F0"/>
         </w:pBdr>
       </w:pPr>
     </w:p>
@@ -13010,7 +13122,7 @@
     <w:p>
       <w:pPr>
         <w:pBdr>
-          <w:bottom w:val="single" w:sz="6" w:space="1" w:color="AAAAAA"/>
+          <w:bottom w:val="single" w:sz="6" w:space="1" w:color="E2E8F0"/>
         </w:pBdr>
       </w:pPr>
     </w:p>
@@ -13079,7 +13191,7 @@
     <w:p>
       <w:pPr>
         <w:pBdr>
-          <w:bottom w:val="single" w:sz="6" w:space="1" w:color="AAAAAA"/>
+          <w:bottom w:val="single" w:sz="6" w:space="1" w:color="E2E8F0"/>
         </w:pBdr>
       </w:pPr>
     </w:p>
@@ -13253,7 +13365,7 @@
     <w:p>
       <w:pPr>
         <w:pBdr>
-          <w:bottom w:val="single" w:sz="6" w:space="1" w:color="AAAAAA"/>
+          <w:bottom w:val="single" w:sz="6" w:space="1" w:color="E2E8F0"/>
         </w:pBdr>
       </w:pPr>
     </w:p>
@@ -13468,7 +13580,7 @@
     <w:p>
       <w:pPr>
         <w:pBdr>
-          <w:bottom w:val="single" w:sz="6" w:space="1" w:color="AAAAAA"/>
+          <w:bottom w:val="single" w:sz="6" w:space="1" w:color="E2E8F0"/>
         </w:pBdr>
       </w:pPr>
     </w:p>
@@ -13484,16 +13596,20 @@
       </w:r>
     </w:p>
     <w:p>
+      <w:r>
+        <w:br w:type="page"/>
+      </w:r>
+    </w:p>
+    <w:p>
       <w:pPr>
         <w:pBdr>
-          <w:bottom w:val="single" w:sz="6" w:space="1" w:color="AAAAAA"/>
+          <w:bottom w:val="single" w:sz="6" w:space="1" w:color="E2E8F0"/>
         </w:pBdr>
       </w:pPr>
     </w:p>
     <w:p>
       <w:pPr>
         <w:pStyle w:val="Heading1"/>
-        <w:pageBreakBefore/>
         <w:spacing w:before="480" w:after="240"/>
         <w:jc w:val="center"/>
       </w:pPr>
@@ -13520,7 +13636,7 @@
     <w:p>
       <w:pPr>
         <w:pBdr>
-          <w:bottom w:val="single" w:sz="6" w:space="1" w:color="AAAAAA"/>
+          <w:bottom w:val="single" w:sz="6" w:space="1" w:color="E2E8F0"/>
         </w:pBdr>
       </w:pPr>
     </w:p>
@@ -13675,7 +13791,7 @@
     <w:p>
       <w:pPr>
         <w:pBdr>
-          <w:bottom w:val="single" w:sz="6" w:space="1" w:color="AAAAAA"/>
+          <w:bottom w:val="single" w:sz="6" w:space="1" w:color="E2E8F0"/>
         </w:pBdr>
       </w:pPr>
     </w:p>
@@ -13849,7 +13965,7 @@
     <w:p>
       <w:pPr>
         <w:pBdr>
-          <w:bottom w:val="single" w:sz="6" w:space="1" w:color="AAAAAA"/>
+          <w:bottom w:val="single" w:sz="6" w:space="1" w:color="E2E8F0"/>
         </w:pBdr>
       </w:pPr>
     </w:p>
@@ -14267,7 +14383,7 @@
     <w:p>
       <w:pPr>
         <w:pBdr>
-          <w:bottom w:val="single" w:sz="6" w:space="1" w:color="AAAAAA"/>
+          <w:bottom w:val="single" w:sz="6" w:space="1" w:color="E2E8F0"/>
         </w:pBdr>
       </w:pPr>
     </w:p>
@@ -14444,7 +14560,7 @@
     <w:p>
       <w:pPr>
         <w:pBdr>
-          <w:bottom w:val="single" w:sz="6" w:space="1" w:color="AAAAAA"/>
+          <w:bottom w:val="single" w:sz="6" w:space="1" w:color="E2E8F0"/>
         </w:pBdr>
       </w:pPr>
     </w:p>
@@ -14546,7 +14662,7 @@
     <w:p>
       <w:pPr>
         <w:pBdr>
-          <w:bottom w:val="single" w:sz="6" w:space="1" w:color="AAAAAA"/>
+          <w:bottom w:val="single" w:sz="6" w:space="1" w:color="E2E8F0"/>
         </w:pBdr>
       </w:pPr>
     </w:p>
@@ -14789,7 +14905,7 @@
     <w:p>
       <w:pPr>
         <w:pBdr>
-          <w:bottom w:val="single" w:sz="6" w:space="1" w:color="AAAAAA"/>
+          <w:bottom w:val="single" w:sz="6" w:space="1" w:color="E2E8F0"/>
         </w:pBdr>
       </w:pPr>
     </w:p>
@@ -14929,7 +15045,7 @@
     <w:p>
       <w:pPr>
         <w:pBdr>
-          <w:bottom w:val="single" w:sz="6" w:space="1" w:color="AAAAAA"/>
+          <w:bottom w:val="single" w:sz="6" w:space="1" w:color="E2E8F0"/>
         </w:pBdr>
       </w:pPr>
     </w:p>
@@ -15103,7 +15219,7 @@
     <w:p>
       <w:pPr>
         <w:pBdr>
-          <w:bottom w:val="single" w:sz="6" w:space="1" w:color="AAAAAA"/>
+          <w:bottom w:val="single" w:sz="6" w:space="1" w:color="E2E8F0"/>
         </w:pBdr>
       </w:pPr>
     </w:p>
@@ -15124,6 +15240,9 @@
     <w:p>
       <w:pPr>
         <w:ind w:left="720"/>
+        <w:pBdr>
+          <w:left w:val="single" w:sz="12" w:space="8" w:color="E2E8F0"/>
+        </w:pBdr>
       </w:pPr>
       <w:r>
         <w:rPr/>
@@ -15487,7 +15606,7 @@
     <w:p>
       <w:pPr>
         <w:pBdr>
-          <w:bottom w:val="single" w:sz="6" w:space="1" w:color="AAAAAA"/>
+          <w:bottom w:val="single" w:sz="6" w:space="1" w:color="E2E8F0"/>
         </w:pBdr>
       </w:pPr>
     </w:p>
@@ -15503,16 +15622,20 @@
       </w:r>
     </w:p>
     <w:p>
+      <w:r>
+        <w:br w:type="page"/>
+      </w:r>
+    </w:p>
+    <w:p>
       <w:pPr>
         <w:pBdr>
-          <w:bottom w:val="single" w:sz="6" w:space="1" w:color="AAAAAA"/>
+          <w:bottom w:val="single" w:sz="6" w:space="1" w:color="E2E8F0"/>
         </w:pBdr>
       </w:pPr>
     </w:p>
     <w:p>
       <w:pPr>
         <w:pStyle w:val="Heading1"/>
-        <w:pageBreakBefore/>
         <w:spacing w:before="480" w:after="240"/>
         <w:jc w:val="center"/>
       </w:pPr>
@@ -15539,7 +15662,7 @@
     <w:p>
       <w:pPr>
         <w:pBdr>
-          <w:bottom w:val="single" w:sz="6" w:space="1" w:color="AAAAAA"/>
+          <w:bottom w:val="single" w:sz="6" w:space="1" w:color="E2E8F0"/>
         </w:pBdr>
       </w:pPr>
     </w:p>
@@ -15774,7 +15897,7 @@
     <w:p>
       <w:pPr>
         <w:pBdr>
-          <w:bottom w:val="single" w:sz="6" w:space="1" w:color="AAAAAA"/>
+          <w:bottom w:val="single" w:sz="6" w:space="1" w:color="E2E8F0"/>
         </w:pBdr>
       </w:pPr>
     </w:p>
@@ -15821,7 +15944,7 @@
     <w:p>
       <w:pPr>
         <w:pBdr>
-          <w:bottom w:val="single" w:sz="6" w:space="1" w:color="AAAAAA"/>
+          <w:bottom w:val="single" w:sz="6" w:space="1" w:color="E2E8F0"/>
         </w:pBdr>
       </w:pPr>
     </w:p>
@@ -15891,7 +16014,7 @@
     <w:p>
       <w:pPr>
         <w:pBdr>
-          <w:bottom w:val="single" w:sz="6" w:space="1" w:color="AAAAAA"/>
+          <w:bottom w:val="single" w:sz="6" w:space="1" w:color="E2E8F0"/>
         </w:pBdr>
       </w:pPr>
     </w:p>
@@ -16100,7 +16223,7 @@
     <w:p>
       <w:pPr>
         <w:pBdr>
-          <w:bottom w:val="single" w:sz="6" w:space="1" w:color="AAAAAA"/>
+          <w:bottom w:val="single" w:sz="6" w:space="1" w:color="E2E8F0"/>
         </w:pBdr>
       </w:pPr>
     </w:p>
@@ -16251,7 +16374,7 @@
     <w:p>
       <w:pPr>
         <w:pBdr>
-          <w:bottom w:val="single" w:sz="6" w:space="1" w:color="AAAAAA"/>
+          <w:bottom w:val="single" w:sz="6" w:space="1" w:color="E2E8F0"/>
         </w:pBdr>
       </w:pPr>
     </w:p>
@@ -16410,7 +16533,7 @@
     <w:p>
       <w:pPr>
         <w:pBdr>
-          <w:bottom w:val="single" w:sz="6" w:space="1" w:color="AAAAAA"/>
+          <w:bottom w:val="single" w:sz="6" w:space="1" w:color="E2E8F0"/>
         </w:pBdr>
       </w:pPr>
     </w:p>
@@ -16441,16 +16564,20 @@
       </w:r>
     </w:p>
     <w:p>
+      <w:r>
+        <w:br w:type="page"/>
+      </w:r>
+    </w:p>
+    <w:p>
       <w:pPr>
         <w:pBdr>
-          <w:bottom w:val="single" w:sz="6" w:space="1" w:color="AAAAAA"/>
+          <w:bottom w:val="single" w:sz="6" w:space="1" w:color="E2E8F0"/>
         </w:pBdr>
       </w:pPr>
     </w:p>
     <w:p>
       <w:pPr>
         <w:pStyle w:val="Heading1"/>
-        <w:pageBreakBefore/>
         <w:spacing w:before="480" w:after="240"/>
         <w:jc w:val="center"/>
       </w:pPr>
@@ -16477,7 +16604,7 @@
     <w:p>
       <w:pPr>
         <w:pBdr>
-          <w:bottom w:val="single" w:sz="6" w:space="1" w:color="AAAAAA"/>
+          <w:bottom w:val="single" w:sz="6" w:space="1" w:color="E2E8F0"/>
         </w:pBdr>
       </w:pPr>
     </w:p>
@@ -16632,7 +16759,7 @@
     <w:p>
       <w:pPr>
         <w:pBdr>
-          <w:bottom w:val="single" w:sz="6" w:space="1" w:color="AAAAAA"/>
+          <w:bottom w:val="single" w:sz="6" w:space="1" w:color="E2E8F0"/>
         </w:pBdr>
       </w:pPr>
     </w:p>
@@ -16724,7 +16851,7 @@
     <w:p>
       <w:pPr>
         <w:pBdr>
-          <w:bottom w:val="single" w:sz="6" w:space="1" w:color="AAAAAA"/>
+          <w:bottom w:val="single" w:sz="6" w:space="1" w:color="E2E8F0"/>
         </w:pBdr>
       </w:pPr>
     </w:p>
@@ -16838,7 +16965,7 @@
     <w:p>
       <w:pPr>
         <w:pBdr>
-          <w:bottom w:val="single" w:sz="6" w:space="1" w:color="AAAAAA"/>
+          <w:bottom w:val="single" w:sz="6" w:space="1" w:color="E2E8F0"/>
         </w:pBdr>
       </w:pPr>
     </w:p>
@@ -17014,7 +17141,7 @@
     <w:p>
       <w:pPr>
         <w:pBdr>
-          <w:bottom w:val="single" w:sz="6" w:space="1" w:color="AAAAAA"/>
+          <w:bottom w:val="single" w:sz="6" w:space="1" w:color="E2E8F0"/>
         </w:pBdr>
       </w:pPr>
     </w:p>
@@ -17080,7 +17207,7 @@
     <w:p>
       <w:pPr>
         <w:pBdr>
-          <w:bottom w:val="single" w:sz="6" w:space="1" w:color="AAAAAA"/>
+          <w:bottom w:val="single" w:sz="6" w:space="1" w:color="E2E8F0"/>
         </w:pBdr>
       </w:pPr>
     </w:p>
@@ -17507,7 +17634,7 @@
     <w:p>
       <w:pPr>
         <w:pBdr>
-          <w:bottom w:val="single" w:sz="6" w:space="1" w:color="AAAAAA"/>
+          <w:bottom w:val="single" w:sz="6" w:space="1" w:color="E2E8F0"/>
         </w:pBdr>
       </w:pPr>
     </w:p>
@@ -17576,7 +17703,7 @@
     <w:p>
       <w:pPr>
         <w:pBdr>
-          <w:bottom w:val="single" w:sz="6" w:space="1" w:color="AAAAAA"/>
+          <w:bottom w:val="single" w:sz="6" w:space="1" w:color="E2E8F0"/>
         </w:pBdr>
       </w:pPr>
     </w:p>
@@ -17779,7 +17906,7 @@
     <w:p>
       <w:pPr>
         <w:pBdr>
-          <w:bottom w:val="single" w:sz="6" w:space="1" w:color="AAAAAA"/>
+          <w:bottom w:val="single" w:sz="6" w:space="1" w:color="E2E8F0"/>
         </w:pBdr>
       </w:pPr>
     </w:p>
@@ -17973,16 +18100,20 @@
       </w:r>
     </w:p>
     <w:p>
+      <w:r>
+        <w:br w:type="page"/>
+      </w:r>
+    </w:p>
+    <w:p>
       <w:pPr>
         <w:pBdr>
-          <w:bottom w:val="single" w:sz="6" w:space="1" w:color="AAAAAA"/>
+          <w:bottom w:val="single" w:sz="6" w:space="1" w:color="E2E8F0"/>
         </w:pBdr>
       </w:pPr>
     </w:p>
     <w:p>
       <w:pPr>
         <w:pStyle w:val="Heading1"/>
-        <w:pageBreakBefore/>
         <w:spacing w:before="480" w:after="240"/>
         <w:jc w:val="center"/>
       </w:pPr>
@@ -18009,7 +18140,7 @@
     <w:p>
       <w:pPr>
         <w:pBdr>
-          <w:bottom w:val="single" w:sz="6" w:space="1" w:color="AAAAAA"/>
+          <w:bottom w:val="single" w:sz="6" w:space="1" w:color="E2E8F0"/>
         </w:pBdr>
       </w:pPr>
     </w:p>
@@ -18133,7 +18264,7 @@
     <w:p>
       <w:pPr>
         <w:pBdr>
-          <w:bottom w:val="single" w:sz="6" w:space="1" w:color="AAAAAA"/>
+          <w:bottom w:val="single" w:sz="6" w:space="1" w:color="E2E8F0"/>
         </w:pBdr>
       </w:pPr>
     </w:p>
@@ -18240,7 +18371,7 @@
     <w:p>
       <w:pPr>
         <w:pBdr>
-          <w:bottom w:val="single" w:sz="6" w:space="1" w:color="AAAAAA"/>
+          <w:bottom w:val="single" w:sz="6" w:space="1" w:color="E2E8F0"/>
         </w:pBdr>
       </w:pPr>
     </w:p>
@@ -18479,7 +18610,7 @@
     <w:p>
       <w:pPr>
         <w:pBdr>
-          <w:bottom w:val="single" w:sz="6" w:space="1" w:color="AAAAAA"/>
+          <w:bottom w:val="single" w:sz="6" w:space="1" w:color="E2E8F0"/>
         </w:pBdr>
       </w:pPr>
     </w:p>
@@ -18694,7 +18825,7 @@
     <w:p>
       <w:pPr>
         <w:pBdr>
-          <w:bottom w:val="single" w:sz="6" w:space="1" w:color="AAAAAA"/>
+          <w:bottom w:val="single" w:sz="6" w:space="1" w:color="E2E8F0"/>
         </w:pBdr>
       </w:pPr>
     </w:p>
@@ -18850,7 +18981,7 @@
     <w:p>
       <w:pPr>
         <w:pBdr>
-          <w:bottom w:val="single" w:sz="6" w:space="1" w:color="AAAAAA"/>
+          <w:bottom w:val="single" w:sz="6" w:space="1" w:color="E2E8F0"/>
         </w:pBdr>
       </w:pPr>
     </w:p>
@@ -19127,7 +19258,42 @@
       </w:pPr>
       <w:r>
         <w:rPr/>
-        <w:t xml:space="preserve"> </w:t>
+      </w:r>
+      <w:r>
+        <w:rPr>
+          <w:b/>
+        </w:rPr>
+        <w:t>Resultado solicitado:</w:t>
+      </w:r>
+      <w:r>
+        <w:rPr/>
+      </w:r>
+    </w:p>
+    <w:p>
+      <w:pPr>
+        <w:pStyle w:val="ListBullet"/>
+      </w:pPr>
+      <w:r>
+        <w:rPr/>
+        <w:t xml:space="preserve"> Aprobación total de la solicitud original</w:t>
+      </w:r>
+    </w:p>
+    <w:p>
+      <w:pPr>
+        <w:pStyle w:val="ListBullet"/>
+      </w:pPr>
+      <w:r>
+        <w:rPr/>
+        <w:t xml:space="preserve"> Eliminación de la condición específica número: _______</w:t>
+      </w:r>
+    </w:p>
+    <w:p>
+      <w:pPr>
+        <w:pStyle w:val="ListBullet"/>
+      </w:pPr>
+      <w:r>
+        <w:rPr/>
+        <w:t xml:space="preserve"> Otro: ___________________________________</w:t>
       </w:r>
     </w:p>
     <w:p>
@@ -19141,7 +19307,7 @@
         <w:rPr>
           <w:b/>
         </w:rPr>
-        <w:t>Resultado solicitado:</w:t>
+        <w:t>Documentos adjuntos:</w:t>
       </w:r>
       <w:r>
         <w:rPr/>
@@ -19153,7 +19319,7 @@
       </w:pPr>
       <w:r>
         <w:rPr/>
-        <w:t xml:space="preserve"> Aprobación total de la solicitud original</w:t>
+        <w:t xml:space="preserve"> Copia de la resolución impugnada</w:t>
       </w:r>
     </w:p>
     <w:p>
@@ -19162,7 +19328,7 @@
       </w:pPr>
       <w:r>
         <w:rPr/>
-        <w:t xml:space="preserve"> Eliminación de la condición específica número: _______</w:t>
+        <w:t xml:space="preserve"> Referencia al Manual o Reglamento que sustenta la apelación</w:t>
       </w:r>
     </w:p>
     <w:p>
@@ -19171,7 +19337,7 @@
       </w:pPr>
       <w:r>
         <w:rPr/>
-        <w:t xml:space="preserve"> Otro: ___________________________________</w:t>
+        <w:t xml:space="preserve"> Otros: ___________________________________</w:t>
       </w:r>
     </w:p>
     <w:p>
@@ -19185,37 +19351,10 @@
         <w:rPr>
           <w:b/>
         </w:rPr>
-        <w:t>Documentos adjuntos:</w:t>
-      </w:r>
-      <w:r>
-        <w:rPr/>
-      </w:r>
-    </w:p>
-    <w:p>
-      <w:pPr>
-        <w:pStyle w:val="ListBullet"/>
-      </w:pPr>
-      <w:r>
-        <w:rPr/>
-        <w:t xml:space="preserve"> Copia de la resolución impugnada</w:t>
-      </w:r>
-    </w:p>
-    <w:p>
-      <w:pPr>
-        <w:pStyle w:val="ListBullet"/>
-      </w:pPr>
-      <w:r>
-        <w:rPr/>
-        <w:t xml:space="preserve"> Referencia al Manual o Reglamento que sustenta la apelación</w:t>
-      </w:r>
-    </w:p>
-    <w:p>
-      <w:pPr>
-        <w:pStyle w:val="ListBullet"/>
-      </w:pPr>
-      <w:r>
-        <w:rPr/>
-        <w:t xml:space="preserve"> Otros: ___________________________________</w:t>
+        <w:t>Firma del propietario:</w:t>
+      </w:r>
+      <w:r>
+        <w:rPr/>
       </w:r>
     </w:p>
     <w:p>
@@ -19224,15 +19363,7 @@
       </w:pPr>
       <w:r>
         <w:rPr/>
-      </w:r>
-      <w:r>
-        <w:rPr>
-          <w:b/>
-        </w:rPr>
-        <w:t>Firma del propietario:</w:t>
-      </w:r>
-      <w:r>
-        <w:rPr/>
+        <w:t>Nombre: ________________________________</w:t>
       </w:r>
     </w:p>
     <w:p>
@@ -19241,7 +19372,7 @@
       </w:pPr>
       <w:r>
         <w:rPr/>
-        <w:t>Nombre: ________________________________</w:t>
+        <w:t>Firma: ________________________________</w:t>
       </w:r>
     </w:p>
     <w:p>
@@ -19250,15 +19381,6 @@
       </w:pPr>
       <w:r>
         <w:rPr/>
-        <w:t>Firma: ________________________________</w:t>
-      </w:r>
-    </w:p>
-    <w:p>
-      <w:pPr>
-        <w:spacing w:after="160"/>
-      </w:pPr>
-      <w:r>
-        <w:rPr/>
         <w:t xml:space="preserve">Fecha: </w:t>
       </w:r>
       <w:r>
@@ -19282,13 +19404,6 @@
         <w:rPr/>
         <w:t>/______</w:t>
       </w:r>
-    </w:p>
-    <w:p>
-      <w:pPr>
-        <w:pBdr>
-          <w:bottom w:val="single" w:sz="6" w:space="1" w:color="AAAAAA"/>
-        </w:pBdr>
-      </w:pPr>
     </w:p>
     <w:p>
       <w:pPr>
@@ -19419,161 +19534,158 @@
     </w:p>
     <w:p>
       <w:pPr>
+        <w:spacing w:after="160"/>
+      </w:pPr>
+      <w:r>
+        <w:rPr/>
+      </w:r>
+      <w:r>
+        <w:rPr>
+          <w:b/>
+        </w:rPr>
+        <w:t>Para uso del Comité de Representantes:</w:t>
+      </w:r>
+      <w:r>
+        <w:rPr/>
+      </w:r>
+    </w:p>
+    <w:p>
+      <w:pPr>
+        <w:spacing w:after="160"/>
+      </w:pPr>
+      <w:r>
+        <w:rPr/>
+      </w:r>
+      <w:r>
+        <w:rPr>
+          <w:b/>
+        </w:rPr>
+        <w:t>Fecha de resolución:</w:t>
+      </w:r>
+      <w:r>
+        <w:rPr/>
+        <w:t xml:space="preserve"> </w:t>
+      </w:r>
+      <w:r>
+        <w:rPr>
+          <w:i/>
+        </w:rPr>
+      </w:r>
+      <w:r>
+        <w:rPr>
+          <w:b/>
+          <w:i/>
+        </w:rPr>
+        <w:t>/</w:t>
+      </w:r>
+      <w:r>
+        <w:rPr>
+          <w:i/>
+        </w:rPr>
+      </w:r>
+      <w:r>
+        <w:rPr/>
+        <w:t>/______</w:t>
+      </w:r>
+    </w:p>
+    <w:p>
+      <w:pPr>
+        <w:spacing w:after="160"/>
+      </w:pPr>
+      <w:r>
+        <w:rPr/>
+      </w:r>
+      <w:r>
+        <w:rPr>
+          <w:b/>
+        </w:rPr>
+        <w:t>Resolución:</w:t>
+      </w:r>
+      <w:r>
+        <w:rPr/>
+      </w:r>
+    </w:p>
+    <w:p>
+      <w:pPr>
+        <w:pStyle w:val="ListBullet"/>
+      </w:pPr>
+      <w:r>
+        <w:rPr/>
+        <w:t xml:space="preserve"> Resolución del Consejo </w:t>
+      </w:r>
+      <w:r>
+        <w:rPr>
+          <w:b/>
+        </w:rPr>
+        <w:t>revertida</w:t>
+      </w:r>
+      <w:r>
+        <w:rPr/>
+        <w:t xml:space="preserve"> — fundamento: ________________________________</w:t>
+      </w:r>
+    </w:p>
+    <w:p>
+      <w:pPr>
+        <w:pStyle w:val="ListBullet"/>
+      </w:pPr>
+      <w:r>
+        <w:rPr/>
+        <w:t xml:space="preserve"> Apelación </w:t>
+      </w:r>
+      <w:r>
+        <w:rPr>
+          <w:b/>
+        </w:rPr>
+        <w:t>rechazada</w:t>
+      </w:r>
+      <w:r>
+        <w:rPr/>
+        <w:t xml:space="preserve"> — la resolución del Consejo está fundada en: ________________________________</w:t>
+      </w:r>
+    </w:p>
+    <w:p>
+      <w:pPr>
+        <w:pStyle w:val="ListBullet"/>
+      </w:pPr>
+      <w:r>
+        <w:rPr/>
+        <w:t xml:space="preserve"> Remisión a </w:t>
+      </w:r>
+      <w:r>
+        <w:rPr>
+          <w:b/>
+        </w:rPr>
+        <w:t>árbitro externo</w:t>
+      </w:r>
+      <w:r>
+        <w:rPr/>
+        <w:t xml:space="preserve"> — motivo: ________________________________</w:t>
+      </w:r>
+    </w:p>
+    <w:p>
+      <w:pPr>
+        <w:spacing w:after="160"/>
+      </w:pPr>
+      <w:r>
+        <w:rPr/>
+        <w:t>Firma del Presidente del Comité: ________________________________</w:t>
+      </w:r>
+    </w:p>
+    <w:p>
+      <w:r>
+        <w:br w:type="page"/>
+      </w:r>
+    </w:p>
+    <w:p>
+      <w:pPr>
         <w:pBdr>
-          <w:bottom w:val="single" w:sz="6" w:space="1" w:color="AAAAAA"/>
+          <w:bottom w:val="single" w:sz="6" w:space="1" w:color="E2E8F0"/>
         </w:pBdr>
       </w:pPr>
     </w:p>
     <w:p>
       <w:pPr>
-        <w:spacing w:after="160"/>
-      </w:pPr>
-      <w:r>
-        <w:rPr/>
-      </w:r>
-      <w:r>
-        <w:rPr>
-          <w:b/>
-        </w:rPr>
-        <w:t>Para uso del Comité de Representantes:</w:t>
-      </w:r>
-      <w:r>
-        <w:rPr/>
-      </w:r>
-    </w:p>
-    <w:p>
-      <w:pPr>
-        <w:spacing w:after="160"/>
-      </w:pPr>
-      <w:r>
-        <w:rPr/>
-      </w:r>
-      <w:r>
-        <w:rPr>
-          <w:b/>
-        </w:rPr>
-        <w:t>Fecha de resolución:</w:t>
-      </w:r>
-      <w:r>
-        <w:rPr/>
-        <w:t xml:space="preserve"> </w:t>
-      </w:r>
-      <w:r>
-        <w:rPr>
-          <w:i/>
-        </w:rPr>
-      </w:r>
-      <w:r>
-        <w:rPr>
-          <w:b/>
-          <w:i/>
-        </w:rPr>
-        <w:t>/</w:t>
-      </w:r>
-      <w:r>
-        <w:rPr>
-          <w:i/>
-        </w:rPr>
-      </w:r>
-      <w:r>
-        <w:rPr/>
-        <w:t>/______</w:t>
-      </w:r>
-    </w:p>
-    <w:p>
-      <w:pPr>
-        <w:spacing w:after="160"/>
-      </w:pPr>
-      <w:r>
-        <w:rPr/>
-      </w:r>
-      <w:r>
-        <w:rPr>
-          <w:b/>
-        </w:rPr>
-        <w:t>Resolución:</w:t>
-      </w:r>
-      <w:r>
-        <w:rPr/>
-      </w:r>
-    </w:p>
-    <w:p>
-      <w:pPr>
-        <w:pStyle w:val="ListBullet"/>
-      </w:pPr>
-      <w:r>
-        <w:rPr/>
-        <w:t xml:space="preserve"> Resolución del Consejo </w:t>
-      </w:r>
-      <w:r>
-        <w:rPr>
-          <w:b/>
-        </w:rPr>
-        <w:t>revertida</w:t>
-      </w:r>
-      <w:r>
-        <w:rPr/>
-        <w:t xml:space="preserve"> — fundamento: ________________________________</w:t>
-      </w:r>
-    </w:p>
-    <w:p>
-      <w:pPr>
-        <w:pStyle w:val="ListBullet"/>
-      </w:pPr>
-      <w:r>
-        <w:rPr/>
-        <w:t xml:space="preserve"> Apelación </w:t>
-      </w:r>
-      <w:r>
-        <w:rPr>
-          <w:b/>
-        </w:rPr>
-        <w:t>rechazada</w:t>
-      </w:r>
-      <w:r>
-        <w:rPr/>
-        <w:t xml:space="preserve"> — la resolución del Consejo está fundada en: ________________________________</w:t>
-      </w:r>
-    </w:p>
-    <w:p>
-      <w:pPr>
-        <w:pStyle w:val="ListBullet"/>
-      </w:pPr>
-      <w:r>
-        <w:rPr/>
-        <w:t xml:space="preserve"> Remisión a </w:t>
-      </w:r>
-      <w:r>
-        <w:rPr>
-          <w:b/>
-        </w:rPr>
-        <w:t>árbitro externo</w:t>
-      </w:r>
-      <w:r>
-        <w:rPr/>
-        <w:t xml:space="preserve"> — motivo: ________________________________</w:t>
-      </w:r>
-    </w:p>
-    <w:p>
-      <w:pPr>
-        <w:spacing w:after="160"/>
-      </w:pPr>
-      <w:r>
-        <w:rPr/>
-        <w:t>Firma del Presidente del Comité: ________________________________</w:t>
-      </w:r>
-    </w:p>
-    <w:p>
-      <w:pPr>
-        <w:pBdr>
-          <w:bottom w:val="single" w:sz="6" w:space="1" w:color="AAAAAA"/>
-        </w:pBdr>
-      </w:pPr>
-    </w:p>
-    <w:p>
-      <w:pPr>
         <w:pStyle w:val="Heading1"/>
-        <w:pageBreakBefore/>
         <w:spacing w:before="480" w:after="240"/>
         <w:jc w:val="center"/>
       </w:pPr>
@@ -19611,7 +19723,7 @@
     <w:p>
       <w:pPr>
         <w:pBdr>
-          <w:bottom w:val="single" w:sz="6" w:space="1" w:color="AAAAAA"/>
+          <w:bottom w:val="single" w:sz="6" w:space="1" w:color="E2E8F0"/>
         </w:pBdr>
       </w:pPr>
     </w:p>
@@ -19641,7 +19753,7 @@
     <w:p>
       <w:pPr>
         <w:pBdr>
-          <w:bottom w:val="single" w:sz="6" w:space="1" w:color="AAAAAA"/>
+          <w:bottom w:val="single" w:sz="6" w:space="1" w:color="E2E8F0"/>
         </w:pBdr>
       </w:pPr>
     </w:p>
@@ -19980,7 +20092,7 @@
     <w:p>
       <w:pPr>
         <w:pBdr>
-          <w:bottom w:val="single" w:sz="6" w:space="1" w:color="AAAAAA"/>
+          <w:bottom w:val="single" w:sz="6" w:space="1" w:color="E2E8F0"/>
         </w:pBdr>
       </w:pPr>
     </w:p>
@@ -20285,7 +20397,7 @@
     <w:p>
       <w:pPr>
         <w:pBdr>
-          <w:bottom w:val="single" w:sz="6" w:space="1" w:color="AAAAAA"/>
+          <w:bottom w:val="single" w:sz="6" w:space="1" w:color="E2E8F0"/>
         </w:pBdr>
       </w:pPr>
     </w:p>
@@ -20695,7 +20807,7 @@
     <w:p>
       <w:pPr>
         <w:pBdr>
-          <w:bottom w:val="single" w:sz="6" w:space="1" w:color="AAAAAA"/>
+          <w:bottom w:val="single" w:sz="6" w:space="1" w:color="E2E8F0"/>
         </w:pBdr>
       </w:pPr>
     </w:p>
@@ -20773,7 +20885,7 @@
     <w:p>
       <w:pPr>
         <w:pBdr>
-          <w:bottom w:val="single" w:sz="6" w:space="1" w:color="AAAAAA"/>
+          <w:bottom w:val="single" w:sz="6" w:space="1" w:color="E2E8F0"/>
         </w:pBdr>
       </w:pPr>
     </w:p>
@@ -20989,7 +21101,7 @@
     <w:p>
       <w:pPr>
         <w:pBdr>
-          <w:bottom w:val="single" w:sz="6" w:space="1" w:color="AAAAAA"/>
+          <w:bottom w:val="single" w:sz="6" w:space="1" w:color="E2E8F0"/>
         </w:pBdr>
       </w:pPr>
     </w:p>
@@ -21020,16 +21132,20 @@
       </w:r>
     </w:p>
     <w:p>
+      <w:r>
+        <w:br w:type="page"/>
+      </w:r>
+    </w:p>
+    <w:p>
       <w:pPr>
         <w:pBdr>
-          <w:bottom w:val="single" w:sz="6" w:space="1" w:color="AAAAAA"/>
+          <w:bottom w:val="single" w:sz="6" w:space="1" w:color="E2E8F0"/>
         </w:pBdr>
       </w:pPr>
     </w:p>
     <w:p>
       <w:pPr>
         <w:pStyle w:val="Heading1"/>
-        <w:pageBreakBefore/>
         <w:spacing w:before="480" w:after="240"/>
         <w:jc w:val="center"/>
       </w:pPr>
@@ -21056,7 +21172,7 @@
     <w:p>
       <w:pPr>
         <w:pBdr>
-          <w:bottom w:val="single" w:sz="6" w:space="1" w:color="AAAAAA"/>
+          <w:bottom w:val="single" w:sz="6" w:space="1" w:color="E2E8F0"/>
         </w:pBdr>
       </w:pPr>
     </w:p>
@@ -21122,7 +21238,7 @@
     <w:p>
       <w:pPr>
         <w:pBdr>
-          <w:bottom w:val="single" w:sz="6" w:space="1" w:color="AAAAAA"/>
+          <w:bottom w:val="single" w:sz="6" w:space="1" w:color="E2E8F0"/>
         </w:pBdr>
       </w:pPr>
     </w:p>
@@ -21372,7 +21488,7 @@
     <w:p>
       <w:pPr>
         <w:pBdr>
-          <w:bottom w:val="single" w:sz="6" w:space="1" w:color="AAAAAA"/>
+          <w:bottom w:val="single" w:sz="6" w:space="1" w:color="E2E8F0"/>
         </w:pBdr>
       </w:pPr>
     </w:p>
@@ -21547,7 +21663,7 @@
     <w:p>
       <w:pPr>
         <w:pBdr>
-          <w:bottom w:val="single" w:sz="6" w:space="1" w:color="AAAAAA"/>
+          <w:bottom w:val="single" w:sz="6" w:space="1" w:color="E2E8F0"/>
         </w:pBdr>
       </w:pPr>
     </w:p>
@@ -21734,7 +21850,7 @@
     <w:p>
       <w:pPr>
         <w:pBdr>
-          <w:bottom w:val="single" w:sz="6" w:space="1" w:color="AAAAAA"/>
+          <w:bottom w:val="single" w:sz="6" w:space="1" w:color="E2E8F0"/>
         </w:pBdr>
       </w:pPr>
     </w:p>
@@ -22020,7 +22136,7 @@
     <w:p>
       <w:pPr>
         <w:pBdr>
-          <w:bottom w:val="single" w:sz="6" w:space="1" w:color="AAAAAA"/>
+          <w:bottom w:val="single" w:sz="6" w:space="1" w:color="E2E8F0"/>
         </w:pBdr>
       </w:pPr>
     </w:p>
@@ -22261,16 +22377,20 @@
       </w:r>
     </w:p>
     <w:p>
+      <w:r>
+        <w:br w:type="page"/>
+      </w:r>
+    </w:p>
+    <w:p>
       <w:pPr>
         <w:pBdr>
-          <w:bottom w:val="single" w:sz="6" w:space="1" w:color="AAAAAA"/>
+          <w:bottom w:val="single" w:sz="6" w:space="1" w:color="E2E8F0"/>
         </w:pBdr>
       </w:pPr>
     </w:p>
     <w:p>
       <w:pPr>
         <w:pStyle w:val="Heading1"/>
-        <w:pageBreakBefore/>
         <w:spacing w:before="480" w:after="240"/>
         <w:jc w:val="center"/>
       </w:pPr>
@@ -22297,7 +22417,7 @@
     <w:p>
       <w:pPr>
         <w:pBdr>
-          <w:bottom w:val="single" w:sz="6" w:space="1" w:color="AAAAAA"/>
+          <w:bottom w:val="single" w:sz="6" w:space="1" w:color="E2E8F0"/>
         </w:pBdr>
       </w:pPr>
     </w:p>
@@ -22521,11 +22641,9 @@
       </w:tr>
     </w:tbl>
     <w:p>
-      <w:pPr>
-        <w:pBdr>
-          <w:bottom w:val="single" w:sz="6" w:space="1" w:color="AAAAAA"/>
-        </w:pBdr>
-      </w:pPr>
+      <w:r>
+        <w:br w:type="page"/>
+      </w:r>
     </w:p>
     <w:p>
       <w:pPr>
@@ -22555,7 +22673,7 @@
     <w:p>
       <w:pPr>
         <w:pBdr>
-          <w:bottom w:val="single" w:sz="6" w:space="1" w:color="AAAAAA"/>
+          <w:bottom w:val="single" w:sz="6" w:space="1" w:color="E2E8F0"/>
         </w:pBdr>
       </w:pPr>
     </w:p>
@@ -22772,7 +22890,7 @@
     <w:p>
       <w:pPr>
         <w:pBdr>
-          <w:bottom w:val="single" w:sz="6" w:space="1" w:color="AAAAAA"/>
+          <w:bottom w:val="single" w:sz="6" w:space="1" w:color="E2E8F0"/>
         </w:pBdr>
       </w:pPr>
     </w:p>
@@ -22802,7 +22920,7 @@
     <w:p>
       <w:pPr>
         <w:pBdr>
-          <w:bottom w:val="single" w:sz="6" w:space="1" w:color="AAAAAA"/>
+          <w:bottom w:val="single" w:sz="6" w:space="1" w:color="E2E8F0"/>
         </w:pBdr>
       </w:pPr>
     </w:p>
@@ -22859,11 +22977,9 @@
       </w:r>
     </w:p>
     <w:p>
-      <w:pPr>
-        <w:pBdr>
-          <w:bottom w:val="single" w:sz="6" w:space="1" w:color="AAAAAA"/>
-        </w:pBdr>
-      </w:pPr>
+      <w:r>
+        <w:br w:type="page"/>
+      </w:r>
     </w:p>
     <w:p>
       <w:pPr>
@@ -22893,7 +23009,7 @@
     <w:p>
       <w:pPr>
         <w:pBdr>
-          <w:bottom w:val="single" w:sz="6" w:space="1" w:color="AAAAAA"/>
+          <w:bottom w:val="single" w:sz="6" w:space="1" w:color="E2E8F0"/>
         </w:pBdr>
       </w:pPr>
     </w:p>
@@ -23228,7 +23344,7 @@
     <w:p>
       <w:pPr>
         <w:pBdr>
-          <w:bottom w:val="single" w:sz="6" w:space="1" w:color="AAAAAA"/>
+          <w:bottom w:val="single" w:sz="6" w:space="1" w:color="E2E8F0"/>
         </w:pBdr>
       </w:pPr>
     </w:p>
@@ -23294,7 +23410,7 @@
     <w:p>
       <w:pPr>
         <w:pBdr>
-          <w:bottom w:val="single" w:sz="6" w:space="1" w:color="AAAAAA"/>
+          <w:bottom w:val="single" w:sz="6" w:space="1" w:color="E2E8F0"/>
         </w:pBdr>
       </w:pPr>
     </w:p>
@@ -23694,16 +23810,20 @@
       </w:r>
     </w:p>
     <w:p>
+      <w:r>
+        <w:br w:type="page"/>
+      </w:r>
+    </w:p>
+    <w:p>
       <w:pPr>
         <w:pBdr>
-          <w:bottom w:val="single" w:sz="6" w:space="1" w:color="AAAAAA"/>
+          <w:bottom w:val="single" w:sz="6" w:space="1" w:color="E2E8F0"/>
         </w:pBdr>
       </w:pPr>
     </w:p>
     <w:p>
       <w:pPr>
         <w:pStyle w:val="Heading1"/>
-        <w:pageBreakBefore/>
         <w:spacing w:before="480" w:after="240"/>
         <w:jc w:val="center"/>
       </w:pPr>
@@ -23730,7 +23850,7 @@
     <w:p>
       <w:pPr>
         <w:pBdr>
-          <w:bottom w:val="single" w:sz="6" w:space="1" w:color="AAAAAA"/>
+          <w:bottom w:val="single" w:sz="6" w:space="1" w:color="E2E8F0"/>
         </w:pBdr>
       </w:pPr>
     </w:p>
@@ -24037,6 +24157,9 @@
     <w:p>
       <w:pPr>
         <w:ind w:left="720"/>
+        <w:pBdr>
+          <w:left w:val="single" w:sz="12" w:space="8" w:color="E2E8F0"/>
+        </w:pBdr>
       </w:pPr>
       <w:r>
         <w:rPr/>
@@ -24055,7 +24178,7 @@
     <w:p>
       <w:pPr>
         <w:pBdr>
-          <w:bottom w:val="single" w:sz="6" w:space="1" w:color="AAAAAA"/>
+          <w:bottom w:val="single" w:sz="6" w:space="1" w:color="E2E8F0"/>
         </w:pBdr>
       </w:pPr>
     </w:p>
@@ -24148,7 +24271,7 @@
     <w:p>
       <w:pPr>
         <w:pBdr>
-          <w:bottom w:val="single" w:sz="6" w:space="1" w:color="AAAAAA"/>
+          <w:bottom w:val="single" w:sz="6" w:space="1" w:color="E2E8F0"/>
         </w:pBdr>
       </w:pPr>
     </w:p>
@@ -24175,402 +24298,279 @@
         <w:t>El concepto No. 8 genérico se sustituye por tres conceptos diferenciados conforme a la clasificación del Artículo C:</w:t>
       </w:r>
     </w:p>
-    <w:tbl>
-      <w:tblPr>
-        <w:tblStyle w:val="TableGrid"/>
-        <w:tblW w:type="auto" w:w="0"/>
-        <w:tblLook w:firstColumn="1" w:firstRow="1" w:lastColumn="0" w:lastRow="0" w:noHBand="0" w:noVBand="1" w:val="04A0"/>
-      </w:tblPr>
-      <w:tblGrid>
-        <w:gridCol w:w="1211"/>
-        <w:gridCol w:w="1211"/>
-        <w:gridCol w:w="1211"/>
-        <w:gridCol w:w="1211"/>
-        <w:gridCol w:w="1211"/>
-        <w:gridCol w:w="1211"/>
-        <w:gridCol w:w="1211"/>
-        <w:gridCol w:w="1211"/>
-      </w:tblGrid>
-      <w:tr>
-        <w:tc>
-          <w:tcPr>
-            <w:tcW w:type="dxa" w:w="1211"/>
-          </w:tcPr>
-          <w:p>
-            <w:r>
-              <w:rPr>
-                <w:b/>
-              </w:rPr>
-              <w:t>No.</w:t>
-            </w:r>
-          </w:p>
-        </w:tc>
-        <w:tc>
-          <w:tcPr>
-            <w:tcW w:type="dxa" w:w="1211"/>
-          </w:tcPr>
-          <w:p>
-            <w:r>
-              <w:rPr>
-                <w:b/>
-              </w:rPr>
-              <w:t>Motivo</w:t>
-            </w:r>
-          </w:p>
-        </w:tc>
-        <w:tc>
-          <w:tcPr>
-            <w:tcW w:type="dxa" w:w="1211"/>
-          </w:tcPr>
-          <w:p>
-            <w:r>
-              <w:rPr>
-                <w:b/>
-              </w:rPr>
-              <w:t>Llamado / Multa directa</w:t>
-            </w:r>
-          </w:p>
-        </w:tc>
-        <w:tc>
-          <w:tcPr>
-            <w:tcW w:type="dxa" w:w="1211"/>
-          </w:tcPr>
-          <w:p>
-            <w:r>
-              <w:rPr>
-                <w:b/>
-              </w:rPr>
-              <w:t>Monto (UMAs)</w:t>
-            </w:r>
-          </w:p>
-        </w:tc>
-        <w:tc>
-          <w:tcPr>
-            <w:tcW w:type="dxa" w:w="1211"/>
-          </w:tcPr>
-          <w:p>
-            <w:r>
-              <w:rPr>
-                <w:b/>
-              </w:rPr>
-              <w:t>Equiv. aprox. 2025</w:t>
-            </w:r>
-          </w:p>
-        </w:tc>
-        <w:tc>
-          <w:tcPr>
-            <w:tcW w:type="dxa" w:w="1211"/>
-          </w:tcPr>
-          <w:p>
-            <w:r>
-              <w:rPr>
-                <w:b/>
-              </w:rPr>
-              <w:t>Reincidencia (UMAs)</w:t>
-            </w:r>
-          </w:p>
-        </w:tc>
-        <w:tc>
-          <w:tcPr>
-            <w:tcW w:type="dxa" w:w="1211"/>
-          </w:tcPr>
-          <w:p>
-            <w:r>
-              <w:rPr>
-                <w:b/>
-              </w:rPr>
-              <w:t>Equiv. aprox. 2025</w:t>
-            </w:r>
-          </w:p>
-        </w:tc>
-        <w:tc>
-          <w:tcPr>
-            <w:tcW w:type="dxa" w:w="1211"/>
-          </w:tcPr>
-          <w:p>
-            <w:r>
-              <w:rPr>
-                <w:b/>
-              </w:rPr>
-              <w:t>Observación</w:t>
-            </w:r>
-          </w:p>
-        </w:tc>
-      </w:tr>
-      <w:tr>
-        <w:tc>
-          <w:tcPr>
-            <w:tcW w:type="dxa" w:w="1211"/>
-          </w:tcPr>
-          <w:p>
-            <w:r>
-              <w:rPr/>
-              <w:t>8-A</w:t>
-            </w:r>
-          </w:p>
-        </w:tc>
-        <w:tc>
-          <w:tcPr>
-            <w:tcW w:type="dxa" w:w="1211"/>
-          </w:tcPr>
-          <w:p>
-            <w:r>
-              <w:rPr/>
-              <w:t>Iniciar Obra Categoría I sin notificación de 48 h al Administrador (Formato C-1)</w:t>
-            </w:r>
-          </w:p>
-        </w:tc>
-        <w:tc>
-          <w:tcPr>
-            <w:tcW w:type="dxa" w:w="1211"/>
-          </w:tcPr>
-          <w:p>
-            <w:r>
-              <w:rPr/>
-              <w:t>1 Llamado de atención</w:t>
-            </w:r>
-          </w:p>
-        </w:tc>
-        <w:tc>
-          <w:tcPr>
-            <w:tcW w:type="dxa" w:w="1211"/>
-          </w:tcPr>
-          <w:p>
-            <w:r>
-              <w:rPr/>
-              <w:t>5 UMAs</w:t>
-            </w:r>
-          </w:p>
-        </w:tc>
-        <w:tc>
-          <w:tcPr>
-            <w:tcW w:type="dxa" w:w="1211"/>
-          </w:tcPr>
-          <w:p>
-            <w:r>
-              <w:rPr/>
-              <w:t>~$566</w:t>
-            </w:r>
-          </w:p>
-        </w:tc>
-        <w:tc>
-          <w:tcPr>
-            <w:tcW w:type="dxa" w:w="1211"/>
-          </w:tcPr>
-          <w:p>
-            <w:r>
-              <w:rPr/>
-              <w:t>9 UMAs</w:t>
-            </w:r>
-          </w:p>
-        </w:tc>
-        <w:tc>
-          <w:tcPr>
-            <w:tcW w:type="dxa" w:w="1211"/>
-          </w:tcPr>
-          <w:p>
-            <w:r>
-              <w:rPr/>
-              <w:t>~$1,018</w:t>
-            </w:r>
-          </w:p>
-        </w:tc>
-        <w:tc>
-          <w:tcPr>
-            <w:tcW w:type="dxa" w:w="1211"/>
-          </w:tcPr>
-          <w:p>
-            <w:r>
-              <w:rPr/>
-              <w:t>El Administrador otorga 24 h para regularizar la notificación antes de aplicar multa</w:t>
-            </w:r>
-          </w:p>
-        </w:tc>
-      </w:tr>
-      <w:tr>
-        <w:tc>
-          <w:tcPr>
-            <w:tcW w:type="dxa" w:w="1211"/>
-          </w:tcPr>
-          <w:p>
-            <w:r>
-              <w:rPr/>
-              <w:t>8-B</w:t>
-            </w:r>
-          </w:p>
-        </w:tc>
-        <w:tc>
-          <w:tcPr>
-            <w:tcW w:type="dxa" w:w="1211"/>
-          </w:tcPr>
-          <w:p>
-            <w:r>
-              <w:rPr/>
-              <w:t>Iniciar Obra Categoría II sin resolución favorable del Consejo de Diseño</w:t>
-            </w:r>
-          </w:p>
-        </w:tc>
-        <w:tc>
-          <w:tcPr>
-            <w:tcW w:type="dxa" w:w="1211"/>
-          </w:tcPr>
-          <w:p>
-            <w:r>
-              <w:rPr/>
-              <w:t>Multa directa</w:t>
-            </w:r>
-          </w:p>
-        </w:tc>
-        <w:tc>
-          <w:tcPr>
-            <w:tcW w:type="dxa" w:w="1211"/>
-          </w:tcPr>
-          <w:p>
-            <w:r>
-              <w:rPr/>
-              <w:t>27 UMAs</w:t>
-            </w:r>
-          </w:p>
-        </w:tc>
-        <w:tc>
-          <w:tcPr>
-            <w:tcW w:type="dxa" w:w="1211"/>
-          </w:tcPr>
-          <w:p>
-            <w:r>
-              <w:rPr/>
-              <w:t>~$3,055</w:t>
-            </w:r>
-          </w:p>
-        </w:tc>
-        <w:tc>
-          <w:tcPr>
-            <w:tcW w:type="dxa" w:w="1211"/>
-          </w:tcPr>
-          <w:p>
-            <w:r>
-              <w:rPr/>
-              <w:t>53 UMAs</w:t>
-            </w:r>
-          </w:p>
-        </w:tc>
-        <w:tc>
-          <w:tcPr>
-            <w:tcW w:type="dxa" w:w="1211"/>
-          </w:tcPr>
-          <w:p>
-            <w:r>
-              <w:rPr/>
-              <w:t>~$5,996</w:t>
-            </w:r>
-          </w:p>
-        </w:tc>
-        <w:tc>
-          <w:tcPr>
-            <w:tcW w:type="dxa" w:w="1211"/>
-          </w:tcPr>
-          <w:p>
-            <w:r>
-              <w:rPr/>
-              <w:t>Suspensión de obra inmediata; la multa es independiente de la cuota de revisión y del depósito en garantía del Artículo C</w:t>
-            </w:r>
-          </w:p>
-        </w:tc>
-      </w:tr>
-      <w:tr>
-        <w:tc>
-          <w:tcPr>
-            <w:tcW w:type="dxa" w:w="1211"/>
-          </w:tcPr>
-          <w:p>
-            <w:r>
-              <w:rPr/>
-              <w:t>8-C</w:t>
-            </w:r>
-          </w:p>
-        </w:tc>
-        <w:tc>
-          <w:tcPr>
-            <w:tcW w:type="dxa" w:w="1211"/>
-          </w:tcPr>
-          <w:p>
-            <w:r>
-              <w:rPr/>
-              <w:t>Iniciar Obra Categoría III sin autorización previa del Consejo de Diseño, sin DRO o sin permisos municipales</w:t>
-            </w:r>
-          </w:p>
-        </w:tc>
-        <w:tc>
-          <w:tcPr>
-            <w:tcW w:type="dxa" w:w="1211"/>
-          </w:tcPr>
-          <w:p>
-            <w:r>
-              <w:rPr/>
-              <w:t>Multa directa</w:t>
-            </w:r>
-          </w:p>
-        </w:tc>
-        <w:tc>
-          <w:tcPr>
-            <w:tcW w:type="dxa" w:w="1211"/>
-          </w:tcPr>
-          <w:p>
-            <w:r>
-              <w:rPr/>
-              <w:t>88 UMAs</w:t>
-            </w:r>
-          </w:p>
-        </w:tc>
-        <w:tc>
-          <w:tcPr>
-            <w:tcW w:type="dxa" w:w="1211"/>
-          </w:tcPr>
-          <w:p>
-            <w:r>
-              <w:rPr/>
-              <w:t>~$9,956</w:t>
-            </w:r>
-          </w:p>
-        </w:tc>
-        <w:tc>
-          <w:tcPr>
-            <w:tcW w:type="dxa" w:w="1211"/>
-          </w:tcPr>
-          <w:p>
-            <w:r>
-              <w:rPr/>
-              <w:t>133 UMAs</w:t>
-            </w:r>
-          </w:p>
-        </w:tc>
-        <w:tc>
-          <w:tcPr>
-            <w:tcW w:type="dxa" w:w="1211"/>
-          </w:tcPr>
-          <w:p>
-            <w:r>
-              <w:rPr/>
-              <w:t>~$15,048</w:t>
-            </w:r>
-          </w:p>
-        </w:tc>
-        <w:tc>
-          <w:tcPr>
-            <w:tcW w:type="dxa" w:w="1211"/>
-          </w:tcPr>
-          <w:p>
-            <w:r>
-              <w:rPr/>
-              <w:t>Suspensión de obra inmediata; la multa no sustituye el depósito en garantía ni las responsabilidades ante la Dirección de Desarrollo Urbano</w:t>
-            </w:r>
-          </w:p>
-        </w:tc>
-      </w:tr>
-    </w:tbl>
+    <w:p>
+      <w:pPr>
+        <w:spacing w:after="160"/>
+      </w:pPr>
+      <w:r>
+        <w:rPr/>
+      </w:r>
+      <w:r>
+        <w:rPr>
+          <w:b/>
+        </w:rPr>
+        <w:t>No. 8‑A – Iniciar Obra Categoría I sin notificación de 48 h al Administrador (Formato C‑1)</w:t>
+      </w:r>
+      <w:r>
+        <w:rPr/>
+      </w:r>
+    </w:p>
+    <w:p>
+      <w:pPr>
+        <w:pStyle w:val="ListBullet"/>
+      </w:pPr>
+      <w:r>
+        <w:rPr/>
+      </w:r>
+      <w:r>
+        <w:rPr>
+          <w:b/>
+        </w:rPr>
+        <w:t>Llamado / Multa directa:</w:t>
+      </w:r>
+      <w:r>
+        <w:rPr/>
+        <w:t xml:space="preserve"> 1 Llamado de atención</w:t>
+      </w:r>
+    </w:p>
+    <w:p>
+      <w:pPr>
+        <w:pStyle w:val="ListBullet"/>
+      </w:pPr>
+      <w:r>
+        <w:rPr/>
+      </w:r>
+      <w:r>
+        <w:rPr>
+          <w:b/>
+        </w:rPr>
+        <w:t>Monto (UMAs):</w:t>
+      </w:r>
+      <w:r>
+        <w:rPr/>
+        <w:t xml:space="preserve"> 5 UMAs (~$566)</w:t>
+      </w:r>
+    </w:p>
+    <w:p>
+      <w:pPr>
+        <w:pStyle w:val="ListBullet"/>
+      </w:pPr>
+      <w:r>
+        <w:rPr/>
+      </w:r>
+      <w:r>
+        <w:rPr>
+          <w:b/>
+        </w:rPr>
+        <w:t>Equiv. aprox. 2025:</w:t>
+      </w:r>
+      <w:r>
+        <w:rPr/>
+        <w:t xml:space="preserve"> 9 UMAs (~$1,018)</w:t>
+      </w:r>
+    </w:p>
+    <w:p>
+      <w:pPr>
+        <w:pStyle w:val="ListBullet"/>
+      </w:pPr>
+      <w:r>
+        <w:rPr/>
+      </w:r>
+      <w:r>
+        <w:rPr>
+          <w:b/>
+        </w:rPr>
+        <w:t>Observación:</w:t>
+      </w:r>
+      <w:r>
+        <w:rPr/>
+        <w:t xml:space="preserve"> El Administrador otorga 24 h para regularizar la notificación antes de aplicar multa</w:t>
+      </w:r>
+    </w:p>
+    <w:p>
+      <w:pPr>
+        <w:spacing w:after="160"/>
+      </w:pPr>
+      <w:r>
+        <w:rPr/>
+      </w:r>
+      <w:r>
+        <w:rPr>
+          <w:b/>
+        </w:rPr>
+        <w:t>No. 8‑B – Iniciar Obra Categoría II sin resolución favorable del Consejo de Diseño</w:t>
+      </w:r>
+      <w:r>
+        <w:rPr/>
+      </w:r>
+    </w:p>
+    <w:p>
+      <w:pPr>
+        <w:pStyle w:val="ListBullet"/>
+      </w:pPr>
+      <w:r>
+        <w:rPr/>
+      </w:r>
+      <w:r>
+        <w:rPr>
+          <w:b/>
+        </w:rPr>
+        <w:t>Llamado / Multa directa:</w:t>
+      </w:r>
+      <w:r>
+        <w:rPr/>
+        <w:t xml:space="preserve"> Multa directa</w:t>
+      </w:r>
+    </w:p>
+    <w:p>
+      <w:pPr>
+        <w:pStyle w:val="ListBullet"/>
+      </w:pPr>
+      <w:r>
+        <w:rPr/>
+      </w:r>
+      <w:r>
+        <w:rPr>
+          <w:b/>
+        </w:rPr>
+        <w:t>Monto (UMAs):</w:t>
+      </w:r>
+      <w:r>
+        <w:rPr/>
+        <w:t xml:space="preserve"> 27 UMAs (~$3,055)</w:t>
+      </w:r>
+    </w:p>
+    <w:p>
+      <w:pPr>
+        <w:pStyle w:val="ListBullet"/>
+      </w:pPr>
+      <w:r>
+        <w:rPr/>
+      </w:r>
+      <w:r>
+        <w:rPr>
+          <w:b/>
+        </w:rPr>
+        <w:t>Equiv. aprox. 2025:</w:t>
+      </w:r>
+      <w:r>
+        <w:rPr/>
+        <w:t xml:space="preserve"> 53 UMAs (~$5,996)</w:t>
+      </w:r>
+    </w:p>
+    <w:p>
+      <w:pPr>
+        <w:pStyle w:val="ListBullet"/>
+      </w:pPr>
+      <w:r>
+        <w:rPr/>
+      </w:r>
+      <w:r>
+        <w:rPr>
+          <w:b/>
+        </w:rPr>
+        <w:t>Observación:</w:t>
+      </w:r>
+      <w:r>
+        <w:rPr/>
+        <w:t xml:space="preserve"> Suspensión de obra inmediata; la multa es independiente de la cuota de revisión y del depósito en garantía del Artículo C</w:t>
+      </w:r>
+    </w:p>
+    <w:p>
+      <w:pPr>
+        <w:spacing w:after="160"/>
+      </w:pPr>
+      <w:r>
+        <w:rPr/>
+      </w:r>
+      <w:r>
+        <w:rPr>
+          <w:b/>
+        </w:rPr>
+        <w:t>No. 8‑C – Iniciar Obra Categoría III sin autorización previa del Consejo de Diseño, sin DRO o sin permisos municipales</w:t>
+      </w:r>
+      <w:r>
+        <w:rPr/>
+      </w:r>
+    </w:p>
+    <w:p>
+      <w:pPr>
+        <w:pStyle w:val="ListBullet"/>
+      </w:pPr>
+      <w:r>
+        <w:rPr/>
+      </w:r>
+      <w:r>
+        <w:rPr>
+          <w:b/>
+        </w:rPr>
+        <w:t>Llamado / Multa directa:</w:t>
+      </w:r>
+      <w:r>
+        <w:rPr/>
+        <w:t xml:space="preserve"> Multa directa</w:t>
+      </w:r>
+    </w:p>
+    <w:p>
+      <w:pPr>
+        <w:pStyle w:val="ListBullet"/>
+      </w:pPr>
+      <w:r>
+        <w:rPr/>
+      </w:r>
+      <w:r>
+        <w:rPr>
+          <w:b/>
+        </w:rPr>
+        <w:t>Monto (UMAs):</w:t>
+      </w:r>
+      <w:r>
+        <w:rPr/>
+        <w:t xml:space="preserve"> 88 UMAs (~$9,956)</w:t>
+      </w:r>
+    </w:p>
+    <w:p>
+      <w:pPr>
+        <w:pStyle w:val="ListBullet"/>
+      </w:pPr>
+      <w:r>
+        <w:rPr/>
+      </w:r>
+      <w:r>
+        <w:rPr>
+          <w:b/>
+        </w:rPr>
+        <w:t>Equiv. aprox. 2025:</w:t>
+      </w:r>
+      <w:r>
+        <w:rPr/>
+        <w:t xml:space="preserve"> 133 UMAs (~$15,048)</w:t>
+      </w:r>
+    </w:p>
+    <w:p>
+      <w:pPr>
+        <w:pStyle w:val="ListBullet"/>
+      </w:pPr>
+      <w:r>
+        <w:rPr/>
+      </w:r>
+      <w:r>
+        <w:rPr>
+          <w:b/>
+        </w:rPr>
+        <w:t>Observación:</w:t>
+      </w:r>
+      <w:r>
+        <w:rPr/>
+        <w:t xml:space="preserve"> Suspensión de obra inmediata; la multa no sustituye el depósito en garantía ni las responsabilidades ante la Dirección de Desarrollo Urbano</w:t>
+      </w:r>
+    </w:p>
     <w:p>
       <w:pPr>
         <w:ind w:left="720"/>
+        <w:pBdr>
+          <w:left w:val="single" w:sz="12" w:space="8" w:color="E2E8F0"/>
+        </w:pBdr>
       </w:pPr>
       <w:r>
         <w:rPr/>
@@ -24589,7 +24589,7 @@
     <w:p>
       <w:pPr>
         <w:pBdr>
-          <w:bottom w:val="single" w:sz="6" w:space="1" w:color="AAAAAA"/>
+          <w:bottom w:val="single" w:sz="6" w:space="1" w:color="E2E8F0"/>
         </w:pBdr>
       </w:pPr>
     </w:p>
@@ -24636,315 +24636,190 @@
         <w:t xml:space="preserve"> (exceder horario de construcción) se mantienen en estructura. Se propone expresar sus montos también en UMAs para consistencia:</w:t>
       </w:r>
     </w:p>
-    <w:tbl>
-      <w:tblPr>
-        <w:tblStyle w:val="TableGrid"/>
-        <w:tblW w:type="auto" w:w="0"/>
-        <w:tblLook w:firstColumn="1" w:firstRow="1" w:lastColumn="0" w:lastRow="0" w:noHBand="0" w:noVBand="1" w:val="04A0"/>
-      </w:tblPr>
-      <w:tblGrid>
-        <w:gridCol w:w="1211"/>
-        <w:gridCol w:w="1211"/>
-        <w:gridCol w:w="1211"/>
-        <w:gridCol w:w="1211"/>
-        <w:gridCol w:w="1211"/>
-        <w:gridCol w:w="1211"/>
-        <w:gridCol w:w="1211"/>
-        <w:gridCol w:w="1211"/>
-      </w:tblGrid>
-      <w:tr>
-        <w:tc>
-          <w:tcPr>
-            <w:tcW w:type="dxa" w:w="1211"/>
-          </w:tcPr>
-          <w:p>
-            <w:r>
-              <w:rPr>
-                <w:b/>
-              </w:rPr>
-              <w:t>No.</w:t>
-            </w:r>
-          </w:p>
-        </w:tc>
-        <w:tc>
-          <w:tcPr>
-            <w:tcW w:type="dxa" w:w="1211"/>
-          </w:tcPr>
-          <w:p>
-            <w:r>
-              <w:rPr>
-                <w:b/>
-              </w:rPr>
-              <w:t>Motivo</w:t>
-            </w:r>
-          </w:p>
-        </w:tc>
-        <w:tc>
-          <w:tcPr>
-            <w:tcW w:type="dxa" w:w="1211"/>
-          </w:tcPr>
-          <w:p>
-            <w:r>
-              <w:rPr>
-                <w:b/>
-              </w:rPr>
-              <w:t>Llamado / Multa directa</w:t>
-            </w:r>
-          </w:p>
-        </w:tc>
-        <w:tc>
-          <w:tcPr>
-            <w:tcW w:type="dxa" w:w="1211"/>
-          </w:tcPr>
-          <w:p>
-            <w:r>
-              <w:rPr>
-                <w:b/>
-              </w:rPr>
-              <w:t>Monto (UMAs)</w:t>
-            </w:r>
-          </w:p>
-        </w:tc>
-        <w:tc>
-          <w:tcPr>
-            <w:tcW w:type="dxa" w:w="1211"/>
-          </w:tcPr>
-          <w:p>
-            <w:r>
-              <w:rPr>
-                <w:b/>
-              </w:rPr>
-              <w:t>Equiv. aprox. 2025</w:t>
-            </w:r>
-          </w:p>
-        </w:tc>
-        <w:tc>
-          <w:tcPr>
-            <w:tcW w:type="dxa" w:w="1211"/>
-          </w:tcPr>
-          <w:p>
-            <w:r>
-              <w:rPr>
-                <w:b/>
-              </w:rPr>
-              <w:t>Reincidencia (UMAs)</w:t>
-            </w:r>
-          </w:p>
-        </w:tc>
-        <w:tc>
-          <w:tcPr>
-            <w:tcW w:type="dxa" w:w="1211"/>
-          </w:tcPr>
-          <w:p>
-            <w:r>
-              <w:rPr>
-                <w:b/>
-              </w:rPr>
-              <w:t>Equiv. aprox. 2025</w:t>
-            </w:r>
-          </w:p>
-        </w:tc>
-        <w:tc>
-          <w:tcPr>
-            <w:tcW w:type="dxa" w:w="1211"/>
-          </w:tcPr>
-          <w:p>
-            <w:r>
-              <w:rPr>
-                <w:b/>
-              </w:rPr>
-              <w:t>Observación</w:t>
-            </w:r>
-          </w:p>
-        </w:tc>
-      </w:tr>
-      <w:tr>
-        <w:tc>
-          <w:tcPr>
-            <w:tcW w:type="dxa" w:w="1211"/>
-          </w:tcPr>
-          <w:p>
-            <w:r>
-              <w:rPr/>
-              <w:t>9</w:t>
-            </w:r>
-          </w:p>
-        </w:tc>
-        <w:tc>
-          <w:tcPr>
-            <w:tcW w:type="dxa" w:w="1211"/>
-          </w:tcPr>
-          <w:p>
-            <w:r>
-              <w:rPr/>
-              <w:t>Materiales de construcción en vialidades</w:t>
-            </w:r>
-          </w:p>
-        </w:tc>
-        <w:tc>
-          <w:tcPr>
-            <w:tcW w:type="dxa" w:w="1211"/>
-          </w:tcPr>
-          <w:p>
-            <w:r>
-              <w:rPr/>
-              <w:t>1 Llamado de atención</w:t>
-            </w:r>
-          </w:p>
-        </w:tc>
-        <w:tc>
-          <w:tcPr>
-            <w:tcW w:type="dxa" w:w="1211"/>
-          </w:tcPr>
-          <w:p>
-            <w:r>
-              <w:rPr/>
-              <w:t>5 UMAs</w:t>
-            </w:r>
-          </w:p>
-        </w:tc>
-        <w:tc>
-          <w:tcPr>
-            <w:tcW w:type="dxa" w:w="1211"/>
-          </w:tcPr>
-          <w:p>
-            <w:r>
-              <w:rPr/>
-              <w:t>~$566</w:t>
-            </w:r>
-          </w:p>
-        </w:tc>
-        <w:tc>
-          <w:tcPr>
-            <w:tcW w:type="dxa" w:w="1211"/>
-          </w:tcPr>
-          <w:p>
-            <w:r>
-              <w:rPr/>
-              <w:t>9 UMAs</w:t>
-            </w:r>
-          </w:p>
-        </w:tc>
-        <w:tc>
-          <w:tcPr>
-            <w:tcW w:type="dxa" w:w="1211"/>
-          </w:tcPr>
-          <w:p>
-            <w:r>
-              <w:rPr/>
-              <w:t>~$1,018</w:t>
-            </w:r>
-          </w:p>
-        </w:tc>
-        <w:tc>
-          <w:tcPr>
-            <w:tcW w:type="dxa" w:w="1211"/>
-          </w:tcPr>
-          <w:p>
-            <w:r>
-              <w:rPr/>
-              <w:t>Suspensión de obra en caso de reincidir</w:t>
-            </w:r>
-          </w:p>
-        </w:tc>
-      </w:tr>
-      <w:tr>
-        <w:tc>
-          <w:tcPr>
-            <w:tcW w:type="dxa" w:w="1211"/>
-          </w:tcPr>
-          <w:p>
-            <w:r>
-              <w:rPr/>
-              <w:t>10</w:t>
-            </w:r>
-          </w:p>
-        </w:tc>
-        <w:tc>
-          <w:tcPr>
-            <w:tcW w:type="dxa" w:w="1211"/>
-          </w:tcPr>
-          <w:p>
-            <w:r>
-              <w:rPr/>
-              <w:t>Exceder el horario permitido para construcciones o instalaciones</w:t>
-            </w:r>
-          </w:p>
-        </w:tc>
-        <w:tc>
-          <w:tcPr>
-            <w:tcW w:type="dxa" w:w="1211"/>
-          </w:tcPr>
-          <w:p>
-            <w:r>
-              <w:rPr/>
-              <w:t>1 Llamado de atención</w:t>
-            </w:r>
-          </w:p>
-        </w:tc>
-        <w:tc>
-          <w:tcPr>
-            <w:tcW w:type="dxa" w:w="1211"/>
-          </w:tcPr>
-          <w:p>
-            <w:r>
-              <w:rPr/>
-              <w:t>9 UMAs</w:t>
-            </w:r>
-          </w:p>
-        </w:tc>
-        <w:tc>
-          <w:tcPr>
-            <w:tcW w:type="dxa" w:w="1211"/>
-          </w:tcPr>
-          <w:p>
-            <w:r>
-              <w:rPr/>
-              <w:t>~$1,018</w:t>
-            </w:r>
-          </w:p>
-        </w:tc>
-        <w:tc>
-          <w:tcPr>
-            <w:tcW w:type="dxa" w:w="1211"/>
-          </w:tcPr>
-          <w:p>
-            <w:r>
-              <w:rPr/>
-              <w:t>18 UMAs</w:t>
-            </w:r>
-          </w:p>
-        </w:tc>
-        <w:tc>
-          <w:tcPr>
-            <w:tcW w:type="dxa" w:w="1211"/>
-          </w:tcPr>
-          <w:p>
-            <w:r>
-              <w:rPr/>
-              <w:t>~$2,037</w:t>
-            </w:r>
-          </w:p>
-        </w:tc>
-        <w:tc>
-          <w:tcPr>
-            <w:tcW w:type="dxa" w:w="1211"/>
-          </w:tcPr>
-          <w:p>
-            <w:r>
-              <w:rPr/>
-              <w:t>Suspensión de obra en caso de reincidir</w:t>
-            </w:r>
-          </w:p>
-        </w:tc>
-      </w:tr>
-    </w:tbl>
     <w:p>
       <w:pPr>
         <w:spacing w:after="160"/>
       </w:pPr>
       <w:r>
         <w:rPr/>
+      </w:r>
+      <w:r>
+        <w:rPr>
+          <w:b/>
+        </w:rPr>
+        <w:t>No. 9 – Materiales de construcción en vialidades</w:t>
+      </w:r>
+      <w:r>
+        <w:rPr/>
+      </w:r>
+    </w:p>
+    <w:p>
+      <w:pPr>
+        <w:pStyle w:val="ListBullet"/>
+      </w:pPr>
+      <w:r>
+        <w:rPr/>
+      </w:r>
+      <w:r>
+        <w:rPr>
+          <w:b/>
+        </w:rPr>
+        <w:t>Llamado / Multa directa:</w:t>
+      </w:r>
+      <w:r>
+        <w:rPr/>
+        <w:t xml:space="preserve"> 1 Llamado de atención</w:t>
+      </w:r>
+    </w:p>
+    <w:p>
+      <w:pPr>
+        <w:pStyle w:val="ListBullet"/>
+      </w:pPr>
+      <w:r>
+        <w:rPr/>
+      </w:r>
+      <w:r>
+        <w:rPr>
+          <w:b/>
+        </w:rPr>
+        <w:t>Monto (UMAs):</w:t>
+      </w:r>
+      <w:r>
+        <w:rPr/>
+        <w:t xml:space="preserve"> 5 UMAs (~$566)</w:t>
+      </w:r>
+    </w:p>
+    <w:p>
+      <w:pPr>
+        <w:pStyle w:val="ListBullet"/>
+      </w:pPr>
+      <w:r>
+        <w:rPr/>
+      </w:r>
+      <w:r>
+        <w:rPr>
+          <w:b/>
+        </w:rPr>
+        <w:t>Equiv. aprox. 2025:</w:t>
+      </w:r>
+      <w:r>
+        <w:rPr/>
+        <w:t xml:space="preserve"> 9 UMAs (~$1,018)</w:t>
+      </w:r>
+    </w:p>
+    <w:p>
+      <w:pPr>
+        <w:pStyle w:val="ListBullet"/>
+      </w:pPr>
+      <w:r>
+        <w:rPr/>
+      </w:r>
+      <w:r>
+        <w:rPr>
+          <w:b/>
+        </w:rPr>
+        <w:t>Observación:</w:t>
+      </w:r>
+      <w:r>
+        <w:rPr/>
+        <w:t xml:space="preserve"> Suspensión de obra en caso de reincidir</w:t>
+      </w:r>
+    </w:p>
+    <w:p>
+      <w:pPr>
+        <w:spacing w:after="160"/>
+      </w:pPr>
+      <w:r>
+        <w:rPr/>
+      </w:r>
+      <w:r>
+        <w:rPr>
+          <w:b/>
+        </w:rPr>
+        <w:t>No. 10 – Exceder el horario permitido para construcciones o instalaciones</w:t>
+      </w:r>
+      <w:r>
+        <w:rPr/>
+      </w:r>
+    </w:p>
+    <w:p>
+      <w:pPr>
+        <w:pStyle w:val="ListBullet"/>
+      </w:pPr>
+      <w:r>
+        <w:rPr/>
+      </w:r>
+      <w:r>
+        <w:rPr>
+          <w:b/>
+        </w:rPr>
+        <w:t>Llamado / Multa directa:</w:t>
+      </w:r>
+      <w:r>
+        <w:rPr/>
+        <w:t xml:space="preserve"> 1 Llamado de atención</w:t>
+      </w:r>
+    </w:p>
+    <w:p>
+      <w:pPr>
+        <w:pStyle w:val="ListBullet"/>
+      </w:pPr>
+      <w:r>
+        <w:rPr/>
+      </w:r>
+      <w:r>
+        <w:rPr>
+          <w:b/>
+        </w:rPr>
+        <w:t>Monto (UMAs):</w:t>
+      </w:r>
+      <w:r>
+        <w:rPr/>
+        <w:t xml:space="preserve"> 9 UMAs (~$1,018)</w:t>
+      </w:r>
+    </w:p>
+    <w:p>
+      <w:pPr>
+        <w:pStyle w:val="ListBullet"/>
+      </w:pPr>
+      <w:r>
+        <w:rPr/>
+      </w:r>
+      <w:r>
+        <w:rPr>
+          <w:b/>
+        </w:rPr>
+        <w:t>Equiv. aprox. 2025:</w:t>
+      </w:r>
+      <w:r>
+        <w:rPr/>
+        <w:t xml:space="preserve"> 18 UMAs (~$2,037)</w:t>
+      </w:r>
+    </w:p>
+    <w:p>
+      <w:pPr>
+        <w:pStyle w:val="ListBullet"/>
+      </w:pPr>
+      <w:r>
+        <w:rPr/>
+      </w:r>
+      <w:r>
+        <w:rPr>
+          <w:b/>
+        </w:rPr>
+        <w:t>Observación:</w:t>
+      </w:r>
+      <w:r>
+        <w:rPr/>
+        <w:t xml:space="preserve"> Suspensión de obra en caso de reincidir</w:t>
+      </w:r>
+    </w:p>
+    <w:p>
+      <w:pPr>
+        <w:spacing w:after="160"/>
+      </w:pPr>
+      <w:r>
+        <w:rPr/>
         <w:t xml:space="preserve">Se aclara expresamente que ambos conceptos aplican </w:t>
       </w:r>
       <w:r>
@@ -24961,7 +24836,7 @@
     <w:p>
       <w:pPr>
         <w:pBdr>
-          <w:bottom w:val="single" w:sz="6" w:space="1" w:color="AAAAAA"/>
+          <w:bottom w:val="single" w:sz="6" w:space="1" w:color="E2E8F0"/>
         </w:pBdr>
       </w:pPr>
     </w:p>
@@ -24988,493 +24863,330 @@
         <w:t>Se propone agregar al Catálogo los siguientes conceptos:</w:t>
       </w:r>
     </w:p>
-    <w:tbl>
-      <w:tblPr>
-        <w:tblStyle w:val="TableGrid"/>
-        <w:tblW w:type="auto" w:w="0"/>
-        <w:tblLook w:firstColumn="1" w:firstRow="1" w:lastColumn="0" w:lastRow="0" w:noHBand="0" w:noVBand="1" w:val="04A0"/>
-      </w:tblPr>
-      <w:tblGrid>
-        <w:gridCol w:w="1211"/>
-        <w:gridCol w:w="1211"/>
-        <w:gridCol w:w="1211"/>
-        <w:gridCol w:w="1211"/>
-        <w:gridCol w:w="1211"/>
-        <w:gridCol w:w="1211"/>
-        <w:gridCol w:w="1211"/>
-        <w:gridCol w:w="1211"/>
-      </w:tblGrid>
-      <w:tr>
-        <w:tc>
-          <w:tcPr>
-            <w:tcW w:type="dxa" w:w="1211"/>
-          </w:tcPr>
-          <w:p>
-            <w:r>
-              <w:rPr>
-                <w:b/>
-              </w:rPr>
-              <w:t>No.</w:t>
-            </w:r>
-          </w:p>
-        </w:tc>
-        <w:tc>
-          <w:tcPr>
-            <w:tcW w:type="dxa" w:w="1211"/>
-          </w:tcPr>
-          <w:p>
-            <w:r>
-              <w:rPr>
-                <w:b/>
-              </w:rPr>
-              <w:t>Motivo</w:t>
-            </w:r>
-          </w:p>
-        </w:tc>
-        <w:tc>
-          <w:tcPr>
-            <w:tcW w:type="dxa" w:w="1211"/>
-          </w:tcPr>
-          <w:p>
-            <w:r>
-              <w:rPr>
-                <w:b/>
-              </w:rPr>
-              <w:t>Llamado / Multa directa</w:t>
-            </w:r>
-          </w:p>
-        </w:tc>
-        <w:tc>
-          <w:tcPr>
-            <w:tcW w:type="dxa" w:w="1211"/>
-          </w:tcPr>
-          <w:p>
-            <w:r>
-              <w:rPr>
-                <w:b/>
-              </w:rPr>
-              <w:t>Monto (UMAs)</w:t>
-            </w:r>
-          </w:p>
-        </w:tc>
-        <w:tc>
-          <w:tcPr>
-            <w:tcW w:type="dxa" w:w="1211"/>
-          </w:tcPr>
-          <w:p>
-            <w:r>
-              <w:rPr>
-                <w:b/>
-              </w:rPr>
-              <w:t>Equiv. aprox. 2025</w:t>
-            </w:r>
-          </w:p>
-        </w:tc>
-        <w:tc>
-          <w:tcPr>
-            <w:tcW w:type="dxa" w:w="1211"/>
-          </w:tcPr>
-          <w:p>
-            <w:r>
-              <w:rPr>
-                <w:b/>
-              </w:rPr>
-              <w:t>Reincidencia (UMAs)</w:t>
-            </w:r>
-          </w:p>
-        </w:tc>
-        <w:tc>
-          <w:tcPr>
-            <w:tcW w:type="dxa" w:w="1211"/>
-          </w:tcPr>
-          <w:p>
-            <w:r>
-              <w:rPr>
-                <w:b/>
-              </w:rPr>
-              <w:t>Equiv. aprox. 2025</w:t>
-            </w:r>
-          </w:p>
-        </w:tc>
-        <w:tc>
-          <w:tcPr>
-            <w:tcW w:type="dxa" w:w="1211"/>
-          </w:tcPr>
-          <w:p>
-            <w:r>
-              <w:rPr>
-                <w:b/>
-              </w:rPr>
-              <w:t>Observación</w:t>
-            </w:r>
-          </w:p>
-        </w:tc>
-      </w:tr>
-      <w:tr>
-        <w:tc>
-          <w:tcPr>
-            <w:tcW w:type="dxa" w:w="1211"/>
-          </w:tcPr>
-          <w:p>
-            <w:r>
-              <w:rPr/>
-              <w:t>17</w:t>
-            </w:r>
-          </w:p>
-        </w:tc>
-        <w:tc>
-          <w:tcPr>
-            <w:tcW w:type="dxa" w:w="1211"/>
-          </w:tcPr>
-          <w:p>
-            <w:r>
-              <w:rPr/>
-              <w:t>Incumplir condiciones de obra impuestas por el Consejo de Diseño en su resolución escrita</w:t>
-            </w:r>
-          </w:p>
-        </w:tc>
-        <w:tc>
-          <w:tcPr>
-            <w:tcW w:type="dxa" w:w="1211"/>
-          </w:tcPr>
-          <w:p>
-            <w:r>
-              <w:rPr/>
-              <w:t>1 Llamado de atención</w:t>
-            </w:r>
-          </w:p>
-        </w:tc>
-        <w:tc>
-          <w:tcPr>
-            <w:tcW w:type="dxa" w:w="1211"/>
-          </w:tcPr>
-          <w:p>
-            <w:r>
-              <w:rPr/>
-              <w:t>13 UMAs</w:t>
-            </w:r>
-          </w:p>
-        </w:tc>
-        <w:tc>
-          <w:tcPr>
-            <w:tcW w:type="dxa" w:w="1211"/>
-          </w:tcPr>
-          <w:p>
-            <w:r>
-              <w:rPr/>
-              <w:t>~$1,471</w:t>
-            </w:r>
-          </w:p>
-        </w:tc>
-        <w:tc>
-          <w:tcPr>
-            <w:tcW w:type="dxa" w:w="1211"/>
-          </w:tcPr>
-          <w:p>
-            <w:r>
-              <w:rPr/>
-              <w:t>27 UMAs</w:t>
-            </w:r>
-          </w:p>
-        </w:tc>
-        <w:tc>
-          <w:tcPr>
-            <w:tcW w:type="dxa" w:w="1211"/>
-          </w:tcPr>
-          <w:p>
-            <w:r>
-              <w:rPr/>
-              <w:t>~$3,055</w:t>
-            </w:r>
-          </w:p>
-        </w:tc>
-        <w:tc>
-          <w:tcPr>
-            <w:tcW w:type="dxa" w:w="1211"/>
-          </w:tcPr>
-          <w:p>
-            <w:r>
-              <w:rPr/>
-              <w:t>El Consejo puede ordenar suspensión de obra hasta verificar el cumplimiento</w:t>
-            </w:r>
-          </w:p>
-        </w:tc>
-      </w:tr>
-      <w:tr>
-        <w:tc>
-          <w:tcPr>
-            <w:tcW w:type="dxa" w:w="1211"/>
-          </w:tcPr>
-          <w:p>
-            <w:r>
-              <w:rPr/>
-              <w:t>18</w:t>
-            </w:r>
-          </w:p>
-        </w:tc>
-        <w:tc>
-          <w:tcPr>
-            <w:tcW w:type="dxa" w:w="1211"/>
-          </w:tcPr>
-          <w:p>
-            <w:r>
-              <w:rPr/>
-              <w:t>No regularizar obra no autorizada dentro del plazo de 15 días hábiles tras notificación, fuera del período de amnistía</w:t>
-            </w:r>
-          </w:p>
-        </w:tc>
-        <w:tc>
-          <w:tcPr>
-            <w:tcW w:type="dxa" w:w="1211"/>
-          </w:tcPr>
-          <w:p>
-            <w:r>
-              <w:rPr/>
-              <w:t>Multa directa</w:t>
-            </w:r>
-          </w:p>
-        </w:tc>
-        <w:tc>
-          <w:tcPr>
-            <w:tcW w:type="dxa" w:w="1211"/>
-          </w:tcPr>
-          <w:p>
-            <w:r>
-              <w:rPr/>
-              <w:t>Doble del depósito en garantía de la categoría correspondiente</w:t>
-            </w:r>
-          </w:p>
-        </w:tc>
-        <w:tc>
-          <w:tcPr>
-            <w:tcW w:type="dxa" w:w="1211"/>
-          </w:tcPr>
-          <w:p>
-            <w:r>
-              <w:rPr/>
-              <w:t>—</w:t>
-            </w:r>
-          </w:p>
-        </w:tc>
-        <w:tc>
-          <w:tcPr>
-            <w:tcW w:type="dxa" w:w="1211"/>
-          </w:tcPr>
-          <w:p>
-            <w:r>
-              <w:rPr/>
-              <w:t>—</w:t>
-            </w:r>
-          </w:p>
-        </w:tc>
-        <w:tc>
-          <w:tcPr>
-            <w:tcW w:type="dxa" w:w="1211"/>
-          </w:tcPr>
-          <w:p>
-            <w:r>
-              <w:rPr/>
-              <w:t>—</w:t>
-            </w:r>
-          </w:p>
-        </w:tc>
-        <w:tc>
-          <w:tcPr>
-            <w:tcW w:type="dxa" w:w="1211"/>
-          </w:tcPr>
-          <w:p>
-            <w:r>
-              <w:rPr/>
-              <w:t>Acumulable por cada período vencido; el Comité de Representantes puede contratar la restitución con cargo al infractor</w:t>
-            </w:r>
-          </w:p>
-        </w:tc>
-      </w:tr>
-      <w:tr>
-        <w:tc>
-          <w:tcPr>
-            <w:tcW w:type="dxa" w:w="1211"/>
-          </w:tcPr>
-          <w:p>
-            <w:r>
-              <w:rPr/>
-              <w:t>19</w:t>
-            </w:r>
-          </w:p>
-        </w:tc>
-        <w:tc>
-          <w:tcPr>
-            <w:tcW w:type="dxa" w:w="1211"/>
-          </w:tcPr>
-          <w:p>
-            <w:r>
-              <w:rPr/>
-              <w:t>Obstaculizar o impedir visitas de supervisión del Consejo de Diseño durante obra autorizada de Categoría III</w:t>
-            </w:r>
-          </w:p>
-        </w:tc>
-        <w:tc>
-          <w:tcPr>
-            <w:tcW w:type="dxa" w:w="1211"/>
-          </w:tcPr>
-          <w:p>
-            <w:r>
-              <w:rPr/>
-              <w:t>Multa directa</w:t>
-            </w:r>
-          </w:p>
-        </w:tc>
-        <w:tc>
-          <w:tcPr>
-            <w:tcW w:type="dxa" w:w="1211"/>
-          </w:tcPr>
-          <w:p>
-            <w:r>
-              <w:rPr/>
-              <w:t>18 UMAs</w:t>
-            </w:r>
-          </w:p>
-        </w:tc>
-        <w:tc>
-          <w:tcPr>
-            <w:tcW w:type="dxa" w:w="1211"/>
-          </w:tcPr>
-          <w:p>
-            <w:r>
-              <w:rPr/>
-              <w:t>~$2,037</w:t>
-            </w:r>
-          </w:p>
-        </w:tc>
-        <w:tc>
-          <w:tcPr>
-            <w:tcW w:type="dxa" w:w="1211"/>
-          </w:tcPr>
-          <w:p>
-            <w:r>
-              <w:rPr/>
-              <w:t>36 UMAs</w:t>
-            </w:r>
-          </w:p>
-        </w:tc>
-        <w:tc>
-          <w:tcPr>
-            <w:tcW w:type="dxa" w:w="1211"/>
-          </w:tcPr>
-          <w:p>
-            <w:r>
-              <w:rPr/>
-              <w:t>~$4,073</w:t>
-            </w:r>
-          </w:p>
-        </w:tc>
-        <w:tc>
-          <w:tcPr>
-            <w:tcW w:type="dxa" w:w="1211"/>
-          </w:tcPr>
-          <w:p>
-            <w:r>
-              <w:rPr/>
-              <w:t>Suspensión de obra hasta que se permita la visita</w:t>
-            </w:r>
-          </w:p>
-        </w:tc>
-      </w:tr>
-      <w:tr>
-        <w:tc>
-          <w:tcPr>
-            <w:tcW w:type="dxa" w:w="1211"/>
-          </w:tcPr>
-          <w:p>
-            <w:r>
-              <w:rPr/>
-              <w:t>20</w:t>
-            </w:r>
-          </w:p>
-        </w:tc>
-        <w:tc>
-          <w:tcPr>
-            <w:tcW w:type="dxa" w:w="1211"/>
-          </w:tcPr>
-          <w:p>
-            <w:r>
-              <w:rPr/>
-              <w:t>Proporcionar información falsa o documentación apócrifa en solicitudes de autorización de obra</w:t>
-            </w:r>
-          </w:p>
-        </w:tc>
-        <w:tc>
-          <w:tcPr>
-            <w:tcW w:type="dxa" w:w="1211"/>
-          </w:tcPr>
-          <w:p>
-            <w:r>
-              <w:rPr/>
-              <w:t>Multa directa</w:t>
-            </w:r>
-          </w:p>
-        </w:tc>
-        <w:tc>
-          <w:tcPr>
-            <w:tcW w:type="dxa" w:w="1211"/>
-          </w:tcPr>
-          <w:p>
-            <w:r>
-              <w:rPr/>
-              <w:t>45 UMAs</w:t>
-            </w:r>
-          </w:p>
-        </w:tc>
-        <w:tc>
-          <w:tcPr>
-            <w:tcW w:type="dxa" w:w="1211"/>
-          </w:tcPr>
-          <w:p>
-            <w:r>
-              <w:rPr/>
-              <w:t>~$5,091</w:t>
-            </w:r>
-          </w:p>
-        </w:tc>
-        <w:tc>
-          <w:tcPr>
-            <w:tcW w:type="dxa" w:w="1211"/>
-          </w:tcPr>
-          <w:p>
-            <w:r>
-              <w:rPr/>
-              <w:t>Revocación de la autorización</w:t>
-            </w:r>
-          </w:p>
-        </w:tc>
-        <w:tc>
-          <w:tcPr>
-            <w:tcW w:type="dxa" w:w="1211"/>
-          </w:tcPr>
-          <w:p>
-            <w:r>
-              <w:rPr/>
-              <w:t>—</w:t>
-            </w:r>
-          </w:p>
-        </w:tc>
-        <w:tc>
-          <w:tcPr>
-            <w:tcW w:type="dxa" w:w="1211"/>
-          </w:tcPr>
-          <w:p>
-            <w:r>
-              <w:rPr/>
-              <w:t>Se da vista al Ministerio Público si la conducta constituye delito</w:t>
-            </w:r>
-          </w:p>
-        </w:tc>
-      </w:tr>
-    </w:tbl>
+    <w:p>
+      <w:pPr>
+        <w:spacing w:after="160"/>
+      </w:pPr>
+      <w:r>
+        <w:rPr/>
+      </w:r>
+      <w:r>
+        <w:rPr>
+          <w:b/>
+        </w:rPr>
+        <w:t>No. 17 – Incumplir condiciones de obra impuestas por el Consejo de Diseño en su resolución escrita</w:t>
+      </w:r>
+      <w:r>
+        <w:rPr/>
+      </w:r>
+    </w:p>
+    <w:p>
+      <w:pPr>
+        <w:pStyle w:val="ListBullet"/>
+      </w:pPr>
+      <w:r>
+        <w:rPr/>
+      </w:r>
+      <w:r>
+        <w:rPr>
+          <w:b/>
+        </w:rPr>
+        <w:t>Llamado / Multa directa:</w:t>
+      </w:r>
+      <w:r>
+        <w:rPr/>
+        <w:t xml:space="preserve"> 1 Llamado de atención</w:t>
+      </w:r>
+    </w:p>
+    <w:p>
+      <w:pPr>
+        <w:pStyle w:val="ListBullet"/>
+      </w:pPr>
+      <w:r>
+        <w:rPr/>
+      </w:r>
+      <w:r>
+        <w:rPr>
+          <w:b/>
+        </w:rPr>
+        <w:t>Monto (UMAs):</w:t>
+      </w:r>
+      <w:r>
+        <w:rPr/>
+        <w:t xml:space="preserve"> 13 UMAs (~$1,471)</w:t>
+      </w:r>
+    </w:p>
+    <w:p>
+      <w:pPr>
+        <w:pStyle w:val="ListBullet"/>
+      </w:pPr>
+      <w:r>
+        <w:rPr/>
+      </w:r>
+      <w:r>
+        <w:rPr>
+          <w:b/>
+        </w:rPr>
+        <w:t>Equiv. aprox. 2025:</w:t>
+      </w:r>
+      <w:r>
+        <w:rPr/>
+        <w:t xml:space="preserve"> 27 UMAs (~$3,055)</w:t>
+      </w:r>
+    </w:p>
+    <w:p>
+      <w:pPr>
+        <w:pStyle w:val="ListBullet"/>
+      </w:pPr>
+      <w:r>
+        <w:rPr/>
+      </w:r>
+      <w:r>
+        <w:rPr>
+          <w:b/>
+        </w:rPr>
+        <w:t>Observación:</w:t>
+      </w:r>
+      <w:r>
+        <w:rPr/>
+        <w:t xml:space="preserve"> El Consejo puede ordenar suspensión de obra hasta verificar el cumplimiento</w:t>
+      </w:r>
+    </w:p>
+    <w:p>
+      <w:pPr>
+        <w:spacing w:after="160"/>
+      </w:pPr>
+      <w:r>
+        <w:rPr/>
+      </w:r>
+      <w:r>
+        <w:rPr>
+          <w:b/>
+        </w:rPr>
+        <w:t>No. 18 – No regularizar obra no autorizada dentro del plazo de 15 días hábiles tras notificación, fuera del período de amnistía</w:t>
+      </w:r>
+      <w:r>
+        <w:rPr/>
+      </w:r>
+    </w:p>
+    <w:p>
+      <w:pPr>
+        <w:pStyle w:val="ListBullet"/>
+      </w:pPr>
+      <w:r>
+        <w:rPr/>
+      </w:r>
+      <w:r>
+        <w:rPr>
+          <w:b/>
+        </w:rPr>
+        <w:t>Llamado / Multa directa:</w:t>
+      </w:r>
+      <w:r>
+        <w:rPr/>
+        <w:t xml:space="preserve"> Multa directa</w:t>
+      </w:r>
+    </w:p>
+    <w:p>
+      <w:pPr>
+        <w:pStyle w:val="ListBullet"/>
+      </w:pPr>
+      <w:r>
+        <w:rPr/>
+      </w:r>
+      <w:r>
+        <w:rPr>
+          <w:b/>
+        </w:rPr>
+        <w:t>Monto (UMAs):</w:t>
+      </w:r>
+      <w:r>
+        <w:rPr/>
+        <w:t xml:space="preserve"> Doble del depósito de garantía de la categoría correspondiente</w:t>
+      </w:r>
+    </w:p>
+    <w:p>
+      <w:pPr>
+        <w:pStyle w:val="ListBullet"/>
+      </w:pPr>
+      <w:r>
+        <w:rPr/>
+      </w:r>
+      <w:r>
+        <w:rPr>
+          <w:b/>
+        </w:rPr>
+        <w:t>Observación:</w:t>
+      </w:r>
+      <w:r>
+        <w:rPr/>
+        <w:t xml:space="preserve"> Acumulable por cada período vencido; el Comité de Representantes puede contratar la restitución con cargo al infractor</w:t>
+      </w:r>
+    </w:p>
+    <w:p>
+      <w:pPr>
+        <w:spacing w:after="160"/>
+      </w:pPr>
+      <w:r>
+        <w:rPr/>
+      </w:r>
+      <w:r>
+        <w:rPr>
+          <w:b/>
+        </w:rPr>
+        <w:t>No. 19 – Obstaculizar o impedir visitas de supervisión del Consejo de Diseño durante obra autorizada de Categoría III</w:t>
+      </w:r>
+      <w:r>
+        <w:rPr/>
+      </w:r>
+    </w:p>
+    <w:p>
+      <w:pPr>
+        <w:pStyle w:val="ListBullet"/>
+      </w:pPr>
+      <w:r>
+        <w:rPr/>
+      </w:r>
+      <w:r>
+        <w:rPr>
+          <w:b/>
+        </w:rPr>
+        <w:t>Llamado / Multa directa:</w:t>
+      </w:r>
+      <w:r>
+        <w:rPr/>
+        <w:t xml:space="preserve"> Multa directa</w:t>
+      </w:r>
+    </w:p>
+    <w:p>
+      <w:pPr>
+        <w:pStyle w:val="ListBullet"/>
+      </w:pPr>
+      <w:r>
+        <w:rPr/>
+      </w:r>
+      <w:r>
+        <w:rPr>
+          <w:b/>
+        </w:rPr>
+        <w:t>Monto (UMAs):</w:t>
+      </w:r>
+      <w:r>
+        <w:rPr/>
+        <w:t xml:space="preserve"> 18 UMAs (~$2,037)</w:t>
+      </w:r>
+    </w:p>
+    <w:p>
+      <w:pPr>
+        <w:pStyle w:val="ListBullet"/>
+      </w:pPr>
+      <w:r>
+        <w:rPr/>
+      </w:r>
+      <w:r>
+        <w:rPr>
+          <w:b/>
+        </w:rPr>
+        <w:t>Equiv. aprox. 2025:</w:t>
+      </w:r>
+      <w:r>
+        <w:rPr/>
+        <w:t xml:space="preserve"> 36 UMAs (~$4,073)</w:t>
+      </w:r>
+    </w:p>
+    <w:p>
+      <w:pPr>
+        <w:pStyle w:val="ListBullet"/>
+      </w:pPr>
+      <w:r>
+        <w:rPr/>
+      </w:r>
+      <w:r>
+        <w:rPr>
+          <w:b/>
+        </w:rPr>
+        <w:t>Observación:</w:t>
+      </w:r>
+      <w:r>
+        <w:rPr/>
+        <w:t xml:space="preserve"> Suspensión de obra hasta que se permita la visita</w:t>
+      </w:r>
+    </w:p>
+    <w:p>
+      <w:pPr>
+        <w:spacing w:after="160"/>
+      </w:pPr>
+      <w:r>
+        <w:rPr/>
+      </w:r>
+      <w:r>
+        <w:rPr>
+          <w:b/>
+        </w:rPr>
+        <w:t>No. 20 – Proporcionar información falsa o documentación apócrifa en solicitudes de autorización de obra</w:t>
+      </w:r>
+      <w:r>
+        <w:rPr/>
+      </w:r>
+    </w:p>
+    <w:p>
+      <w:pPr>
+        <w:pStyle w:val="ListBullet"/>
+      </w:pPr>
+      <w:r>
+        <w:rPr/>
+      </w:r>
+      <w:r>
+        <w:rPr>
+          <w:b/>
+        </w:rPr>
+        <w:t>Llamado / Multa directa:</w:t>
+      </w:r>
+      <w:r>
+        <w:rPr/>
+        <w:t xml:space="preserve"> Multa directa</w:t>
+      </w:r>
+    </w:p>
+    <w:p>
+      <w:pPr>
+        <w:pStyle w:val="ListBullet"/>
+      </w:pPr>
+      <w:r>
+        <w:rPr/>
+      </w:r>
+      <w:r>
+        <w:rPr>
+          <w:b/>
+        </w:rPr>
+        <w:t>Monto (UMAs):</w:t>
+      </w:r>
+      <w:r>
+        <w:rPr/>
+        <w:t xml:space="preserve"> 45 UMAs (~$5,091)</w:t>
+      </w:r>
+    </w:p>
+    <w:p>
+      <w:pPr>
+        <w:pStyle w:val="ListBullet"/>
+      </w:pPr>
+      <w:r>
+        <w:rPr/>
+      </w:r>
+      <w:r>
+        <w:rPr>
+          <w:b/>
+        </w:rPr>
+        <w:t>Observación:</w:t>
+      </w:r>
+      <w:r>
+        <w:rPr/>
+        <w:t xml:space="preserve"> Revocación de la autorización; se da vista al Ministerio Público si la conducta constituye delito</w:t>
+      </w:r>
+    </w:p>
     <w:p>
       <w:pPr>
         <w:pBdr>
-          <w:bottom w:val="single" w:sz="6" w:space="1" w:color="AAAAAA"/>
+          <w:bottom w:val="single" w:sz="6" w:space="1" w:color="E2E8F0"/>
         </w:pBdr>
       </w:pPr>
     </w:p>
@@ -25523,7 +25235,7 @@
     <w:p>
       <w:pPr>
         <w:pBdr>
-          <w:bottom w:val="single" w:sz="6" w:space="1" w:color="AAAAAA"/>
+          <w:bottom w:val="single" w:sz="6" w:space="1" w:color="E2E8F0"/>
         </w:pBdr>
       </w:pPr>
     </w:p>
@@ -25582,7 +25294,7 @@
     <w:p>
       <w:pPr>
         <w:pBdr>
-          <w:bottom w:val="single" w:sz="6" w:space="1" w:color="AAAAAA"/>
+          <w:bottom w:val="single" w:sz="6" w:space="1" w:color="E2E8F0"/>
         </w:pBdr>
       </w:pPr>
     </w:p>
@@ -25622,7 +25334,7 @@
     <w:p>
       <w:pPr>
         <w:pBdr>
-          <w:bottom w:val="single" w:sz="6" w:space="1" w:color="AAAAAA"/>
+          <w:bottom w:val="single" w:sz="6" w:space="1" w:color="E2E8F0"/>
         </w:pBdr>
       </w:pPr>
     </w:p>
@@ -25638,9 +25350,14 @@
       </w:r>
     </w:p>
     <w:p>
+      <w:r>
+        <w:br w:type="page"/>
+      </w:r>
+    </w:p>
+    <w:p>
       <w:pPr>
         <w:pBdr>
-          <w:bottom w:val="single" w:sz="6" w:space="1" w:color="AAAAAA"/>
+          <w:bottom w:val="single" w:sz="6" w:space="1" w:color="E2E8F0"/>
         </w:pBdr>
       </w:pPr>
     </w:p>
@@ -25703,6 +25420,9 @@
     <w:p>
       <w:pPr>
         <w:ind w:left="720"/>
+        <w:pBdr>
+          <w:left w:val="single" w:sz="12" w:space="8" w:color="E2E8F0"/>
+        </w:pBdr>
       </w:pPr>
       <w:r>
         <w:rPr>
@@ -26445,14 +26165,19 @@
     <w:p>
       <w:pPr>
         <w:pBdr>
-          <w:bottom w:val="single" w:sz="6" w:space="1" w:color="AAAAAA"/>
+          <w:bottom w:val="single" w:sz="6" w:space="1" w:color="E2E8F0"/>
         </w:pBdr>
       </w:pPr>
     </w:p>
     <w:p>
+      <w:r>
+        <w:br w:type="page"/>
+      </w:r>
+    </w:p>
+    <w:p>
       <w:pPr>
         <w:pBdr>
-          <w:bottom w:val="single" w:sz="6" w:space="1" w:color="AAAAAA"/>
+          <w:bottom w:val="single" w:sz="6" w:space="1" w:color="E2E8F0"/>
         </w:pBdr>
       </w:pPr>
     </w:p>
@@ -27606,14 +27331,19 @@
     <w:p>
       <w:pPr>
         <w:pBdr>
-          <w:bottom w:val="single" w:sz="6" w:space="1" w:color="AAAAAA"/>
+          <w:bottom w:val="single" w:sz="6" w:space="1" w:color="E2E8F0"/>
         </w:pBdr>
       </w:pPr>
     </w:p>
     <w:p>
+      <w:r>
+        <w:br w:type="page"/>
+      </w:r>
+    </w:p>
+    <w:p>
       <w:pPr>
         <w:pBdr>
-          <w:bottom w:val="single" w:sz="6" w:space="1" w:color="AAAAAA"/>
+          <w:bottom w:val="single" w:sz="6" w:space="1" w:color="E2E8F0"/>
         </w:pBdr>
       </w:pPr>
     </w:p>
@@ -27915,9 +27645,14 @@
     <w:p>
       <w:pPr>
         <w:pBdr>
-          <w:bottom w:val="single" w:sz="6" w:space="1" w:color="AAAAAA"/>
+          <w:bottom w:val="single" w:sz="6" w:space="1" w:color="E2E8F0"/>
         </w:pBdr>
       </w:pPr>
+    </w:p>
+    <w:p>
+      <w:r>
+        <w:br w:type="page"/>
+      </w:r>
     </w:p>
     <w:sectPr>
       <w:headerReference w:type="default" r:id="rId9"/>
@@ -27940,7 +27675,7 @@
     </w:pPr>
     <w:r>
       <w:rPr>
-        <w:color w:val="888888"/>
+        <w:color w:val="7A8796"/>
         <w:sz w:val="16"/>
       </w:rPr>
       <w:fldChar w:fldCharType="begin"/>
@@ -27949,14 +27684,14 @@
     </w:r>
     <w:r>
       <w:rPr>
-        <w:color w:val="888888"/>
+        <w:color w:val="7A8796"/>
         <w:sz w:val="16"/>
       </w:rPr>
       <w:t xml:space="preserve"> / </w:t>
     </w:r>
     <w:r>
       <w:rPr>
-        <w:color w:val="888888"/>
+        <w:color w:val="7A8796"/>
         <w:sz w:val="16"/>
       </w:rPr>
       <w:fldChar w:fldCharType="begin"/>
@@ -27977,12 +27712,12 @@
         <w:tab w:val="right" w:pos="9354"/>
       </w:tabs>
       <w:pBdr>
-        <w:bottom w:val="single" w:sz="4" w:space="1" w:color="DDDDDD"/>
+        <w:bottom w:val="single" w:sz="4" w:space="1" w:color="E2E8F0"/>
       </w:pBdr>
     </w:pPr>
     <w:r>
       <w:rPr>
-        <w:color w:val="888888"/>
+        <w:color w:val="7A8796"/>
         <w:sz w:val="16"/>
       </w:rPr>
       <w:t>Daniel Chávez Flores</w:t>
@@ -27993,7 +27728,7 @@
     <w:r>
       <w:rPr>
         <w:i/>
-        <w:color w:val="888888"/>
+        <w:color w:val="7A8796"/>
         <w:sz w:val="16"/>
       </w:rPr>
       <w:t>Fraccionamiento Sole — El Toro</w:t>

</xml_diff>

<commit_message>
Ajustes finales del documento
</commit_message>
<xml_diff>
--- a/output/Propuesta.docx
+++ b/output/Propuesta.docx
@@ -14,7 +14,7 @@
           <w:color w:val="1B2C3E"/>
           <w:sz w:val="48"/>
         </w:rPr>
-        <w:t>Control Arquitectónico Obligatorio y Manual de Imagen Urbana</w:t>
+        <w:t>Control Arquitectónico Transparente y Manual de Imagen Urbana</w:t>
       </w:r>
     </w:p>
     <w:p>
@@ -345,7 +345,7 @@
       </w:pPr>
       <w:r>
         <w:rPr/>
-        <w:t>Explica por qué la imagen del fraccionamiento tiene valor económico concreto, qué problema específico tiene el Reglamento actual, y resume en una página las cinco propuestas de cambio con su situación actual y el resultado esperado de cada una.</w:t>
+        <w:t>Explica por qué la imagen del fraccionamiento tiene valor económico concreto, qué problema específico tiene el Reglamento actual, y resume en una página las cinco propuestas de cambio con su situación actual y el resultado esperado de cada una. También aclara desde el inicio qué cosas no cambia esta propuesta: no se mete con interiores, no convierte todo en trámite y no aprueba cobros discrecionales.</w:t>
       </w:r>
     </w:p>
     <w:p>
@@ -404,7 +404,7 @@
       </w:pPr>
       <w:r>
         <w:rPr/>
-        <w:t>Cubre el sustento en la Ley de Condominio del Estado de SLP y el Código Civil Federal, el detalle de cada uno de los tres pilares del sistema (Consejo, Manual, clasificación de obras), los beneficios documentados con fuentes verificables, ejemplos numéricos de casos reales como obras ya existentes sin autorización o compraventas con historial incompleto, y respuestas a las 14 preguntas más frecuentes.</w:t>
+        <w:t>Cubre el sustento en la Ley de Condominio del Estado de SLP y el Código Civil Federal, el detalle de cada uno de los tres pilares del sistema (Consejo, Manual, clasificación de obras), los beneficios documentados con fuentes verificables, ejemplos numéricos de casos reales como obras ya existentes sin autorización o compraventas con historial incompleto, y respuestas a las preguntas más frecuentes.</w:t>
       </w:r>
     </w:p>
     <w:p>
@@ -1362,7 +1362,7 @@
       </w:pPr>
       <w:r>
         <w:rPr/>
-        <w:t>La promesa del régimen de condominio es real. Pero una promesa necesita mecanismos para cumplirse.</w:t>
+        <w:t>La promesa del régimen de condominio es real. Pero una promesa necesita mecanismos para cumplirse, y esos mecanismos deben sentirse justos para el vecino común: claros, rápidos, proporcionales y sin cobros escondidos.</w:t>
       </w:r>
     </w:p>
     <w:p>
@@ -1390,6 +1390,15 @@
       <w:r>
         <w:rPr/>
         <w:t>Esta propuesta busca completar ese trabajo. No reescribir las reglas, sino darles los instrumentos que necesitan para funcionar: un Consejo formalmente constituido, un Manual de criterios claros y verificables, y un proceso proporcional que haga fácil hacer las cosas bien.</w:t>
+      </w:r>
+    </w:p>
+    <w:p>
+      <w:pPr>
+        <w:spacing w:after="160"/>
+      </w:pPr>
+      <w:r>
+        <w:rPr/>
+        <w:t>También busca evitar tres problemas que todos conocemos en la vida condominal: que una decisión dependa de quién está de turno, que una obra de un particular termine costándole a todos, y que una regla poco clara se convierta en pleito entre vecinos.</w:t>
       </w:r>
     </w:p>
     <w:p>
@@ -1481,6 +1490,15 @@
         <w:spacing w:after="160"/>
       </w:pPr>
       <w:r>
+        <w:rPr/>
+        <w:t>En términos prácticos: dentro de tu casa, libertad; en fachadas, estructura y elementos visibles, reglas claras para proteger el valor común. La propuesta no está diseñada para perseguir vecinos ni para cargar de trámites la vida diaria. Está diseñada para que todos sepamos de antemano qué se puede hacer, cuánto tarda la respuesta, cuánto cuesta y cómo se devuelve cualquier depósito.</w:t>
+      </w:r>
+    </w:p>
+    <w:p>
+      <w:pPr>
+        <w:spacing w:after="160"/>
+      </w:pPr>
+      <w:r>
         <w:rPr>
           <w:i/>
         </w:rPr>
@@ -1586,6 +1604,24 @@
       <w:r>
         <w:rPr/>
         <w:t xml:space="preserve"> las resoluciones del Consejo adquieren plena validez legal y cualquier vecino puede confiar en el proceso.</w:t>
+      </w:r>
+    </w:p>
+    <w:p>
+      <w:pPr>
+        <w:spacing w:after="160"/>
+      </w:pPr>
+      <w:r>
+        <w:rPr/>
+      </w:r>
+      <w:r>
+        <w:rPr>
+          <w:b/>
+        </w:rPr>
+        <w:t>Garantía de confianza:</w:t>
+      </w:r>
+      <w:r>
+        <w:rPr/>
+        <w:t xml:space="preserve"> el Consejo no sustituye a la Administración ni concentra poder absoluto. Resuelve con base en reglas escritas, plazos definidos y obligación de fundamentar cada decisión.</w:t>
       </w:r>
     </w:p>
     <w:p>
@@ -1935,16 +1971,7 @@
           <w:p>
             <w:r>
               <w:rPr/>
-              <w:t xml:space="preserve">DRO + autorización del Consejo + permisos municipales · </w:t>
-            </w:r>
-            <w:r>
-              <w:rPr>
-                <w:b/>
-              </w:rPr>
-              <w:t>sin aprobación tácita</w:t>
-            </w:r>
-            <w:r>
-              <w:rPr/>
+              <w:t>DRO + autorización del Consejo + permisos municipales · aprobación tácita limitada tras 15 días hábiles, requerimiento formal y 48 horas adicionales de silencio, sin sustituir revisiones de seguridad del DRO</w:t>
             </w:r>
           </w:p>
         </w:tc>
@@ -1955,17 +1982,7 @@
           <w:p>
             <w:r>
               <w:rPr/>
-              <w:t xml:space="preserve">$1,500 cuota + </w:t>
-            </w:r>
-            <w:r>
-              <w:rPr>
-                <w:b/>
-              </w:rPr>
-              <w:t>15% del presupuesto</w:t>
-            </w:r>
-            <w:r>
-              <w:rPr/>
-              <w:t xml:space="preserve"> (mín. $10,000) depósito reembolsable</w:t>
+              <w:t>$1,500 cuota + depósito reembolsable indexado en UMAs según complejidad, con tope por subcategoría</w:t>
             </w:r>
           </w:p>
         </w:tc>
@@ -1991,6 +2008,24 @@
     </w:p>
     <w:p>
       <w:pPr>
+        <w:spacing w:after="160"/>
+      </w:pPr>
+      <w:r>
+        <w:rPr/>
+      </w:r>
+      <w:r>
+        <w:rPr>
+          <w:b/>
+        </w:rPr>
+        <w:t>Lectura sencilla:</w:t>
+      </w:r>
+      <w:r>
+        <w:rPr/>
+        <w:t xml:space="preserve"> no todo pasa por Consejo. El mantenimiento interior sigue siendo libre. Lo que se ordena es lo que se ve desde afuera, afecta estructura o puede dañar áreas comunes.</w:t>
+      </w:r>
+    </w:p>
+    <w:p>
+      <w:pPr>
         <w:pStyle w:val="Heading4"/>
         <w:spacing w:before="240" w:after="120"/>
       </w:pPr>
@@ -2053,7 +2088,7 @@
       </w:r>
       <w:r>
         <w:rPr/>
-        <w:t xml:space="preserve"> el comprador sabe exactamente qué adquiere; el vendedor tiene incentivo para estar en regla antes de vender.</w:t>
+        <w:t xml:space="preserve"> el comprador sabe exactamente qué adquiere; el vendedor tiene incentivo para estar en regla antes de vender. Para el propietario actual, el historial deja de ser una amenaza y se convierte en respaldo documental.</w:t>
       </w:r>
     </w:p>
     <w:p>
@@ -2102,7 +2137,7 @@
       </w:r>
       <w:r>
         <w:rPr/>
-        <w:t xml:space="preserve"> obras sin autorización quedan sujetas a obligación de restitución. Período de amnistía de </w:t>
+        <w:t xml:space="preserve"> obras sin autorización quedan sujetas a obligación de restitución cuando no puedan integrarse al Manual o incumplan restricciones vigentes. Período de amnistía de </w:t>
       </w:r>
       <w:r>
         <w:rPr>
@@ -2141,6 +2176,24 @@
       <w:r>
         <w:rPr/>
         <w:t xml:space="preserve"> cumplir con el proceso es, en todos los casos, la opción que mejor protege el patrimonio propio.</w:t>
+      </w:r>
+    </w:p>
+    <w:p>
+      <w:pPr>
+        <w:spacing w:after="160"/>
+      </w:pPr>
+      <w:r>
+        <w:rPr/>
+      </w:r>
+      <w:r>
+        <w:rPr>
+          <w:b/>
+        </w:rPr>
+        <w:t>Mensaje clave:</w:t>
+      </w:r>
+      <w:r>
+        <w:rPr/>
+        <w:t xml:space="preserve"> el sistema no viene a perseguir el pasado; viene a ordenar el futuro. Quien actuó de buena fe tiene una vía para documentar su situación y reducir riesgos al vender, heredar o tramitar crédito.</w:t>
       </w:r>
     </w:p>
     <w:p>
@@ -2600,6 +2653,15 @@
       </w:pPr>
       <w:r>
         <w:rPr/>
+        <w:t>El enfoque no es volver más pesada la vida cotidiana del fraccionamiento. Al contrario: separar lo simple de lo delicado. Pintar interiores, mantenimiento normal y mejoras que no afectan fachada ni estructura no deben convertirse en pleito. Lo que sí necesita reglas claras es aquello que se ve desde la calle, modifica la estructura, afecta áreas comunes o puede cambiar la percepción de valor del conjunto.</w:t>
+      </w:r>
+    </w:p>
+    <w:p>
+      <w:pPr>
+        <w:spacing w:after="160"/>
+      </w:pPr>
+      <w:r>
+        <w:rPr/>
         <w:t>El capítulo desarrolla cada componente en detalle: la base legal que respalda el sistema, las reglas del Consejo, el proceso de revisión y apelación, el contenido técnico del Manual, los mecanismos para situaciones preexistentes, el plan de implementación y la evidencia de por qué este tipo de gobernanza protege la plusvalía del conjunto. Al final, se aborda la situación particular del desarrollador HABI (PROMOCIONES HABI, S.A. de C.V.) y se incluye una nota sobre el propósito de la propuesta y los canales de participación.</w:t>
       </w:r>
     </w:p>
@@ -2681,6 +2743,15 @@
       <w:r>
         <w:rPr/>
         <w:t>Cuando la minuta sea publicada conforme a lo establecido, se revisará su contenido y se realizarán los ajustes que correspondan a esta propuesta.</w:t>
+      </w:r>
+    </w:p>
+    <w:p>
+      <w:pPr>
+        <w:spacing w:after="160"/>
+      </w:pPr>
+      <w:r>
+        <w:rPr/>
+        <w:t>Este capítulo debe leerse con una idea central: reglas claras protegen a todos, incluyendo a quien quiere construir. Un sistema predecible evita permisos de palabra, decisiones personales, depósitos sin claridad y discusiones innecesarias entre vecinos.</w:t>
       </w:r>
     </w:p>
     <w:p>
@@ -4237,7 +4308,7 @@
       </w:pPr>
       <w:r>
         <w:rPr/>
-        <w:t xml:space="preserve">Una negativa sin fundamento escrito dentro del plazo se considera </w:t>
+        <w:t xml:space="preserve">Para Obra Mediana, una negativa sin fundamento escrito dentro del plazo se considera </w:t>
       </w:r>
       <w:r>
         <w:rPr>
@@ -4248,6 +4319,24 @@
       <w:r>
         <w:rPr/>
         <w:t>.</w:t>
+      </w:r>
+    </w:p>
+    <w:p>
+      <w:pPr>
+        <w:pStyle w:val="ListBullet"/>
+      </w:pPr>
+      <w:r>
+        <w:rPr/>
+        <w:t>Para Obra Grande, el Consejo tendrá 15 días hábiles para resolver. Si transcurrido el plazo no hay respuesta, el condómino podrá requerir formalmente el inicio, y si en 48 horas adicionales persiste el silencio, operará la aprobación tácita, quedando a salvo las revisiones de seguridad del DRO.</w:t>
+      </w:r>
+    </w:p>
+    <w:p>
+      <w:pPr>
+        <w:spacing w:after="160"/>
+      </w:pPr>
+      <w:r>
+        <w:rPr/>
+        <w:t>Estas reglas buscan quitar presión tanto al vecino como a la Administración. El Consejo no debe operar como un grupo de gustos personales, sino como una mesa que aplica criterios aprobados por Asamblea. Si el criterio está escrito, el vecino sabe a qué atenerse y la Administración deja de cargar sola con discusiones estéticas.</w:t>
       </w:r>
     </w:p>
     <w:p>
@@ -4416,7 +4505,7 @@
           <w:p>
             <w:r>
               <w:rPr/>
-              <w:t>15 días hábiles — sin aprobación tácita</w:t>
+              <w:t>15 días hábiles + requerimiento formal y 48 horas adicionales para aprobación tácita limitada</w:t>
             </w:r>
           </w:p>
         </w:tc>
@@ -4764,6 +4853,15 @@
     </w:p>
     <w:p>
       <w:pPr>
+        <w:spacing w:after="160"/>
+      </w:pPr>
+      <w:r>
+        <w:rPr/>
+        <w:t>En lenguaje simple: el Consejo no es una policía de fachadas. Es una instancia técnica con límites. No cobra directamente, no entra a casas, no inventa reglas y no puede sustituir lo que apruebe la Asamblea.</w:t>
+      </w:r>
+    </w:p>
+    <w:p>
+      <w:pPr>
         <w:pStyle w:val="Heading3"/>
         <w:spacing w:before="300" w:after="120"/>
       </w:pPr>
@@ -4982,6 +5080,15 @@
       </w:pPr>
       <w:r>
         <w:rPr/>
+        <w:t>La clasificación está pensada para evitar burocracia innecesaria. No todo cambio en una casa merece el mismo nivel de revisión: una cosa es pintar una recámara y otra agregar un volumen visible desde la calle o modificar estructura.</w:t>
+      </w:r>
+    </w:p>
+    <w:p>
+      <w:pPr>
+        <w:spacing w:after="160"/>
+      </w:pPr>
+      <w:r>
+        <w:rPr/>
       </w:r>
       <w:r>
         <w:rPr>
@@ -5079,6 +5186,24 @@
       </w:r>
       <w:r>
         <w:rPr/>
+      </w:r>
+    </w:p>
+    <w:p>
+      <w:pPr>
+        <w:spacing w:after="160"/>
+      </w:pPr>
+      <w:r>
+        <w:rPr/>
+      </w:r>
+      <w:r>
+        <w:rPr>
+          <w:b/>
+        </w:rPr>
+        <w:t>Mensaje práctico:</w:t>
+      </w:r>
+      <w:r>
+        <w:rPr/>
+        <w:t xml:space="preserve"> si la obra no se ve desde afuera, no cambia estructura y no afecta superficie construida, el sistema no debe estorbar.</w:t>
       </w:r>
     </w:p>
     <w:p>
@@ -5204,6 +5329,24 @@
     </w:p>
     <w:p>
       <w:pPr>
+        <w:spacing w:after="160"/>
+      </w:pPr>
+      <w:r>
+        <w:rPr/>
+      </w:r>
+      <w:r>
+        <w:rPr>
+          <w:b/>
+        </w:rPr>
+        <w:t>Mensaje práctico:</w:t>
+      </w:r>
+      <w:r>
+        <w:rPr/>
+        <w:t xml:space="preserve"> la cuota paga la revisión; el depósito no es ingreso del condominio, es garantía reembolsable para asegurar que la obra cierre correctamente.</w:t>
+      </w:r>
+    </w:p>
+    <w:p>
+      <w:pPr>
         <w:pBdr>
           <w:bottom w:val="single" w:sz="6" w:space="1" w:color="E2E8F0"/>
         </w:pBdr>
@@ -5264,11 +5407,11 @@
         <w:rPr>
           <w:b/>
         </w:rPr>
-        <w:t>No hay aprobación automática</w:t>
-      </w:r>
-      <w:r>
-        <w:rPr/>
-        <w:t xml:space="preserve"> por silencio del Consejo en esta categoría</w:t>
+        <w:t>Plazo:</w:t>
+      </w:r>
+      <w:r>
+        <w:rPr/>
+        <w:t xml:space="preserve"> Para Obra Grande, el Consejo tendrá 15 días hábiles para resolver. Si transcurrido el plazo no hay respuesta, el condómino podrá requerir formalmente el inicio, y si en 48 horas adicionales persiste el silencio, operará la aprobación tácita, quedando a salvo las revisiones de seguridad del DRO.</w:t>
       </w:r>
     </w:p>
     <w:p>
@@ -5286,23 +5429,31 @@
       </w:r>
       <w:r>
         <w:rPr/>
-        <w:t xml:space="preserve"> $1,500 cuota + </w:t>
-      </w:r>
-      <w:r>
-        <w:rPr>
-          <w:b/>
-        </w:rPr>
-        <w:t>15% del presupuesto</w:t>
-      </w:r>
-      <w:r>
-        <w:rPr/>
-        <w:t xml:space="preserve"> (mín. $10,000) como depósito reembolsable al concluir satisfactoriamente </w:t>
+        <w:t xml:space="preserve"> $1,500 cuota + depósito reembolsable indexado en UMAs según complejidad: hasta 40 UMAs para intervenciones exteriores simples como techar cochera o agregar pérgola ligera; hasta 85 UMAs para ampliaciones parciales o nuevos volúmenes sin cambio de nivel; hasta 150 UMAs para planta completa, segundo nivel, modificación estructural mayor o intervención que incremente de forma sustancial la superficie construida. Depósito en garantía totalmente reembolsable, administrado bajo cuenta transparente y devuelto en un plazo máximo de 5 días posteriores a la liberación de la obra. </w:t>
       </w:r>
       <w:r>
         <w:rPr>
           <w:i/>
         </w:rPr>
-        <w:t>(montos en pesos conforme al Artículo C; independientes de la multa por inicio sin autorización del Catálogo de Multas)</w:t>
+        <w:t>(Montos conforme al Artículo C; independientes de la multa por inicio sin autorización del Catálogo de Multas.)</w:t>
+      </w:r>
+    </w:p>
+    <w:p>
+      <w:pPr>
+        <w:spacing w:after="160"/>
+      </w:pPr>
+      <w:r>
+        <w:rPr/>
+      </w:r>
+      <w:r>
+        <w:rPr>
+          <w:b/>
+        </w:rPr>
+        <w:t>Mensaje práctico:</w:t>
+      </w:r>
+      <w:r>
+        <w:rPr/>
+        <w:t xml:space="preserve"> una cochera techada no debe tratarse igual que una planta completa. Por eso el depósito tiene tope por complejidad y devolución obligatoria.</w:t>
       </w:r>
     </w:p>
     <w:p>
@@ -5856,7 +6007,7 @@
       </w:r>
       <w:r>
         <w:rPr/>
-        <w:t xml:space="preserve"> (15% del presupuesto, mínimo $10,000). Si no atiende la notificación en el plazo establecido, el Comité puede contratar los trabajos de restitución y recuperar el costo del propietario responsable. Seguir el proceso desde el principio es, en todos los casos, la opción que mejor protege el patrimonio propio.</w:t>
+        <w:t xml:space="preserve"> indexado en UMAs según la complejidad de la obra. Si no atiende la notificación en el plazo establecido, el Comité puede contratar los trabajos de restitución y recuperar el costo del propietario responsable. Seguir el proceso desde el principio es, en todos los casos, la opción que mejor protege el patrimonio propio.</w:t>
       </w:r>
     </w:p>
     <w:p>
@@ -7043,6 +7194,15 @@
     </w:p>
     <w:p>
       <w:pPr>
+        <w:spacing w:after="160"/>
+      </w:pPr>
+      <w:r>
+        <w:rPr/>
+        <w:t>La intención es evitar que el arranque del sistema se viva como amenaza. Un fraccionamiento que quiere ordenar su futuro necesita reconocer que muchas decisiones pasadas ocurrieron en un contexto poco claro, sin Manual, sin formatos y sin una ruta sencilla para documentar obras.</w:t>
+      </w:r>
+    </w:p>
+    <w:p>
+      <w:pPr>
         <w:pBdr>
           <w:left w:val="single" w:sz="20" w:space="8" w:color="DD6B20"/>
         </w:pBdr>
@@ -7095,6 +7255,15 @@
       <w:r>
         <w:rPr/>
         <w:t>: si tu obra cumple visualmente con los criterios del Manual, queda certificada sin multa y sin costo de regularización. No se te puede exigir cumplir una regla que no existía cuando actuaste.</w:t>
+      </w:r>
+    </w:p>
+    <w:p>
+      <w:pPr>
+        <w:spacing w:after="160"/>
+      </w:pPr>
+      <w:r>
+        <w:rPr/>
+        <w:t>En términos prácticos: regularizar no es confesarse culpable. Es dejar tu expediente ordenado para vender, heredar o acreditar la seguridad de lo que ya existe.</w:t>
       </w:r>
     </w:p>
     <w:tbl>
@@ -7509,7 +7678,7 @@
           <w:p>
             <w:r>
               <w:rPr/>
-              <w:t>Depósito en garantía (15% del presupuesto)</w:t>
+              <w:t>Depósito en garantía indexado por complejidad (hasta 150 UMAs para ampliación mayor)</w:t>
             </w:r>
           </w:p>
         </w:tc>
@@ -7520,7 +7689,7 @@
           <w:p>
             <w:r>
               <w:rPr/>
-              <w:t>$22,500 MXN</w:t>
+              <w:t>~$17,597 MXN</w:t>
             </w:r>
           </w:p>
         </w:tc>
@@ -7531,7 +7700,7 @@
           <w:p>
             <w:r>
               <w:rPr/>
-              <w:t>$22,500 MXN</w:t>
+              <w:t>~$17,597 MXN</w:t>
             </w:r>
           </w:p>
         </w:tc>
@@ -7555,7 +7724,7 @@
           <w:p>
             <w:r>
               <w:rPr/>
-              <w:t>$45,000 MXN</w:t>
+              <w:t>~$35,194 MXN</w:t>
             </w:r>
           </w:p>
         </w:tc>
@@ -7566,7 +7735,7 @@
           <w:p>
             <w:r>
               <w:rPr/>
-              <w:t>$22,500 MXN</w:t>
+              <w:t>~$17,597 MXN</w:t>
             </w:r>
           </w:p>
         </w:tc>
@@ -7603,7 +7772,7 @@
               <w:rPr>
                 <w:b/>
               </w:rPr>
-              <w:t>~$79,323 MXN</w:t>
+              <w:t>~$64,614 MXN</w:t>
             </w:r>
             <w:r>
               <w:rPr/>
@@ -7622,7 +7791,7 @@
               <w:rPr>
                 <w:b/>
               </w:rPr>
-              <w:t>~$51,662 MXN</w:t>
+              <w:t>~$41,856 MXN</w:t>
             </w:r>
             <w:r>
               <w:rPr/>
@@ -7663,7 +7832,7 @@
       </w:r>
       <w:r>
         <w:rPr/>
-        <w:t>, la multa del Catálogo y la multa de regularización aplican sin descuento. El ahorro por actuar durante el período de amnistía en este ejemplo es de aproximadamente $27,661 MXN.</w:t>
+        <w:t>, la multa del Catálogo y la multa de regularización aplican sin descuento. El ahorro por actuar durante el período de amnistía en este ejemplo es de aproximadamente $22,758 MXN.</w:t>
       </w:r>
     </w:p>
     <w:p>
@@ -8892,7 +9061,120 @@
           <w:color w:val="3D5168"/>
           <w:sz w:val="28"/>
         </w:rPr>
-        <w:t>8.6 Carga operativa estimada para el Administrador</w:t>
+        <w:t>8.6 Compromisos anti-burocracia y transparencia</w:t>
+      </w:r>
+    </w:p>
+    <w:p>
+      <w:pPr>
+        <w:spacing w:after="160"/>
+      </w:pPr>
+      <w:r>
+        <w:rPr/>
+        <w:t>Para que el sistema funcione, debe ser fácil cumplirlo. Por eso la operación se sujeta a cinco compromisos:</w:t>
+      </w:r>
+    </w:p>
+    <w:p>
+      <w:pPr>
+        <w:pStyle w:val="ListNumber"/>
+      </w:pPr>
+      <w:r>
+        <w:rPr/>
+      </w:r>
+      <w:r>
+        <w:rPr>
+          <w:b/>
+        </w:rPr>
+        <w:t>Trámite proporcional:</w:t>
+      </w:r>
+      <w:r>
+        <w:rPr/>
+        <w:t xml:space="preserve"> Obra Pequeña no pasa por Consejo y no genera cuota ni depósito.</w:t>
+      </w:r>
+    </w:p>
+    <w:p>
+      <w:pPr>
+        <w:pStyle w:val="ListNumber"/>
+      </w:pPr>
+      <w:r>
+        <w:rPr/>
+      </w:r>
+      <w:r>
+        <w:rPr>
+          <w:b/>
+        </w:rPr>
+        <w:t>Plazos verificables:</w:t>
+      </w:r>
+      <w:r>
+        <w:rPr/>
+        <w:t xml:space="preserve"> toda solicitud tiene fecha de recepción y fecha límite de respuesta.</w:t>
+      </w:r>
+    </w:p>
+    <w:p>
+      <w:pPr>
+        <w:pStyle w:val="ListNumber"/>
+      </w:pPr>
+      <w:r>
+        <w:rPr/>
+      </w:r>
+      <w:r>
+        <w:rPr>
+          <w:b/>
+        </w:rPr>
+        <w:t>Depósitos separados y rastreables:</w:t>
+      </w:r>
+      <w:r>
+        <w:rPr/>
+        <w:t xml:space="preserve"> los depósitos en garantía se administran en cuenta transparente, no se mezclan con ingresos ordinarios y se devuelven conforme al plazo aprobado.</w:t>
+      </w:r>
+    </w:p>
+    <w:p>
+      <w:pPr>
+        <w:pStyle w:val="ListNumber"/>
+      </w:pPr>
+      <w:r>
+        <w:rPr/>
+      </w:r>
+      <w:r>
+        <w:rPr>
+          <w:b/>
+        </w:rPr>
+        <w:t>Respuestas por escrito:</w:t>
+      </w:r>
+      <w:r>
+        <w:rPr/>
+        <w:t xml:space="preserve"> no hay autorizaciones ni rechazos de palabra.</w:t>
+      </w:r>
+    </w:p>
+    <w:p>
+      <w:pPr>
+        <w:pStyle w:val="ListNumber"/>
+      </w:pPr>
+      <w:r>
+        <w:rPr/>
+      </w:r>
+      <w:r>
+        <w:rPr>
+          <w:b/>
+        </w:rPr>
+        <w:t>Derecho a corregir:</w:t>
+      </w:r>
+      <w:r>
+        <w:rPr/>
+        <w:t xml:space="preserve"> cuando una solicitud esté incompleta o una obra pueda adecuarse, se debe indicar qué falta antes de escalar el conflicto.</w:t>
+      </w:r>
+    </w:p>
+    <w:p>
+      <w:pPr>
+        <w:pStyle w:val="Heading3"/>
+        <w:spacing w:before="300" w:after="120"/>
+      </w:pPr>
+      <w:r>
+        <w:rPr>
+          <w:b/>
+          <w:color w:val="3D5168"/>
+          <w:sz w:val="28"/>
+        </w:rPr>
+        <w:t>8.7 Carga operativa estimada para el Administrador</w:t>
       </w:r>
     </w:p>
     <w:tbl>
@@ -9250,7 +9532,7 @@
           <w:color w:val="3D5168"/>
           <w:sz w:val="28"/>
         </w:rPr>
-        <w:t>8.7 Lista de DROs disponibles</w:t>
+        <w:t>8.8 Lista de DROs disponibles</w:t>
       </w:r>
     </w:p>
     <w:p>
@@ -9283,7 +9565,7 @@
           <w:color w:val="3D5168"/>
           <w:sz w:val="28"/>
         </w:rPr>
-        <w:t>8.8 La Constancia de Estado de Modificaciones — alcance actual</w:t>
+        <w:t>8.9 La Constancia de Estado de Modificaciones — alcance actual</w:t>
       </w:r>
     </w:p>
     <w:p>
@@ -10108,7 +10390,16 @@
       </w:pPr>
       <w:r>
         <w:rPr/>
-        <w:t>Estoy disponible para responder preguntas, recibir propuestas de modificación y trabajar con quien quiera mejorar esto antes de llevarlo a votación. El objetivo no es que se apruebe mi versión: es que Solé tenga un sistema que funcione para todos.</w:t>
+        <w:t>Entiendo que una reforma de este tipo puede despertar dudas razonables: cuánto va a costar, si se va a usar para molestar vecinos, si una obra ya hecha se vuelve problema, o si la Administración tendrá más carga. Precisamente por eso la propuesta incluye plazos, aprobación tácita, depósitos reembolsables con reglas de transparencia, amnistía para situaciones existentes y límites claros a lo que el Consejo puede hacer.</w:t>
+      </w:r>
+    </w:p>
+    <w:p>
+      <w:pPr>
+        <w:spacing w:after="160"/>
+      </w:pPr>
+      <w:r>
+        <w:rPr/>
+        <w:t>Estoy disponible para responder preguntas, recibir propuestas de modificación y trabajar con quien quiera mejorar esto antes de llevarlo a votación. El objetivo no es que se apruebe mi versión: es que Solé tenga un sistema que funcione para todos, sin arbitrariedad y sin burocracia innecesaria.</w:t>
       </w:r>
     </w:p>
     <w:p>
@@ -10172,6 +10463,15 @@
       <w:r>
         <w:rPr/>
         <w:t>Para llegar ahí necesitamos que al menos el 25% de los condóminos pidan formalmente que se convoque. Tu firma en ese proceso no aprueba nada: abre la puerta para que todos decidan.</w:t>
+      </w:r>
+    </w:p>
+    <w:p>
+      <w:pPr>
+        <w:spacing w:after="160"/>
+      </w:pPr>
+      <w:r>
+        <w:rPr/>
+        <w:t>Si tu preocupación es la propiedad privada, hablemos de cómo proteger interiores y libertad de uso sin descuidar fachadas. Si tu preocupación son los costos, revisemos juntos los topes y las devoluciones. Si tu preocupación es una obra ya existente, veamos el mecanismo de regularización. Si tu preocupación es la Administración, revisemos las garantías de transparencia. Todas esas dudas son legítimas y mejoran la propuesta.</w:t>
       </w:r>
     </w:p>
     <w:p>
@@ -10848,7 +11148,7 @@
       </w:pPr>
       <w:r>
         <w:rPr/>
-        <w:t>(a) El CONSEJO se reunirá cuando exista al menos una solicitud pendiente, y al menos una vez al mes para revisar obras en proceso. (b) Las resoluciones — aprobaciones y rechazos — deberán constar por escrito con referencia expresa al Reglamento o al MANUAL. Una negativa sin fundamento escrito dentro del plazo se considerará aprobación tácita. (c) La aprobación del CONSEJO es exclusivamente estética y de cumplimiento con el MANUAL. No sustituye la responsabilidad técnica y estructural del DRO.</w:t>
+        <w:t>(a) El CONSEJO se reunirá cuando exista al menos una solicitud pendiente, y al menos una vez al mes para revisar obras en proceso. (b) Las resoluciones — aprobaciones y rechazos — deberán constar por escrito con referencia expresa al Reglamento o al MANUAL. Para Obra Intermedia, una negativa sin fundamento escrito dentro del plazo se considerará aprobación tácita. Para Obra Grande, el Consejo tendrá 15 días hábiles para resolver. Si transcurrido el plazo no hay respuesta, el condómino podrá requerir formalmente el inicio, y si en 48 horas adicionales persiste el silencio, operará la aprobación tácita, quedando a salvo las revisiones de seguridad del DRO. (c) La aprobación del CONSEJO es exclusivamente estética y de cumplimiento con el MANUAL. No sustituye la responsabilidad técnica y estructural del DRO.</w:t>
       </w:r>
     </w:p>
     <w:p>
@@ -11042,7 +11342,7 @@
           <w:p>
             <w:r>
               <w:rPr/>
-              <w:t>15 días hábiles — sin aprobación tácita</w:t>
+              <w:t>15 días hábiles + requerimiento formal y 48 horas adicionales para aprobación tácita limitada</w:t>
             </w:r>
           </w:p>
         </w:tc>
@@ -11203,7 +11503,7 @@
       </w:r>
       <w:r>
         <w:rPr/>
-        <w:t xml:space="preserve"> (b) DRO con cédula profesional vigente, quien asume responsabilidad técnica y legal. (c) Autorización previa del CONSEJO antes de gestionar permisos municipales. (d) Permisos de la Dirección de Desarrollo Urbano de Soledad. (e) Depósito en garantía: 15% del presupuesto, mínimo $10,000 MXN. (f) Visitas de supervisión del CONSEJO durante la obra. No hay aprobación tácita.</w:t>
+        <w:t xml:space="preserve"> (b) DRO con cédula profesional vigente, quien asume responsabilidad técnica y legal. (c) Autorización previa del CONSEJO antes de gestionar permisos municipales. (d) Permisos de la Dirección de Desarrollo Urbano de Soledad. (e) Depósito en garantía indexado en UMAs según complejidad: hasta 40 UMAs para intervenciones exteriores simples como techar cochera o agregar pérgola ligera; hasta 85 UMAs para ampliaciones parciales o nuevos volúmenes sin cambio de nivel; hasta 150 UMAs para planta completa, segundo nivel, modificación estructural mayor o intervención que incremente de forma sustancial la superficie construida. Depósito en garantía totalmente reembolsable, administrado bajo cuenta transparente y devuelto en un plazo máximo de 5 días posteriores a la liberación de la obra. (f) Visitas de supervisión del CONSEJO durante la obra. Para Obra Grande, el Consejo tendrá 15 días hábiles para resolver. Si transcurrido el plazo no hay respuesta, el condómino podrá requerir formalmente el inicio, y si en 48 horas adicionales persiste el silencio, operará la aprobación tácita, quedando a salvo las revisiones de seguridad del DRO.</w:t>
       </w:r>
     </w:p>
     <w:p>
@@ -11374,7 +11674,7 @@
       </w:pPr>
       <w:r>
         <w:rPr/>
-        <w:t>Ejemplo de cálculo con amnistía: Para una Obra Mayor con presupuesto original de $150,000 MXN — Depósito en garantía normal: $22,500 (15%). Multa de regularización tarifa normal: $45,000 (doble del depósito). Multa con período de amnistía: $22,500 (50% de descuento).</w:t>
+        <w:t>Ejemplo de cálculo con amnistía: Para una Obra Mayor con presupuesto original de $150,000 MXN y complejidad alta — Depósito en garantía normal: hasta 150 UMAs. Multa de regularización tarifa normal: doble del depósito aplicable. Multa con período de amnistía: equivalente al depósito aplicable por el descuento del 50%.</w:t>
       </w:r>
     </w:p>
     <w:p>
@@ -13630,7 +13930,7 @@
         <w:rPr>
           <w:i/>
         </w:rPr>
-        <w:t>Categoría III — Para ampliaciones de superficie, nuevos volúmenes, cambios estructurales, adición de niveles, o cualquier obra que requiera permiso municipal. No aplica aprobación tácita por silencio del Consejo. Requiere DRO con registro vigente ante el Municipio de Soledad de Graciano Sánchez.</w:t>
+        <w:t>Categoría III — Para ampliaciones de superficie, nuevos volúmenes, cambios estructurales, adición de niveles, o cualquier obra que requiera permiso municipal. Aplica aprobación tácita limitada conforme al plazo especial de Obra Grande, sin sustituir revisiones de seguridad del DRO. Requiere DRO con registro vigente ante el Municipio de Soledad de Graciano Sánchez.</w:t>
       </w:r>
     </w:p>
     <w:p>
@@ -14811,7 +15111,7 @@
           <w:p>
             <w:r>
               <w:rPr/>
-              <w:t>15% del presupuesto (mín. $10,000)</w:t>
+              <w:t>Indexado en UMAs según complejidad: hasta 40 UMAs para intervención exterior simple; hasta 85 UMAs para ampliación parcial o nuevo volumen sin cambio de nivel; hasta 150 UMAs para planta completa, segundo nivel o modificación estructural mayor</w:t>
             </w:r>
           </w:p>
         </w:tc>
@@ -14899,7 +15199,7 @@
         <w:rPr>
           <w:i/>
         </w:rPr>
-        <w:t>El depósito se reembolsa íntegramente al concluir la obra conforme a lo autorizado y tras verificación del Consejo.</w:t>
+        <w:t>Depósito en garantía totalmente reembolsable, administrado bajo cuenta transparente y devuelto en un plazo máximo de 5 días posteriores a la liberación de la obra.</w:t>
       </w:r>
     </w:p>
     <w:p>
@@ -15255,7 +15555,7 @@
       </w:r>
       <w:r>
         <w:rPr/>
-        <w:t xml:space="preserve"> Esta categoría NO admite aprobación tácita. El Consejo debe emitir resolución expresa dentro de los 15 días hábiles.</w:t>
+        <w:t xml:space="preserve"> Para Obra Grande, el Consejo tendrá 15 días hábiles para resolver. Si transcurrido el plazo no hay respuesta, el condómino podrá requerir formalmente el inicio, y si en 48 horas adicionales persiste el silencio, operará la aprobación tácita, quedando a salvo las revisiones de seguridad del DRO.</w:t>
       </w:r>
     </w:p>
     <w:p>
@@ -15369,6 +15669,25 @@
       <w:r>
         <w:rPr/>
         <w:t xml:space="preserve"> — ver fundamento al reverso</w:t>
+      </w:r>
+    </w:p>
+    <w:p>
+      <w:pPr>
+        <w:pStyle w:val="ListBullet"/>
+      </w:pPr>
+      <w:r>
+        <w:rPr/>
+        <w:t xml:space="preserve"> </w:t>
+      </w:r>
+      <w:r>
+        <w:rPr>
+          <w:b/>
+        </w:rPr>
+        <w:t>Aprobación tácita limitada</w:t>
+      </w:r>
+      <w:r>
+        <w:rPr/>
+        <w:t xml:space="preserve"> — transcurrió el plazo de 15 días hábiles, el condómino requirió formalmente el inicio y persistió el silencio por 48 horas adicionales</w:t>
       </w:r>
     </w:p>
     <w:p>
@@ -17334,7 +17653,7 @@
           <w:p>
             <w:r>
               <w:rPr/>
-              <w:t>Depósito en garantía (15% del costo estimado, mín. $5,000)</w:t>
+              <w:t>Depósito en garantía aplicable según categoría y complejidad</w:t>
             </w:r>
           </w:p>
         </w:tc>
@@ -26164,6 +26483,269 @@
     </w:p>
     <w:p>
       <w:pPr>
+        <w:pStyle w:val="Heading4"/>
+        <w:spacing w:before="240" w:after="120"/>
+      </w:pPr>
+      <w:r>
+        <w:rPr>
+          <w:b/>
+          <w:sz w:val="24"/>
+        </w:rPr>
+        <w:t>P15. ¿Esto viola mi derecho de propiedad?</w:t>
+      </w:r>
+    </w:p>
+    <w:p>
+      <w:pPr>
+        <w:spacing w:after="160"/>
+      </w:pPr>
+      <w:r>
+        <w:rPr/>
+        <w:t>No. La propuesta distingue entre el espacio habitable privado y los elementos exteriores que afectan la imagen común del fraccionamiento.</w:t>
+      </w:r>
+    </w:p>
+    <w:p>
+      <w:pPr>
+        <w:spacing w:after="160"/>
+      </w:pPr>
+      <w:r>
+        <w:rPr/>
+        <w:t>Dentro de la casa, cada propietario conserva libertad para mantenimiento, acabados interiores y decisiones que no afecten fachada, estructura, áreas comunes ni seguridad. En régimen condominal, las fachadas, volúmenes visibles y modificaciones estructurales tienen impacto colectivo porque influyen en la percepción y valor de todas las viviendas.</w:t>
+      </w:r>
+    </w:p>
+    <w:p>
+      <w:pPr>
+        <w:spacing w:after="160"/>
+      </w:pPr>
+      <w:r>
+        <w:rPr/>
+        <w:t xml:space="preserve">La idea práctica es sencilla: </w:t>
+      </w:r>
+      <w:r>
+        <w:rPr>
+          <w:b/>
+        </w:rPr>
+        <w:t>adentro decides tú; hacia afuera cuidamos entre todos lo que todos vendemos como conjunto</w:t>
+      </w:r>
+      <w:r>
+        <w:rPr/>
+        <w:t>.</w:t>
+      </w:r>
+    </w:p>
+    <w:p>
+      <w:pPr>
+        <w:pStyle w:val="Heading4"/>
+        <w:spacing w:before="240" w:after="120"/>
+      </w:pPr>
+      <w:r>
+        <w:rPr>
+          <w:b/>
+          <w:sz w:val="24"/>
+        </w:rPr>
+        <w:t>P16. ¿No están creando más burocracia?</w:t>
+      </w:r>
+    </w:p>
+    <w:p>
+      <w:pPr>
+        <w:spacing w:after="160"/>
+      </w:pPr>
+      <w:r>
+        <w:rPr/>
+        <w:t>La propuesta busca lo contrario: separar trámites simples de obras delicadas.</w:t>
+      </w:r>
+    </w:p>
+    <w:p>
+      <w:pPr>
+        <w:pStyle w:val="ListBullet"/>
+      </w:pPr>
+      <w:r>
+        <w:rPr/>
+        <w:t>Obra Pequeña: aviso simple, sin cuota, sin depósito y sin Consejo.</w:t>
+      </w:r>
+    </w:p>
+    <w:p>
+      <w:pPr>
+        <w:pStyle w:val="ListBullet"/>
+      </w:pPr>
+      <w:r>
+        <w:rPr/>
+        <w:t>Obra Mediana: revisión rápida con plazo de 5 días hábiles y aprobación tácita.</w:t>
+      </w:r>
+    </w:p>
+    <w:p>
+      <w:pPr>
+        <w:pStyle w:val="ListBullet"/>
+      </w:pPr>
+      <w:r>
+        <w:rPr/>
+        <w:t>Obra Grande: revisión más completa porque puede afectar estructura, permisos municipales o áreas comunes.</w:t>
+      </w:r>
+    </w:p>
+    <w:p>
+      <w:pPr>
+        <w:spacing w:after="160"/>
+      </w:pPr>
+      <w:r>
+        <w:rPr/>
+        <w:t>Hoy la falta de proceso claro genera más burocracia informal: mensajes, autorizaciones de palabra, dudas, reclamos y decisiones caso por caso. Un formato claro y un plazo fijo suelen ser menos pesados que una discusión abierta.</w:t>
+      </w:r>
+    </w:p>
+    <w:p>
+      <w:pPr>
+        <w:pStyle w:val="Heading4"/>
+        <w:spacing w:before="240" w:after="120"/>
+      </w:pPr>
+      <w:r>
+        <w:rPr>
+          <w:b/>
+          <w:sz w:val="24"/>
+        </w:rPr>
+        <w:t>P17. ¿El depósito es un cobro disfrazado?</w:t>
+      </w:r>
+    </w:p>
+    <w:p>
+      <w:pPr>
+        <w:spacing w:after="160"/>
+      </w:pPr>
+      <w:r>
+        <w:rPr/>
+        <w:t>No. El depósito no es ingreso del condominio ni pago permanente. Es una garantía reembolsable para proteger áreas comunes y a los propios vecinos frente a daños de obra: escombro, pavimento, banquetas, instalaciones, accesos o limpieza.</w:t>
+      </w:r>
+    </w:p>
+    <w:p>
+      <w:pPr>
+        <w:spacing w:after="160"/>
+      </w:pPr>
+      <w:r>
+        <w:rPr/>
+        <w:t>Para Obra Grande, además, el depósito queda limitado por complejidad e indexado en UMAs. No se trata igual una cochera techada que una planta completa. El texto exige que sea administrado en cuenta transparente y devuelto en un plazo máximo de 5 días posteriores a la liberación de la obra.</w:t>
+      </w:r>
+    </w:p>
+    <w:p>
+      <w:pPr>
+        <w:pStyle w:val="Heading4"/>
+        <w:spacing w:before="240" w:after="120"/>
+      </w:pPr>
+      <w:r>
+        <w:rPr>
+          <w:b/>
+          <w:sz w:val="24"/>
+        </w:rPr>
+        <w:t>P18. ¿Y si el Consejo se tarda o no contesta?</w:t>
+      </w:r>
+    </w:p>
+    <w:p>
+      <w:pPr>
+        <w:spacing w:after="160"/>
+      </w:pPr>
+      <w:r>
+        <w:rPr/>
+        <w:t>El silencio tiene consecuencias. En Obra Mediana opera la aprobación tácita si el Consejo no responde en plazo. En Obra Grande, el Consejo tiene 15 días hábiles; si no responde, el condómino puede requerir formalmente el inicio, y si pasan 48 horas adicionales sin respuesta, opera la aprobación tácita limitada, sin sustituir las revisiones de seguridad del DRO.</w:t>
+      </w:r>
+    </w:p>
+    <w:p>
+      <w:pPr>
+        <w:spacing w:after="160"/>
+      </w:pPr>
+      <w:r>
+        <w:rPr/>
+        <w:t>Esto evita que una solicitud quede congelada indefinidamente.</w:t>
+      </w:r>
+    </w:p>
+    <w:p>
+      <w:pPr>
+        <w:pStyle w:val="Heading4"/>
+        <w:spacing w:before="240" w:after="120"/>
+      </w:pPr>
+      <w:r>
+        <w:rPr>
+          <w:b/>
+          <w:sz w:val="24"/>
+        </w:rPr>
+        <w:t>P19. ¿Esto es una crítica a la Administración actual?</w:t>
+      </w:r>
+    </w:p>
+    <w:p>
+      <w:pPr>
+        <w:spacing w:after="160"/>
+      </w:pPr>
+      <w:r>
+        <w:rPr/>
+        <w:t>No. El problema principal no es de personas, sino de herramientas. El Reglamento actual menciona al Consejo y exige armonía visual, pero no da criterios suficientes para resolver con objetividad.</w:t>
+      </w:r>
+    </w:p>
+    <w:p>
+      <w:pPr>
+        <w:spacing w:after="160"/>
+      </w:pPr>
+      <w:r>
+        <w:rPr/>
+        <w:t>La propuesta ayuda a la Administración porque le quita la carga de ser juez estético solitario. Con Manual, plazos y formatos, la respuesta deja de ser "porque lo digo yo" y pasa a ser "porque así lo aprobó la Asamblea".</w:t>
+      </w:r>
+    </w:p>
+    <w:p>
+      <w:pPr>
+        <w:pStyle w:val="Heading4"/>
+        <w:spacing w:before="240" w:after="120"/>
+      </w:pPr>
+      <w:r>
+        <w:rPr>
+          <w:b/>
+          <w:sz w:val="24"/>
+        </w:rPr>
+        <w:t>P20. Yo no pienso construir. ¿Por qué me debería importar?</w:t>
+      </w:r>
+    </w:p>
+    <w:p>
+      <w:pPr>
+        <w:spacing w:after="160"/>
+      </w:pPr>
+      <w:r>
+        <w:rPr/>
+        <w:t>Porque aunque no construyas, algún día puedes vender, heredar o pedir un crédito usando tu casa como respaldo. La imagen del fraccionamiento influye en la percepción de valor de todas las propiedades.</w:t>
+      </w:r>
+    </w:p>
+    <w:p>
+      <w:pPr>
+        <w:spacing w:after="160"/>
+      </w:pPr>
+      <w:r>
+        <w:rPr/>
+        <w:t>Una obra desordenada no solo afecta al dueño que la hizo; también afecta lo que ve un comprador cuando llega a la calle. Esta propuesta protege el valor de mercado del conjunto, no solo regula al que construye.</w:t>
+      </w:r>
+    </w:p>
+    <w:p>
+      <w:pPr>
+        <w:pStyle w:val="Heading4"/>
+        <w:spacing w:before="240" w:after="120"/>
+      </w:pPr>
+      <w:r>
+        <w:rPr>
+          <w:b/>
+          <w:sz w:val="24"/>
+        </w:rPr>
+        <w:t>P21. ¿Firmar significa que ya estoy aprobando la reforma?</w:t>
+      </w:r>
+    </w:p>
+    <w:p>
+      <w:pPr>
+        <w:spacing w:after="160"/>
+      </w:pPr>
+      <w:r>
+        <w:rPr/>
+        <w:t>No. Firmar para convocar a Asamblea no aprueba la propuesta. Solo permite que el tema se discuta formalmente, con todos los condóminos, y que ahí se propongan cambios, ajustes o rechazos.</w:t>
+      </w:r>
+    </w:p>
+    <w:p>
+      <w:pPr>
+        <w:spacing w:after="160"/>
+      </w:pPr>
+      <w:r>
+        <w:rPr/>
+        <w:t>Si alguien tiene dudas u objeciones, la Asamblea es precisamente el lugar correcto para plantearlas. Sin firmas suficientes, la conversación se queda en chats y pasillos, donde no se puede votar ni modificar nada formalmente.</w:t>
+      </w:r>
+    </w:p>
+    <w:p>
+      <w:pPr>
         <w:pBdr>
           <w:bottom w:val="single" w:sz="6" w:space="1" w:color="E2E8F0"/>
         </w:pBdr>
@@ -27652,6 +28234,2923 @@
     <w:p>
       <w:r>
         <w:br w:type="page"/>
+      </w:r>
+    </w:p>
+    <w:p>
+      <w:pPr>
+        <w:pBdr>
+          <w:bottom w:val="single" w:sz="6" w:space="1" w:color="E2E8F0"/>
+        </w:pBdr>
+      </w:pPr>
+    </w:p>
+    <w:p>
+      <w:pPr>
+        <w:pStyle w:val="Heading1"/>
+        <w:spacing w:before="480" w:after="240"/>
+        <w:jc w:val="center"/>
+      </w:pPr>
+      <w:r>
+        <w:rPr>
+          <w:b/>
+          <w:color w:val="1B2C3E"/>
+          <w:sz w:val="48"/>
+        </w:rPr>
+        <w:t>Hoja de firmas</w:t>
+      </w:r>
+    </w:p>
+    <w:p>
+      <w:pPr>
+        <w:spacing w:after="160"/>
+      </w:pPr>
+      <w:r>
+        <w:rPr/>
+        <w:t>Esta hoja tiene como finalidad documentar a los condóminos propietarios que solicitan que la propuesta de reforma al sistema de control arquitectónico del Fraccionamiento Solé sea discutida formalmente en Asamblea General.</w:t>
+      </w:r>
+    </w:p>
+    <w:p>
+      <w:pPr>
+        <w:spacing w:after="160"/>
+      </w:pPr>
+      <w:r>
+        <w:rPr/>
+        <w:t xml:space="preserve">La firma en esta hoja </w:t>
+      </w:r>
+      <w:r>
+        <w:rPr>
+          <w:b/>
+        </w:rPr>
+        <w:t>no aprueba la propuesta</w:t>
+      </w:r>
+      <w:r>
+        <w:rPr/>
+        <w:t>, no obliga al firmante a votar a favor y no sustituye la deliberación de la Asamblea. Su único efecto es manifestar que el tema debe llevarse al órgano que corresponde, para que todos los condóminos puedan conocerlo, hacer preguntas, proponer modificaciones y votar.</w:t>
+      </w:r>
+    </w:p>
+    <w:p>
+      <w:pPr>
+        <w:ind w:left="720"/>
+        <w:pBdr>
+          <w:left w:val="single" w:sz="12" w:space="8" w:color="E2E8F0"/>
+        </w:pBdr>
+      </w:pPr>
+      <w:r>
+        <w:rPr/>
+        <w:t>Conforme al Art. 99 del Reglamento Interno, los condóminos pueden solicitar la convocatoria a Asamblea General cuando representen por lo menos el 25% del total de condóminos.</w:t>
+      </w:r>
+    </w:p>
+    <w:p>
+      <w:pPr>
+        <w:spacing w:after="160"/>
+      </w:pPr>
+      <w:r>
+        <w:rPr/>
+        <w:t xml:space="preserve">Para efectos prácticos de esta solicitud, se toma como referencia un total de </w:t>
+      </w:r>
+      <w:r>
+        <w:rPr>
+          <w:b/>
+        </w:rPr>
+        <w:t>283 condóminos</w:t>
+      </w:r>
+      <w:r>
+        <w:rPr/>
+        <w:t xml:space="preserve">. El 25% equivale a </w:t>
+      </w:r>
+      <w:r>
+        <w:rPr>
+          <w:b/>
+        </w:rPr>
+        <w:t>70.75</w:t>
+      </w:r>
+      <w:r>
+        <w:rPr/>
+        <w:t xml:space="preserve">, por lo que se requieren al menos </w:t>
+      </w:r>
+      <w:r>
+        <w:rPr>
+          <w:b/>
+        </w:rPr>
+        <w:t>71 firmas de condóminos propietarios</w:t>
+      </w:r>
+      <w:r>
+        <w:rPr/>
+        <w:t xml:space="preserve"> para alcanzar el umbral mínimo de convocatoria.</w:t>
+      </w:r>
+    </w:p>
+    <w:p>
+      <w:pPr>
+        <w:pStyle w:val="Heading2"/>
+        <w:spacing w:before="360" w:after="180"/>
+      </w:pPr>
+      <w:r>
+        <w:rPr>
+          <w:b/>
+          <w:color w:val="1B2C3E"/>
+          <w:sz w:val="36"/>
+        </w:rPr>
+        <w:t>Manifestación</w:t>
+      </w:r>
+    </w:p>
+    <w:p>
+      <w:pPr>
+        <w:spacing w:after="160"/>
+      </w:pPr>
+      <w:r>
+        <w:rPr/>
+        <w:t>Quienes firmamos esta hoja solicitamos que se convoque a Asamblea General de Condóminos para discutir la propuesta de reforma al Reglamento relativa al Control Arquitectónico Transparente, Manual de Imagen Urbana, clasificación proporcional de obras, regularización de situaciones preexistentes y mecanismos de transparencia operativa.</w:t>
+      </w:r>
+    </w:p>
+    <w:p>
+      <w:pPr>
+        <w:spacing w:after="160"/>
+      </w:pPr>
+      <w:r>
+        <w:rPr/>
+        <w:t>Entendemos que:</w:t>
+      </w:r>
+    </w:p>
+    <w:p>
+      <w:pPr>
+        <w:pStyle w:val="ListBullet"/>
+      </w:pPr>
+      <w:r>
+        <w:rPr/>
+        <w:t>Esta firma solo solicita que el tema se discuta en Asamblea.</w:t>
+      </w:r>
+    </w:p>
+    <w:p>
+      <w:pPr>
+        <w:pStyle w:val="ListBullet"/>
+      </w:pPr>
+      <w:r>
+        <w:rPr/>
+        <w:t>La propuesta podrá aprobarse, modificarse o rechazarse durante la Asamblea.</w:t>
+      </w:r>
+    </w:p>
+    <w:p>
+      <w:pPr>
+        <w:pStyle w:val="ListBullet"/>
+      </w:pPr>
+      <w:r>
+        <w:rPr/>
+        <w:t>Cada condómino conservará su derecho a opinar y votar libremente.</w:t>
+      </w:r>
+    </w:p>
+    <w:p>
+      <w:pPr>
+        <w:pStyle w:val="ListBullet"/>
+      </w:pPr>
+      <w:r>
+        <w:rPr/>
+        <w:t>El teléfono es opcional y se solicita únicamente para fines de verificación o seguimiento de la convocatoria.</w:t>
+      </w:r>
+    </w:p>
+    <w:p>
+      <w:pPr>
+        <w:pStyle w:val="Heading2"/>
+        <w:spacing w:before="360" w:after="180"/>
+      </w:pPr>
+      <w:r>
+        <w:rPr>
+          <w:b/>
+          <w:color w:val="1B2C3E"/>
+          <w:sz w:val="36"/>
+        </w:rPr>
+        <w:t>Tabla de firmas</w:t>
+      </w:r>
+    </w:p>
+    <w:tbl>
+      <w:tblPr>
+        <w:tblStyle w:val="TableGrid"/>
+        <w:tblW w:type="auto" w:w="0"/>
+        <w:tblLook w:firstColumn="1" w:firstRow="1" w:lastColumn="0" w:lastRow="0" w:noHBand="0" w:noVBand="1" w:val="04A0"/>
+      </w:tblPr>
+      <w:tblGrid>
+        <w:gridCol w:w="1938"/>
+        <w:gridCol w:w="1938"/>
+        <w:gridCol w:w="1938"/>
+        <w:gridCol w:w="1938"/>
+        <w:gridCol w:w="1938"/>
+      </w:tblGrid>
+      <w:tr>
+        <w:tc>
+          <w:tcPr>
+            <w:tcW w:type="dxa" w:w="1938"/>
+          </w:tcPr>
+          <w:p>
+            <w:r>
+              <w:rPr>
+                <w:b/>
+              </w:rPr>
+              <w:t>No.</w:t>
+            </w:r>
+          </w:p>
+        </w:tc>
+        <w:tc>
+          <w:tcPr>
+            <w:tcW w:type="dxa" w:w="1938"/>
+          </w:tcPr>
+          <w:p>
+            <w:r>
+              <w:rPr>
+                <w:b/>
+              </w:rPr>
+              <w:t>Nombre completo</w:t>
+            </w:r>
+          </w:p>
+        </w:tc>
+        <w:tc>
+          <w:tcPr>
+            <w:tcW w:type="dxa" w:w="1938"/>
+          </w:tcPr>
+          <w:p>
+            <w:r>
+              <w:rPr>
+                <w:b/>
+              </w:rPr>
+              <w:t>Lote</w:t>
+            </w:r>
+          </w:p>
+        </w:tc>
+        <w:tc>
+          <w:tcPr>
+            <w:tcW w:type="dxa" w:w="1938"/>
+          </w:tcPr>
+          <w:p>
+            <w:r>
+              <w:rPr>
+                <w:b/>
+              </w:rPr>
+              <w:t>Teléfono (opcional)</w:t>
+            </w:r>
+          </w:p>
+        </w:tc>
+        <w:tc>
+          <w:tcPr>
+            <w:tcW w:type="dxa" w:w="1938"/>
+          </w:tcPr>
+          <w:p>
+            <w:r>
+              <w:rPr>
+                <w:b/>
+              </w:rPr>
+              <w:t>Firma</w:t>
+            </w:r>
+          </w:p>
+        </w:tc>
+      </w:tr>
+      <w:tr>
+        <w:tc>
+          <w:tcPr>
+            <w:tcW w:type="dxa" w:w="1938"/>
+          </w:tcPr>
+          <w:p>
+            <w:r>
+              <w:rPr/>
+              <w:t>1</w:t>
+            </w:r>
+          </w:p>
+        </w:tc>
+        <w:tc>
+          <w:tcPr>
+            <w:tcW w:type="dxa" w:w="1938"/>
+          </w:tcPr>
+          <w:p>
+            <w:r>
+              <w:rPr/>
+              <w:t>Daniel Chávez Flores</w:t>
+            </w:r>
+          </w:p>
+        </w:tc>
+        <w:tc>
+          <w:tcPr>
+            <w:tcW w:type="dxa" w:w="1938"/>
+          </w:tcPr>
+          <w:p>
+            <w:r>
+              <w:rPr/>
+              <w:t>136-B</w:t>
+            </w:r>
+          </w:p>
+        </w:tc>
+        <w:tc>
+          <w:tcPr>
+            <w:tcW w:type="dxa" w:w="1938"/>
+          </w:tcPr>
+          <w:p>
+            <w:r>
+              <w:rPr/>
+              <w:t>444-105-8700</w:t>
+            </w:r>
+          </w:p>
+        </w:tc>
+        <w:tc>
+          <w:tcPr>
+            <w:tcW w:type="dxa" w:w="1938"/>
+          </w:tcPr>
+          <w:p/>
+        </w:tc>
+      </w:tr>
+      <w:tr>
+        <w:tc>
+          <w:tcPr>
+            <w:tcW w:type="dxa" w:w="1938"/>
+          </w:tcPr>
+          <w:p>
+            <w:r>
+              <w:rPr/>
+              <w:t>2</w:t>
+            </w:r>
+          </w:p>
+        </w:tc>
+        <w:tc>
+          <w:tcPr>
+            <w:tcW w:type="dxa" w:w="1938"/>
+          </w:tcPr>
+          <w:p/>
+        </w:tc>
+        <w:tc>
+          <w:tcPr>
+            <w:tcW w:type="dxa" w:w="1938"/>
+          </w:tcPr>
+          <w:p/>
+        </w:tc>
+        <w:tc>
+          <w:tcPr>
+            <w:tcW w:type="dxa" w:w="1938"/>
+          </w:tcPr>
+          <w:p/>
+        </w:tc>
+        <w:tc>
+          <w:tcPr>
+            <w:tcW w:type="dxa" w:w="1938"/>
+          </w:tcPr>
+          <w:p/>
+        </w:tc>
+      </w:tr>
+      <w:tr>
+        <w:tc>
+          <w:tcPr>
+            <w:tcW w:type="dxa" w:w="1938"/>
+          </w:tcPr>
+          <w:p>
+            <w:r>
+              <w:rPr/>
+              <w:t>3</w:t>
+            </w:r>
+          </w:p>
+        </w:tc>
+        <w:tc>
+          <w:tcPr>
+            <w:tcW w:type="dxa" w:w="1938"/>
+          </w:tcPr>
+          <w:p/>
+        </w:tc>
+        <w:tc>
+          <w:tcPr>
+            <w:tcW w:type="dxa" w:w="1938"/>
+          </w:tcPr>
+          <w:p/>
+        </w:tc>
+        <w:tc>
+          <w:tcPr>
+            <w:tcW w:type="dxa" w:w="1938"/>
+          </w:tcPr>
+          <w:p/>
+        </w:tc>
+        <w:tc>
+          <w:tcPr>
+            <w:tcW w:type="dxa" w:w="1938"/>
+          </w:tcPr>
+          <w:p/>
+        </w:tc>
+      </w:tr>
+      <w:tr>
+        <w:tc>
+          <w:tcPr>
+            <w:tcW w:type="dxa" w:w="1938"/>
+          </w:tcPr>
+          <w:p>
+            <w:r>
+              <w:rPr/>
+              <w:t>4</w:t>
+            </w:r>
+          </w:p>
+        </w:tc>
+        <w:tc>
+          <w:tcPr>
+            <w:tcW w:type="dxa" w:w="1938"/>
+          </w:tcPr>
+          <w:p/>
+        </w:tc>
+        <w:tc>
+          <w:tcPr>
+            <w:tcW w:type="dxa" w:w="1938"/>
+          </w:tcPr>
+          <w:p/>
+        </w:tc>
+        <w:tc>
+          <w:tcPr>
+            <w:tcW w:type="dxa" w:w="1938"/>
+          </w:tcPr>
+          <w:p/>
+        </w:tc>
+        <w:tc>
+          <w:tcPr>
+            <w:tcW w:type="dxa" w:w="1938"/>
+          </w:tcPr>
+          <w:p/>
+        </w:tc>
+      </w:tr>
+      <w:tr>
+        <w:tc>
+          <w:tcPr>
+            <w:tcW w:type="dxa" w:w="1938"/>
+          </w:tcPr>
+          <w:p>
+            <w:r>
+              <w:rPr/>
+              <w:t>5</w:t>
+            </w:r>
+          </w:p>
+        </w:tc>
+        <w:tc>
+          <w:tcPr>
+            <w:tcW w:type="dxa" w:w="1938"/>
+          </w:tcPr>
+          <w:p/>
+        </w:tc>
+        <w:tc>
+          <w:tcPr>
+            <w:tcW w:type="dxa" w:w="1938"/>
+          </w:tcPr>
+          <w:p/>
+        </w:tc>
+        <w:tc>
+          <w:tcPr>
+            <w:tcW w:type="dxa" w:w="1938"/>
+          </w:tcPr>
+          <w:p/>
+        </w:tc>
+        <w:tc>
+          <w:tcPr>
+            <w:tcW w:type="dxa" w:w="1938"/>
+          </w:tcPr>
+          <w:p/>
+        </w:tc>
+      </w:tr>
+      <w:tr>
+        <w:tc>
+          <w:tcPr>
+            <w:tcW w:type="dxa" w:w="1938"/>
+          </w:tcPr>
+          <w:p>
+            <w:r>
+              <w:rPr/>
+              <w:t>6</w:t>
+            </w:r>
+          </w:p>
+        </w:tc>
+        <w:tc>
+          <w:tcPr>
+            <w:tcW w:type="dxa" w:w="1938"/>
+          </w:tcPr>
+          <w:p/>
+        </w:tc>
+        <w:tc>
+          <w:tcPr>
+            <w:tcW w:type="dxa" w:w="1938"/>
+          </w:tcPr>
+          <w:p/>
+        </w:tc>
+        <w:tc>
+          <w:tcPr>
+            <w:tcW w:type="dxa" w:w="1938"/>
+          </w:tcPr>
+          <w:p/>
+        </w:tc>
+        <w:tc>
+          <w:tcPr>
+            <w:tcW w:type="dxa" w:w="1938"/>
+          </w:tcPr>
+          <w:p/>
+        </w:tc>
+      </w:tr>
+      <w:tr>
+        <w:tc>
+          <w:tcPr>
+            <w:tcW w:type="dxa" w:w="1938"/>
+          </w:tcPr>
+          <w:p>
+            <w:r>
+              <w:rPr/>
+              <w:t>7</w:t>
+            </w:r>
+          </w:p>
+        </w:tc>
+        <w:tc>
+          <w:tcPr>
+            <w:tcW w:type="dxa" w:w="1938"/>
+          </w:tcPr>
+          <w:p/>
+        </w:tc>
+        <w:tc>
+          <w:tcPr>
+            <w:tcW w:type="dxa" w:w="1938"/>
+          </w:tcPr>
+          <w:p/>
+        </w:tc>
+        <w:tc>
+          <w:tcPr>
+            <w:tcW w:type="dxa" w:w="1938"/>
+          </w:tcPr>
+          <w:p/>
+        </w:tc>
+        <w:tc>
+          <w:tcPr>
+            <w:tcW w:type="dxa" w:w="1938"/>
+          </w:tcPr>
+          <w:p/>
+        </w:tc>
+      </w:tr>
+      <w:tr>
+        <w:tc>
+          <w:tcPr>
+            <w:tcW w:type="dxa" w:w="1938"/>
+          </w:tcPr>
+          <w:p>
+            <w:r>
+              <w:rPr/>
+              <w:t>8</w:t>
+            </w:r>
+          </w:p>
+        </w:tc>
+        <w:tc>
+          <w:tcPr>
+            <w:tcW w:type="dxa" w:w="1938"/>
+          </w:tcPr>
+          <w:p/>
+        </w:tc>
+        <w:tc>
+          <w:tcPr>
+            <w:tcW w:type="dxa" w:w="1938"/>
+          </w:tcPr>
+          <w:p/>
+        </w:tc>
+        <w:tc>
+          <w:tcPr>
+            <w:tcW w:type="dxa" w:w="1938"/>
+          </w:tcPr>
+          <w:p/>
+        </w:tc>
+        <w:tc>
+          <w:tcPr>
+            <w:tcW w:type="dxa" w:w="1938"/>
+          </w:tcPr>
+          <w:p/>
+        </w:tc>
+      </w:tr>
+      <w:tr>
+        <w:tc>
+          <w:tcPr>
+            <w:tcW w:type="dxa" w:w="1938"/>
+          </w:tcPr>
+          <w:p>
+            <w:r>
+              <w:rPr/>
+              <w:t>9</w:t>
+            </w:r>
+          </w:p>
+        </w:tc>
+        <w:tc>
+          <w:tcPr>
+            <w:tcW w:type="dxa" w:w="1938"/>
+          </w:tcPr>
+          <w:p/>
+        </w:tc>
+        <w:tc>
+          <w:tcPr>
+            <w:tcW w:type="dxa" w:w="1938"/>
+          </w:tcPr>
+          <w:p/>
+        </w:tc>
+        <w:tc>
+          <w:tcPr>
+            <w:tcW w:type="dxa" w:w="1938"/>
+          </w:tcPr>
+          <w:p/>
+        </w:tc>
+        <w:tc>
+          <w:tcPr>
+            <w:tcW w:type="dxa" w:w="1938"/>
+          </w:tcPr>
+          <w:p/>
+        </w:tc>
+      </w:tr>
+      <w:tr>
+        <w:tc>
+          <w:tcPr>
+            <w:tcW w:type="dxa" w:w="1938"/>
+          </w:tcPr>
+          <w:p>
+            <w:r>
+              <w:rPr/>
+              <w:t>10</w:t>
+            </w:r>
+          </w:p>
+        </w:tc>
+        <w:tc>
+          <w:tcPr>
+            <w:tcW w:type="dxa" w:w="1938"/>
+          </w:tcPr>
+          <w:p/>
+        </w:tc>
+        <w:tc>
+          <w:tcPr>
+            <w:tcW w:type="dxa" w:w="1938"/>
+          </w:tcPr>
+          <w:p/>
+        </w:tc>
+        <w:tc>
+          <w:tcPr>
+            <w:tcW w:type="dxa" w:w="1938"/>
+          </w:tcPr>
+          <w:p/>
+        </w:tc>
+        <w:tc>
+          <w:tcPr>
+            <w:tcW w:type="dxa" w:w="1938"/>
+          </w:tcPr>
+          <w:p/>
+        </w:tc>
+      </w:tr>
+      <w:tr>
+        <w:tc>
+          <w:tcPr>
+            <w:tcW w:type="dxa" w:w="1938"/>
+          </w:tcPr>
+          <w:p>
+            <w:r>
+              <w:rPr/>
+              <w:t>11</w:t>
+            </w:r>
+          </w:p>
+        </w:tc>
+        <w:tc>
+          <w:tcPr>
+            <w:tcW w:type="dxa" w:w="1938"/>
+          </w:tcPr>
+          <w:p/>
+        </w:tc>
+        <w:tc>
+          <w:tcPr>
+            <w:tcW w:type="dxa" w:w="1938"/>
+          </w:tcPr>
+          <w:p/>
+        </w:tc>
+        <w:tc>
+          <w:tcPr>
+            <w:tcW w:type="dxa" w:w="1938"/>
+          </w:tcPr>
+          <w:p/>
+        </w:tc>
+        <w:tc>
+          <w:tcPr>
+            <w:tcW w:type="dxa" w:w="1938"/>
+          </w:tcPr>
+          <w:p/>
+        </w:tc>
+      </w:tr>
+      <w:tr>
+        <w:tc>
+          <w:tcPr>
+            <w:tcW w:type="dxa" w:w="1938"/>
+          </w:tcPr>
+          <w:p>
+            <w:r>
+              <w:rPr/>
+              <w:t>12</w:t>
+            </w:r>
+          </w:p>
+        </w:tc>
+        <w:tc>
+          <w:tcPr>
+            <w:tcW w:type="dxa" w:w="1938"/>
+          </w:tcPr>
+          <w:p/>
+        </w:tc>
+        <w:tc>
+          <w:tcPr>
+            <w:tcW w:type="dxa" w:w="1938"/>
+          </w:tcPr>
+          <w:p/>
+        </w:tc>
+        <w:tc>
+          <w:tcPr>
+            <w:tcW w:type="dxa" w:w="1938"/>
+          </w:tcPr>
+          <w:p/>
+        </w:tc>
+        <w:tc>
+          <w:tcPr>
+            <w:tcW w:type="dxa" w:w="1938"/>
+          </w:tcPr>
+          <w:p/>
+        </w:tc>
+      </w:tr>
+      <w:tr>
+        <w:tc>
+          <w:tcPr>
+            <w:tcW w:type="dxa" w:w="1938"/>
+          </w:tcPr>
+          <w:p>
+            <w:r>
+              <w:rPr/>
+              <w:t>13</w:t>
+            </w:r>
+          </w:p>
+        </w:tc>
+        <w:tc>
+          <w:tcPr>
+            <w:tcW w:type="dxa" w:w="1938"/>
+          </w:tcPr>
+          <w:p/>
+        </w:tc>
+        <w:tc>
+          <w:tcPr>
+            <w:tcW w:type="dxa" w:w="1938"/>
+          </w:tcPr>
+          <w:p/>
+        </w:tc>
+        <w:tc>
+          <w:tcPr>
+            <w:tcW w:type="dxa" w:w="1938"/>
+          </w:tcPr>
+          <w:p/>
+        </w:tc>
+        <w:tc>
+          <w:tcPr>
+            <w:tcW w:type="dxa" w:w="1938"/>
+          </w:tcPr>
+          <w:p/>
+        </w:tc>
+      </w:tr>
+      <w:tr>
+        <w:tc>
+          <w:tcPr>
+            <w:tcW w:type="dxa" w:w="1938"/>
+          </w:tcPr>
+          <w:p>
+            <w:r>
+              <w:rPr/>
+              <w:t>14</w:t>
+            </w:r>
+          </w:p>
+        </w:tc>
+        <w:tc>
+          <w:tcPr>
+            <w:tcW w:type="dxa" w:w="1938"/>
+          </w:tcPr>
+          <w:p/>
+        </w:tc>
+        <w:tc>
+          <w:tcPr>
+            <w:tcW w:type="dxa" w:w="1938"/>
+          </w:tcPr>
+          <w:p/>
+        </w:tc>
+        <w:tc>
+          <w:tcPr>
+            <w:tcW w:type="dxa" w:w="1938"/>
+          </w:tcPr>
+          <w:p/>
+        </w:tc>
+        <w:tc>
+          <w:tcPr>
+            <w:tcW w:type="dxa" w:w="1938"/>
+          </w:tcPr>
+          <w:p/>
+        </w:tc>
+      </w:tr>
+      <w:tr>
+        <w:tc>
+          <w:tcPr>
+            <w:tcW w:type="dxa" w:w="1938"/>
+          </w:tcPr>
+          <w:p>
+            <w:r>
+              <w:rPr/>
+              <w:t>15</w:t>
+            </w:r>
+          </w:p>
+        </w:tc>
+        <w:tc>
+          <w:tcPr>
+            <w:tcW w:type="dxa" w:w="1938"/>
+          </w:tcPr>
+          <w:p/>
+        </w:tc>
+        <w:tc>
+          <w:tcPr>
+            <w:tcW w:type="dxa" w:w="1938"/>
+          </w:tcPr>
+          <w:p/>
+        </w:tc>
+        <w:tc>
+          <w:tcPr>
+            <w:tcW w:type="dxa" w:w="1938"/>
+          </w:tcPr>
+          <w:p/>
+        </w:tc>
+        <w:tc>
+          <w:tcPr>
+            <w:tcW w:type="dxa" w:w="1938"/>
+          </w:tcPr>
+          <w:p/>
+        </w:tc>
+      </w:tr>
+      <w:tr>
+        <w:tc>
+          <w:tcPr>
+            <w:tcW w:type="dxa" w:w="1938"/>
+          </w:tcPr>
+          <w:p>
+            <w:r>
+              <w:rPr/>
+              <w:t>16</w:t>
+            </w:r>
+          </w:p>
+        </w:tc>
+        <w:tc>
+          <w:tcPr>
+            <w:tcW w:type="dxa" w:w="1938"/>
+          </w:tcPr>
+          <w:p/>
+        </w:tc>
+        <w:tc>
+          <w:tcPr>
+            <w:tcW w:type="dxa" w:w="1938"/>
+          </w:tcPr>
+          <w:p/>
+        </w:tc>
+        <w:tc>
+          <w:tcPr>
+            <w:tcW w:type="dxa" w:w="1938"/>
+          </w:tcPr>
+          <w:p/>
+        </w:tc>
+        <w:tc>
+          <w:tcPr>
+            <w:tcW w:type="dxa" w:w="1938"/>
+          </w:tcPr>
+          <w:p/>
+        </w:tc>
+      </w:tr>
+      <w:tr>
+        <w:tc>
+          <w:tcPr>
+            <w:tcW w:type="dxa" w:w="1938"/>
+          </w:tcPr>
+          <w:p>
+            <w:r>
+              <w:rPr/>
+              <w:t>17</w:t>
+            </w:r>
+          </w:p>
+        </w:tc>
+        <w:tc>
+          <w:tcPr>
+            <w:tcW w:type="dxa" w:w="1938"/>
+          </w:tcPr>
+          <w:p/>
+        </w:tc>
+        <w:tc>
+          <w:tcPr>
+            <w:tcW w:type="dxa" w:w="1938"/>
+          </w:tcPr>
+          <w:p/>
+        </w:tc>
+        <w:tc>
+          <w:tcPr>
+            <w:tcW w:type="dxa" w:w="1938"/>
+          </w:tcPr>
+          <w:p/>
+        </w:tc>
+        <w:tc>
+          <w:tcPr>
+            <w:tcW w:type="dxa" w:w="1938"/>
+          </w:tcPr>
+          <w:p/>
+        </w:tc>
+      </w:tr>
+      <w:tr>
+        <w:tc>
+          <w:tcPr>
+            <w:tcW w:type="dxa" w:w="1938"/>
+          </w:tcPr>
+          <w:p>
+            <w:r>
+              <w:rPr/>
+              <w:t>18</w:t>
+            </w:r>
+          </w:p>
+        </w:tc>
+        <w:tc>
+          <w:tcPr>
+            <w:tcW w:type="dxa" w:w="1938"/>
+          </w:tcPr>
+          <w:p/>
+        </w:tc>
+        <w:tc>
+          <w:tcPr>
+            <w:tcW w:type="dxa" w:w="1938"/>
+          </w:tcPr>
+          <w:p/>
+        </w:tc>
+        <w:tc>
+          <w:tcPr>
+            <w:tcW w:type="dxa" w:w="1938"/>
+          </w:tcPr>
+          <w:p/>
+        </w:tc>
+        <w:tc>
+          <w:tcPr>
+            <w:tcW w:type="dxa" w:w="1938"/>
+          </w:tcPr>
+          <w:p/>
+        </w:tc>
+      </w:tr>
+      <w:tr>
+        <w:tc>
+          <w:tcPr>
+            <w:tcW w:type="dxa" w:w="1938"/>
+          </w:tcPr>
+          <w:p>
+            <w:r>
+              <w:rPr/>
+              <w:t>19</w:t>
+            </w:r>
+          </w:p>
+        </w:tc>
+        <w:tc>
+          <w:tcPr>
+            <w:tcW w:type="dxa" w:w="1938"/>
+          </w:tcPr>
+          <w:p/>
+        </w:tc>
+        <w:tc>
+          <w:tcPr>
+            <w:tcW w:type="dxa" w:w="1938"/>
+          </w:tcPr>
+          <w:p/>
+        </w:tc>
+        <w:tc>
+          <w:tcPr>
+            <w:tcW w:type="dxa" w:w="1938"/>
+          </w:tcPr>
+          <w:p/>
+        </w:tc>
+        <w:tc>
+          <w:tcPr>
+            <w:tcW w:type="dxa" w:w="1938"/>
+          </w:tcPr>
+          <w:p/>
+        </w:tc>
+      </w:tr>
+      <w:tr>
+        <w:tc>
+          <w:tcPr>
+            <w:tcW w:type="dxa" w:w="1938"/>
+          </w:tcPr>
+          <w:p>
+            <w:r>
+              <w:rPr/>
+              <w:t>20</w:t>
+            </w:r>
+          </w:p>
+        </w:tc>
+        <w:tc>
+          <w:tcPr>
+            <w:tcW w:type="dxa" w:w="1938"/>
+          </w:tcPr>
+          <w:p/>
+        </w:tc>
+        <w:tc>
+          <w:tcPr>
+            <w:tcW w:type="dxa" w:w="1938"/>
+          </w:tcPr>
+          <w:p/>
+        </w:tc>
+        <w:tc>
+          <w:tcPr>
+            <w:tcW w:type="dxa" w:w="1938"/>
+          </w:tcPr>
+          <w:p/>
+        </w:tc>
+        <w:tc>
+          <w:tcPr>
+            <w:tcW w:type="dxa" w:w="1938"/>
+          </w:tcPr>
+          <w:p/>
+        </w:tc>
+      </w:tr>
+      <w:tr>
+        <w:tc>
+          <w:tcPr>
+            <w:tcW w:type="dxa" w:w="1938"/>
+          </w:tcPr>
+          <w:p>
+            <w:r>
+              <w:rPr/>
+              <w:t>21</w:t>
+            </w:r>
+          </w:p>
+        </w:tc>
+        <w:tc>
+          <w:tcPr>
+            <w:tcW w:type="dxa" w:w="1938"/>
+          </w:tcPr>
+          <w:p/>
+        </w:tc>
+        <w:tc>
+          <w:tcPr>
+            <w:tcW w:type="dxa" w:w="1938"/>
+          </w:tcPr>
+          <w:p/>
+        </w:tc>
+        <w:tc>
+          <w:tcPr>
+            <w:tcW w:type="dxa" w:w="1938"/>
+          </w:tcPr>
+          <w:p/>
+        </w:tc>
+        <w:tc>
+          <w:tcPr>
+            <w:tcW w:type="dxa" w:w="1938"/>
+          </w:tcPr>
+          <w:p/>
+        </w:tc>
+      </w:tr>
+      <w:tr>
+        <w:tc>
+          <w:tcPr>
+            <w:tcW w:type="dxa" w:w="1938"/>
+          </w:tcPr>
+          <w:p>
+            <w:r>
+              <w:rPr/>
+              <w:t>22</w:t>
+            </w:r>
+          </w:p>
+        </w:tc>
+        <w:tc>
+          <w:tcPr>
+            <w:tcW w:type="dxa" w:w="1938"/>
+          </w:tcPr>
+          <w:p/>
+        </w:tc>
+        <w:tc>
+          <w:tcPr>
+            <w:tcW w:type="dxa" w:w="1938"/>
+          </w:tcPr>
+          <w:p/>
+        </w:tc>
+        <w:tc>
+          <w:tcPr>
+            <w:tcW w:type="dxa" w:w="1938"/>
+          </w:tcPr>
+          <w:p/>
+        </w:tc>
+        <w:tc>
+          <w:tcPr>
+            <w:tcW w:type="dxa" w:w="1938"/>
+          </w:tcPr>
+          <w:p/>
+        </w:tc>
+      </w:tr>
+      <w:tr>
+        <w:tc>
+          <w:tcPr>
+            <w:tcW w:type="dxa" w:w="1938"/>
+          </w:tcPr>
+          <w:p>
+            <w:r>
+              <w:rPr/>
+              <w:t>23</w:t>
+            </w:r>
+          </w:p>
+        </w:tc>
+        <w:tc>
+          <w:tcPr>
+            <w:tcW w:type="dxa" w:w="1938"/>
+          </w:tcPr>
+          <w:p/>
+        </w:tc>
+        <w:tc>
+          <w:tcPr>
+            <w:tcW w:type="dxa" w:w="1938"/>
+          </w:tcPr>
+          <w:p/>
+        </w:tc>
+        <w:tc>
+          <w:tcPr>
+            <w:tcW w:type="dxa" w:w="1938"/>
+          </w:tcPr>
+          <w:p/>
+        </w:tc>
+        <w:tc>
+          <w:tcPr>
+            <w:tcW w:type="dxa" w:w="1938"/>
+          </w:tcPr>
+          <w:p/>
+        </w:tc>
+      </w:tr>
+      <w:tr>
+        <w:tc>
+          <w:tcPr>
+            <w:tcW w:type="dxa" w:w="1938"/>
+          </w:tcPr>
+          <w:p>
+            <w:r>
+              <w:rPr/>
+              <w:t>24</w:t>
+            </w:r>
+          </w:p>
+        </w:tc>
+        <w:tc>
+          <w:tcPr>
+            <w:tcW w:type="dxa" w:w="1938"/>
+          </w:tcPr>
+          <w:p/>
+        </w:tc>
+        <w:tc>
+          <w:tcPr>
+            <w:tcW w:type="dxa" w:w="1938"/>
+          </w:tcPr>
+          <w:p/>
+        </w:tc>
+        <w:tc>
+          <w:tcPr>
+            <w:tcW w:type="dxa" w:w="1938"/>
+          </w:tcPr>
+          <w:p/>
+        </w:tc>
+        <w:tc>
+          <w:tcPr>
+            <w:tcW w:type="dxa" w:w="1938"/>
+          </w:tcPr>
+          <w:p/>
+        </w:tc>
+      </w:tr>
+      <w:tr>
+        <w:tc>
+          <w:tcPr>
+            <w:tcW w:type="dxa" w:w="1938"/>
+          </w:tcPr>
+          <w:p>
+            <w:r>
+              <w:rPr/>
+              <w:t>25</w:t>
+            </w:r>
+          </w:p>
+        </w:tc>
+        <w:tc>
+          <w:tcPr>
+            <w:tcW w:type="dxa" w:w="1938"/>
+          </w:tcPr>
+          <w:p/>
+        </w:tc>
+        <w:tc>
+          <w:tcPr>
+            <w:tcW w:type="dxa" w:w="1938"/>
+          </w:tcPr>
+          <w:p/>
+        </w:tc>
+        <w:tc>
+          <w:tcPr>
+            <w:tcW w:type="dxa" w:w="1938"/>
+          </w:tcPr>
+          <w:p/>
+        </w:tc>
+        <w:tc>
+          <w:tcPr>
+            <w:tcW w:type="dxa" w:w="1938"/>
+          </w:tcPr>
+          <w:p/>
+        </w:tc>
+      </w:tr>
+      <w:tr>
+        <w:tc>
+          <w:tcPr>
+            <w:tcW w:type="dxa" w:w="1938"/>
+          </w:tcPr>
+          <w:p>
+            <w:r>
+              <w:rPr/>
+              <w:t>26</w:t>
+            </w:r>
+          </w:p>
+        </w:tc>
+        <w:tc>
+          <w:tcPr>
+            <w:tcW w:type="dxa" w:w="1938"/>
+          </w:tcPr>
+          <w:p/>
+        </w:tc>
+        <w:tc>
+          <w:tcPr>
+            <w:tcW w:type="dxa" w:w="1938"/>
+          </w:tcPr>
+          <w:p/>
+        </w:tc>
+        <w:tc>
+          <w:tcPr>
+            <w:tcW w:type="dxa" w:w="1938"/>
+          </w:tcPr>
+          <w:p/>
+        </w:tc>
+        <w:tc>
+          <w:tcPr>
+            <w:tcW w:type="dxa" w:w="1938"/>
+          </w:tcPr>
+          <w:p/>
+        </w:tc>
+      </w:tr>
+      <w:tr>
+        <w:tc>
+          <w:tcPr>
+            <w:tcW w:type="dxa" w:w="1938"/>
+          </w:tcPr>
+          <w:p>
+            <w:r>
+              <w:rPr/>
+              <w:t>27</w:t>
+            </w:r>
+          </w:p>
+        </w:tc>
+        <w:tc>
+          <w:tcPr>
+            <w:tcW w:type="dxa" w:w="1938"/>
+          </w:tcPr>
+          <w:p/>
+        </w:tc>
+        <w:tc>
+          <w:tcPr>
+            <w:tcW w:type="dxa" w:w="1938"/>
+          </w:tcPr>
+          <w:p/>
+        </w:tc>
+        <w:tc>
+          <w:tcPr>
+            <w:tcW w:type="dxa" w:w="1938"/>
+          </w:tcPr>
+          <w:p/>
+        </w:tc>
+        <w:tc>
+          <w:tcPr>
+            <w:tcW w:type="dxa" w:w="1938"/>
+          </w:tcPr>
+          <w:p/>
+        </w:tc>
+      </w:tr>
+      <w:tr>
+        <w:tc>
+          <w:tcPr>
+            <w:tcW w:type="dxa" w:w="1938"/>
+          </w:tcPr>
+          <w:p>
+            <w:r>
+              <w:rPr/>
+              <w:t>28</w:t>
+            </w:r>
+          </w:p>
+        </w:tc>
+        <w:tc>
+          <w:tcPr>
+            <w:tcW w:type="dxa" w:w="1938"/>
+          </w:tcPr>
+          <w:p/>
+        </w:tc>
+        <w:tc>
+          <w:tcPr>
+            <w:tcW w:type="dxa" w:w="1938"/>
+          </w:tcPr>
+          <w:p/>
+        </w:tc>
+        <w:tc>
+          <w:tcPr>
+            <w:tcW w:type="dxa" w:w="1938"/>
+          </w:tcPr>
+          <w:p/>
+        </w:tc>
+        <w:tc>
+          <w:tcPr>
+            <w:tcW w:type="dxa" w:w="1938"/>
+          </w:tcPr>
+          <w:p/>
+        </w:tc>
+      </w:tr>
+      <w:tr>
+        <w:tc>
+          <w:tcPr>
+            <w:tcW w:type="dxa" w:w="1938"/>
+          </w:tcPr>
+          <w:p>
+            <w:r>
+              <w:rPr/>
+              <w:t>29</w:t>
+            </w:r>
+          </w:p>
+        </w:tc>
+        <w:tc>
+          <w:tcPr>
+            <w:tcW w:type="dxa" w:w="1938"/>
+          </w:tcPr>
+          <w:p/>
+        </w:tc>
+        <w:tc>
+          <w:tcPr>
+            <w:tcW w:type="dxa" w:w="1938"/>
+          </w:tcPr>
+          <w:p/>
+        </w:tc>
+        <w:tc>
+          <w:tcPr>
+            <w:tcW w:type="dxa" w:w="1938"/>
+          </w:tcPr>
+          <w:p/>
+        </w:tc>
+        <w:tc>
+          <w:tcPr>
+            <w:tcW w:type="dxa" w:w="1938"/>
+          </w:tcPr>
+          <w:p/>
+        </w:tc>
+      </w:tr>
+      <w:tr>
+        <w:tc>
+          <w:tcPr>
+            <w:tcW w:type="dxa" w:w="1938"/>
+          </w:tcPr>
+          <w:p>
+            <w:r>
+              <w:rPr/>
+              <w:t>30</w:t>
+            </w:r>
+          </w:p>
+        </w:tc>
+        <w:tc>
+          <w:tcPr>
+            <w:tcW w:type="dxa" w:w="1938"/>
+          </w:tcPr>
+          <w:p/>
+        </w:tc>
+        <w:tc>
+          <w:tcPr>
+            <w:tcW w:type="dxa" w:w="1938"/>
+          </w:tcPr>
+          <w:p/>
+        </w:tc>
+        <w:tc>
+          <w:tcPr>
+            <w:tcW w:type="dxa" w:w="1938"/>
+          </w:tcPr>
+          <w:p/>
+        </w:tc>
+        <w:tc>
+          <w:tcPr>
+            <w:tcW w:type="dxa" w:w="1938"/>
+          </w:tcPr>
+          <w:p/>
+        </w:tc>
+      </w:tr>
+      <w:tr>
+        <w:tc>
+          <w:tcPr>
+            <w:tcW w:type="dxa" w:w="1938"/>
+          </w:tcPr>
+          <w:p>
+            <w:r>
+              <w:rPr/>
+              <w:t>31</w:t>
+            </w:r>
+          </w:p>
+        </w:tc>
+        <w:tc>
+          <w:tcPr>
+            <w:tcW w:type="dxa" w:w="1938"/>
+          </w:tcPr>
+          <w:p/>
+        </w:tc>
+        <w:tc>
+          <w:tcPr>
+            <w:tcW w:type="dxa" w:w="1938"/>
+          </w:tcPr>
+          <w:p/>
+        </w:tc>
+        <w:tc>
+          <w:tcPr>
+            <w:tcW w:type="dxa" w:w="1938"/>
+          </w:tcPr>
+          <w:p/>
+        </w:tc>
+        <w:tc>
+          <w:tcPr>
+            <w:tcW w:type="dxa" w:w="1938"/>
+          </w:tcPr>
+          <w:p/>
+        </w:tc>
+      </w:tr>
+      <w:tr>
+        <w:tc>
+          <w:tcPr>
+            <w:tcW w:type="dxa" w:w="1938"/>
+          </w:tcPr>
+          <w:p>
+            <w:r>
+              <w:rPr/>
+              <w:t>32</w:t>
+            </w:r>
+          </w:p>
+        </w:tc>
+        <w:tc>
+          <w:tcPr>
+            <w:tcW w:type="dxa" w:w="1938"/>
+          </w:tcPr>
+          <w:p/>
+        </w:tc>
+        <w:tc>
+          <w:tcPr>
+            <w:tcW w:type="dxa" w:w="1938"/>
+          </w:tcPr>
+          <w:p/>
+        </w:tc>
+        <w:tc>
+          <w:tcPr>
+            <w:tcW w:type="dxa" w:w="1938"/>
+          </w:tcPr>
+          <w:p/>
+        </w:tc>
+        <w:tc>
+          <w:tcPr>
+            <w:tcW w:type="dxa" w:w="1938"/>
+          </w:tcPr>
+          <w:p/>
+        </w:tc>
+      </w:tr>
+      <w:tr>
+        <w:tc>
+          <w:tcPr>
+            <w:tcW w:type="dxa" w:w="1938"/>
+          </w:tcPr>
+          <w:p>
+            <w:r>
+              <w:rPr/>
+              <w:t>33</w:t>
+            </w:r>
+          </w:p>
+        </w:tc>
+        <w:tc>
+          <w:tcPr>
+            <w:tcW w:type="dxa" w:w="1938"/>
+          </w:tcPr>
+          <w:p/>
+        </w:tc>
+        <w:tc>
+          <w:tcPr>
+            <w:tcW w:type="dxa" w:w="1938"/>
+          </w:tcPr>
+          <w:p/>
+        </w:tc>
+        <w:tc>
+          <w:tcPr>
+            <w:tcW w:type="dxa" w:w="1938"/>
+          </w:tcPr>
+          <w:p/>
+        </w:tc>
+        <w:tc>
+          <w:tcPr>
+            <w:tcW w:type="dxa" w:w="1938"/>
+          </w:tcPr>
+          <w:p/>
+        </w:tc>
+      </w:tr>
+      <w:tr>
+        <w:tc>
+          <w:tcPr>
+            <w:tcW w:type="dxa" w:w="1938"/>
+          </w:tcPr>
+          <w:p>
+            <w:r>
+              <w:rPr/>
+              <w:t>34</w:t>
+            </w:r>
+          </w:p>
+        </w:tc>
+        <w:tc>
+          <w:tcPr>
+            <w:tcW w:type="dxa" w:w="1938"/>
+          </w:tcPr>
+          <w:p/>
+        </w:tc>
+        <w:tc>
+          <w:tcPr>
+            <w:tcW w:type="dxa" w:w="1938"/>
+          </w:tcPr>
+          <w:p/>
+        </w:tc>
+        <w:tc>
+          <w:tcPr>
+            <w:tcW w:type="dxa" w:w="1938"/>
+          </w:tcPr>
+          <w:p/>
+        </w:tc>
+        <w:tc>
+          <w:tcPr>
+            <w:tcW w:type="dxa" w:w="1938"/>
+          </w:tcPr>
+          <w:p/>
+        </w:tc>
+      </w:tr>
+      <w:tr>
+        <w:tc>
+          <w:tcPr>
+            <w:tcW w:type="dxa" w:w="1938"/>
+          </w:tcPr>
+          <w:p>
+            <w:r>
+              <w:rPr/>
+              <w:t>35</w:t>
+            </w:r>
+          </w:p>
+        </w:tc>
+        <w:tc>
+          <w:tcPr>
+            <w:tcW w:type="dxa" w:w="1938"/>
+          </w:tcPr>
+          <w:p/>
+        </w:tc>
+        <w:tc>
+          <w:tcPr>
+            <w:tcW w:type="dxa" w:w="1938"/>
+          </w:tcPr>
+          <w:p/>
+        </w:tc>
+        <w:tc>
+          <w:tcPr>
+            <w:tcW w:type="dxa" w:w="1938"/>
+          </w:tcPr>
+          <w:p/>
+        </w:tc>
+        <w:tc>
+          <w:tcPr>
+            <w:tcW w:type="dxa" w:w="1938"/>
+          </w:tcPr>
+          <w:p/>
+        </w:tc>
+      </w:tr>
+      <w:tr>
+        <w:tc>
+          <w:tcPr>
+            <w:tcW w:type="dxa" w:w="1938"/>
+          </w:tcPr>
+          <w:p>
+            <w:r>
+              <w:rPr/>
+              <w:t>36</w:t>
+            </w:r>
+          </w:p>
+        </w:tc>
+        <w:tc>
+          <w:tcPr>
+            <w:tcW w:type="dxa" w:w="1938"/>
+          </w:tcPr>
+          <w:p/>
+        </w:tc>
+        <w:tc>
+          <w:tcPr>
+            <w:tcW w:type="dxa" w:w="1938"/>
+          </w:tcPr>
+          <w:p/>
+        </w:tc>
+        <w:tc>
+          <w:tcPr>
+            <w:tcW w:type="dxa" w:w="1938"/>
+          </w:tcPr>
+          <w:p/>
+        </w:tc>
+        <w:tc>
+          <w:tcPr>
+            <w:tcW w:type="dxa" w:w="1938"/>
+          </w:tcPr>
+          <w:p/>
+        </w:tc>
+      </w:tr>
+      <w:tr>
+        <w:tc>
+          <w:tcPr>
+            <w:tcW w:type="dxa" w:w="1938"/>
+          </w:tcPr>
+          <w:p>
+            <w:r>
+              <w:rPr/>
+              <w:t>37</w:t>
+            </w:r>
+          </w:p>
+        </w:tc>
+        <w:tc>
+          <w:tcPr>
+            <w:tcW w:type="dxa" w:w="1938"/>
+          </w:tcPr>
+          <w:p/>
+        </w:tc>
+        <w:tc>
+          <w:tcPr>
+            <w:tcW w:type="dxa" w:w="1938"/>
+          </w:tcPr>
+          <w:p/>
+        </w:tc>
+        <w:tc>
+          <w:tcPr>
+            <w:tcW w:type="dxa" w:w="1938"/>
+          </w:tcPr>
+          <w:p/>
+        </w:tc>
+        <w:tc>
+          <w:tcPr>
+            <w:tcW w:type="dxa" w:w="1938"/>
+          </w:tcPr>
+          <w:p/>
+        </w:tc>
+      </w:tr>
+      <w:tr>
+        <w:tc>
+          <w:tcPr>
+            <w:tcW w:type="dxa" w:w="1938"/>
+          </w:tcPr>
+          <w:p>
+            <w:r>
+              <w:rPr/>
+              <w:t>38</w:t>
+            </w:r>
+          </w:p>
+        </w:tc>
+        <w:tc>
+          <w:tcPr>
+            <w:tcW w:type="dxa" w:w="1938"/>
+          </w:tcPr>
+          <w:p/>
+        </w:tc>
+        <w:tc>
+          <w:tcPr>
+            <w:tcW w:type="dxa" w:w="1938"/>
+          </w:tcPr>
+          <w:p/>
+        </w:tc>
+        <w:tc>
+          <w:tcPr>
+            <w:tcW w:type="dxa" w:w="1938"/>
+          </w:tcPr>
+          <w:p/>
+        </w:tc>
+        <w:tc>
+          <w:tcPr>
+            <w:tcW w:type="dxa" w:w="1938"/>
+          </w:tcPr>
+          <w:p/>
+        </w:tc>
+      </w:tr>
+      <w:tr>
+        <w:tc>
+          <w:tcPr>
+            <w:tcW w:type="dxa" w:w="1938"/>
+          </w:tcPr>
+          <w:p>
+            <w:r>
+              <w:rPr/>
+              <w:t>39</w:t>
+            </w:r>
+          </w:p>
+        </w:tc>
+        <w:tc>
+          <w:tcPr>
+            <w:tcW w:type="dxa" w:w="1938"/>
+          </w:tcPr>
+          <w:p/>
+        </w:tc>
+        <w:tc>
+          <w:tcPr>
+            <w:tcW w:type="dxa" w:w="1938"/>
+          </w:tcPr>
+          <w:p/>
+        </w:tc>
+        <w:tc>
+          <w:tcPr>
+            <w:tcW w:type="dxa" w:w="1938"/>
+          </w:tcPr>
+          <w:p/>
+        </w:tc>
+        <w:tc>
+          <w:tcPr>
+            <w:tcW w:type="dxa" w:w="1938"/>
+          </w:tcPr>
+          <w:p/>
+        </w:tc>
+      </w:tr>
+      <w:tr>
+        <w:tc>
+          <w:tcPr>
+            <w:tcW w:type="dxa" w:w="1938"/>
+          </w:tcPr>
+          <w:p>
+            <w:r>
+              <w:rPr/>
+              <w:t>40</w:t>
+            </w:r>
+          </w:p>
+        </w:tc>
+        <w:tc>
+          <w:tcPr>
+            <w:tcW w:type="dxa" w:w="1938"/>
+          </w:tcPr>
+          <w:p/>
+        </w:tc>
+        <w:tc>
+          <w:tcPr>
+            <w:tcW w:type="dxa" w:w="1938"/>
+          </w:tcPr>
+          <w:p/>
+        </w:tc>
+        <w:tc>
+          <w:tcPr>
+            <w:tcW w:type="dxa" w:w="1938"/>
+          </w:tcPr>
+          <w:p/>
+        </w:tc>
+        <w:tc>
+          <w:tcPr>
+            <w:tcW w:type="dxa" w:w="1938"/>
+          </w:tcPr>
+          <w:p/>
+        </w:tc>
+      </w:tr>
+      <w:tr>
+        <w:tc>
+          <w:tcPr>
+            <w:tcW w:type="dxa" w:w="1938"/>
+          </w:tcPr>
+          <w:p>
+            <w:r>
+              <w:rPr/>
+              <w:t>41</w:t>
+            </w:r>
+          </w:p>
+        </w:tc>
+        <w:tc>
+          <w:tcPr>
+            <w:tcW w:type="dxa" w:w="1938"/>
+          </w:tcPr>
+          <w:p/>
+        </w:tc>
+        <w:tc>
+          <w:tcPr>
+            <w:tcW w:type="dxa" w:w="1938"/>
+          </w:tcPr>
+          <w:p/>
+        </w:tc>
+        <w:tc>
+          <w:tcPr>
+            <w:tcW w:type="dxa" w:w="1938"/>
+          </w:tcPr>
+          <w:p/>
+        </w:tc>
+        <w:tc>
+          <w:tcPr>
+            <w:tcW w:type="dxa" w:w="1938"/>
+          </w:tcPr>
+          <w:p/>
+        </w:tc>
+      </w:tr>
+      <w:tr>
+        <w:tc>
+          <w:tcPr>
+            <w:tcW w:type="dxa" w:w="1938"/>
+          </w:tcPr>
+          <w:p>
+            <w:r>
+              <w:rPr/>
+              <w:t>42</w:t>
+            </w:r>
+          </w:p>
+        </w:tc>
+        <w:tc>
+          <w:tcPr>
+            <w:tcW w:type="dxa" w:w="1938"/>
+          </w:tcPr>
+          <w:p/>
+        </w:tc>
+        <w:tc>
+          <w:tcPr>
+            <w:tcW w:type="dxa" w:w="1938"/>
+          </w:tcPr>
+          <w:p/>
+        </w:tc>
+        <w:tc>
+          <w:tcPr>
+            <w:tcW w:type="dxa" w:w="1938"/>
+          </w:tcPr>
+          <w:p/>
+        </w:tc>
+        <w:tc>
+          <w:tcPr>
+            <w:tcW w:type="dxa" w:w="1938"/>
+          </w:tcPr>
+          <w:p/>
+        </w:tc>
+      </w:tr>
+      <w:tr>
+        <w:tc>
+          <w:tcPr>
+            <w:tcW w:type="dxa" w:w="1938"/>
+          </w:tcPr>
+          <w:p>
+            <w:r>
+              <w:rPr/>
+              <w:t>43</w:t>
+            </w:r>
+          </w:p>
+        </w:tc>
+        <w:tc>
+          <w:tcPr>
+            <w:tcW w:type="dxa" w:w="1938"/>
+          </w:tcPr>
+          <w:p/>
+        </w:tc>
+        <w:tc>
+          <w:tcPr>
+            <w:tcW w:type="dxa" w:w="1938"/>
+          </w:tcPr>
+          <w:p/>
+        </w:tc>
+        <w:tc>
+          <w:tcPr>
+            <w:tcW w:type="dxa" w:w="1938"/>
+          </w:tcPr>
+          <w:p/>
+        </w:tc>
+        <w:tc>
+          <w:tcPr>
+            <w:tcW w:type="dxa" w:w="1938"/>
+          </w:tcPr>
+          <w:p/>
+        </w:tc>
+      </w:tr>
+      <w:tr>
+        <w:tc>
+          <w:tcPr>
+            <w:tcW w:type="dxa" w:w="1938"/>
+          </w:tcPr>
+          <w:p>
+            <w:r>
+              <w:rPr/>
+              <w:t>44</w:t>
+            </w:r>
+          </w:p>
+        </w:tc>
+        <w:tc>
+          <w:tcPr>
+            <w:tcW w:type="dxa" w:w="1938"/>
+          </w:tcPr>
+          <w:p/>
+        </w:tc>
+        <w:tc>
+          <w:tcPr>
+            <w:tcW w:type="dxa" w:w="1938"/>
+          </w:tcPr>
+          <w:p/>
+        </w:tc>
+        <w:tc>
+          <w:tcPr>
+            <w:tcW w:type="dxa" w:w="1938"/>
+          </w:tcPr>
+          <w:p/>
+        </w:tc>
+        <w:tc>
+          <w:tcPr>
+            <w:tcW w:type="dxa" w:w="1938"/>
+          </w:tcPr>
+          <w:p/>
+        </w:tc>
+      </w:tr>
+      <w:tr>
+        <w:tc>
+          <w:tcPr>
+            <w:tcW w:type="dxa" w:w="1938"/>
+          </w:tcPr>
+          <w:p>
+            <w:r>
+              <w:rPr/>
+              <w:t>45</w:t>
+            </w:r>
+          </w:p>
+        </w:tc>
+        <w:tc>
+          <w:tcPr>
+            <w:tcW w:type="dxa" w:w="1938"/>
+          </w:tcPr>
+          <w:p/>
+        </w:tc>
+        <w:tc>
+          <w:tcPr>
+            <w:tcW w:type="dxa" w:w="1938"/>
+          </w:tcPr>
+          <w:p/>
+        </w:tc>
+        <w:tc>
+          <w:tcPr>
+            <w:tcW w:type="dxa" w:w="1938"/>
+          </w:tcPr>
+          <w:p/>
+        </w:tc>
+        <w:tc>
+          <w:tcPr>
+            <w:tcW w:type="dxa" w:w="1938"/>
+          </w:tcPr>
+          <w:p/>
+        </w:tc>
+      </w:tr>
+      <w:tr>
+        <w:tc>
+          <w:tcPr>
+            <w:tcW w:type="dxa" w:w="1938"/>
+          </w:tcPr>
+          <w:p>
+            <w:r>
+              <w:rPr/>
+              <w:t>46</w:t>
+            </w:r>
+          </w:p>
+        </w:tc>
+        <w:tc>
+          <w:tcPr>
+            <w:tcW w:type="dxa" w:w="1938"/>
+          </w:tcPr>
+          <w:p/>
+        </w:tc>
+        <w:tc>
+          <w:tcPr>
+            <w:tcW w:type="dxa" w:w="1938"/>
+          </w:tcPr>
+          <w:p/>
+        </w:tc>
+        <w:tc>
+          <w:tcPr>
+            <w:tcW w:type="dxa" w:w="1938"/>
+          </w:tcPr>
+          <w:p/>
+        </w:tc>
+        <w:tc>
+          <w:tcPr>
+            <w:tcW w:type="dxa" w:w="1938"/>
+          </w:tcPr>
+          <w:p/>
+        </w:tc>
+      </w:tr>
+      <w:tr>
+        <w:tc>
+          <w:tcPr>
+            <w:tcW w:type="dxa" w:w="1938"/>
+          </w:tcPr>
+          <w:p>
+            <w:r>
+              <w:rPr/>
+              <w:t>47</w:t>
+            </w:r>
+          </w:p>
+        </w:tc>
+        <w:tc>
+          <w:tcPr>
+            <w:tcW w:type="dxa" w:w="1938"/>
+          </w:tcPr>
+          <w:p/>
+        </w:tc>
+        <w:tc>
+          <w:tcPr>
+            <w:tcW w:type="dxa" w:w="1938"/>
+          </w:tcPr>
+          <w:p/>
+        </w:tc>
+        <w:tc>
+          <w:tcPr>
+            <w:tcW w:type="dxa" w:w="1938"/>
+          </w:tcPr>
+          <w:p/>
+        </w:tc>
+        <w:tc>
+          <w:tcPr>
+            <w:tcW w:type="dxa" w:w="1938"/>
+          </w:tcPr>
+          <w:p/>
+        </w:tc>
+      </w:tr>
+      <w:tr>
+        <w:tc>
+          <w:tcPr>
+            <w:tcW w:type="dxa" w:w="1938"/>
+          </w:tcPr>
+          <w:p>
+            <w:r>
+              <w:rPr/>
+              <w:t>48</w:t>
+            </w:r>
+          </w:p>
+        </w:tc>
+        <w:tc>
+          <w:tcPr>
+            <w:tcW w:type="dxa" w:w="1938"/>
+          </w:tcPr>
+          <w:p/>
+        </w:tc>
+        <w:tc>
+          <w:tcPr>
+            <w:tcW w:type="dxa" w:w="1938"/>
+          </w:tcPr>
+          <w:p/>
+        </w:tc>
+        <w:tc>
+          <w:tcPr>
+            <w:tcW w:type="dxa" w:w="1938"/>
+          </w:tcPr>
+          <w:p/>
+        </w:tc>
+        <w:tc>
+          <w:tcPr>
+            <w:tcW w:type="dxa" w:w="1938"/>
+          </w:tcPr>
+          <w:p/>
+        </w:tc>
+      </w:tr>
+      <w:tr>
+        <w:tc>
+          <w:tcPr>
+            <w:tcW w:type="dxa" w:w="1938"/>
+          </w:tcPr>
+          <w:p>
+            <w:r>
+              <w:rPr/>
+              <w:t>49</w:t>
+            </w:r>
+          </w:p>
+        </w:tc>
+        <w:tc>
+          <w:tcPr>
+            <w:tcW w:type="dxa" w:w="1938"/>
+          </w:tcPr>
+          <w:p/>
+        </w:tc>
+        <w:tc>
+          <w:tcPr>
+            <w:tcW w:type="dxa" w:w="1938"/>
+          </w:tcPr>
+          <w:p/>
+        </w:tc>
+        <w:tc>
+          <w:tcPr>
+            <w:tcW w:type="dxa" w:w="1938"/>
+          </w:tcPr>
+          <w:p/>
+        </w:tc>
+        <w:tc>
+          <w:tcPr>
+            <w:tcW w:type="dxa" w:w="1938"/>
+          </w:tcPr>
+          <w:p/>
+        </w:tc>
+      </w:tr>
+      <w:tr>
+        <w:tc>
+          <w:tcPr>
+            <w:tcW w:type="dxa" w:w="1938"/>
+          </w:tcPr>
+          <w:p>
+            <w:r>
+              <w:rPr/>
+              <w:t>50</w:t>
+            </w:r>
+          </w:p>
+        </w:tc>
+        <w:tc>
+          <w:tcPr>
+            <w:tcW w:type="dxa" w:w="1938"/>
+          </w:tcPr>
+          <w:p/>
+        </w:tc>
+        <w:tc>
+          <w:tcPr>
+            <w:tcW w:type="dxa" w:w="1938"/>
+          </w:tcPr>
+          <w:p/>
+        </w:tc>
+        <w:tc>
+          <w:tcPr>
+            <w:tcW w:type="dxa" w:w="1938"/>
+          </w:tcPr>
+          <w:p/>
+        </w:tc>
+        <w:tc>
+          <w:tcPr>
+            <w:tcW w:type="dxa" w:w="1938"/>
+          </w:tcPr>
+          <w:p/>
+        </w:tc>
+      </w:tr>
+      <w:tr>
+        <w:tc>
+          <w:tcPr>
+            <w:tcW w:type="dxa" w:w="1938"/>
+          </w:tcPr>
+          <w:p>
+            <w:r>
+              <w:rPr/>
+              <w:t>51</w:t>
+            </w:r>
+          </w:p>
+        </w:tc>
+        <w:tc>
+          <w:tcPr>
+            <w:tcW w:type="dxa" w:w="1938"/>
+          </w:tcPr>
+          <w:p/>
+        </w:tc>
+        <w:tc>
+          <w:tcPr>
+            <w:tcW w:type="dxa" w:w="1938"/>
+          </w:tcPr>
+          <w:p/>
+        </w:tc>
+        <w:tc>
+          <w:tcPr>
+            <w:tcW w:type="dxa" w:w="1938"/>
+          </w:tcPr>
+          <w:p/>
+        </w:tc>
+        <w:tc>
+          <w:tcPr>
+            <w:tcW w:type="dxa" w:w="1938"/>
+          </w:tcPr>
+          <w:p/>
+        </w:tc>
+      </w:tr>
+      <w:tr>
+        <w:tc>
+          <w:tcPr>
+            <w:tcW w:type="dxa" w:w="1938"/>
+          </w:tcPr>
+          <w:p>
+            <w:r>
+              <w:rPr/>
+              <w:t>52</w:t>
+            </w:r>
+          </w:p>
+        </w:tc>
+        <w:tc>
+          <w:tcPr>
+            <w:tcW w:type="dxa" w:w="1938"/>
+          </w:tcPr>
+          <w:p/>
+        </w:tc>
+        <w:tc>
+          <w:tcPr>
+            <w:tcW w:type="dxa" w:w="1938"/>
+          </w:tcPr>
+          <w:p/>
+        </w:tc>
+        <w:tc>
+          <w:tcPr>
+            <w:tcW w:type="dxa" w:w="1938"/>
+          </w:tcPr>
+          <w:p/>
+        </w:tc>
+        <w:tc>
+          <w:tcPr>
+            <w:tcW w:type="dxa" w:w="1938"/>
+          </w:tcPr>
+          <w:p/>
+        </w:tc>
+      </w:tr>
+      <w:tr>
+        <w:tc>
+          <w:tcPr>
+            <w:tcW w:type="dxa" w:w="1938"/>
+          </w:tcPr>
+          <w:p>
+            <w:r>
+              <w:rPr/>
+              <w:t>53</w:t>
+            </w:r>
+          </w:p>
+        </w:tc>
+        <w:tc>
+          <w:tcPr>
+            <w:tcW w:type="dxa" w:w="1938"/>
+          </w:tcPr>
+          <w:p/>
+        </w:tc>
+        <w:tc>
+          <w:tcPr>
+            <w:tcW w:type="dxa" w:w="1938"/>
+          </w:tcPr>
+          <w:p/>
+        </w:tc>
+        <w:tc>
+          <w:tcPr>
+            <w:tcW w:type="dxa" w:w="1938"/>
+          </w:tcPr>
+          <w:p/>
+        </w:tc>
+        <w:tc>
+          <w:tcPr>
+            <w:tcW w:type="dxa" w:w="1938"/>
+          </w:tcPr>
+          <w:p/>
+        </w:tc>
+      </w:tr>
+      <w:tr>
+        <w:tc>
+          <w:tcPr>
+            <w:tcW w:type="dxa" w:w="1938"/>
+          </w:tcPr>
+          <w:p>
+            <w:r>
+              <w:rPr/>
+              <w:t>54</w:t>
+            </w:r>
+          </w:p>
+        </w:tc>
+        <w:tc>
+          <w:tcPr>
+            <w:tcW w:type="dxa" w:w="1938"/>
+          </w:tcPr>
+          <w:p/>
+        </w:tc>
+        <w:tc>
+          <w:tcPr>
+            <w:tcW w:type="dxa" w:w="1938"/>
+          </w:tcPr>
+          <w:p/>
+        </w:tc>
+        <w:tc>
+          <w:tcPr>
+            <w:tcW w:type="dxa" w:w="1938"/>
+          </w:tcPr>
+          <w:p/>
+        </w:tc>
+        <w:tc>
+          <w:tcPr>
+            <w:tcW w:type="dxa" w:w="1938"/>
+          </w:tcPr>
+          <w:p/>
+        </w:tc>
+      </w:tr>
+      <w:tr>
+        <w:tc>
+          <w:tcPr>
+            <w:tcW w:type="dxa" w:w="1938"/>
+          </w:tcPr>
+          <w:p>
+            <w:r>
+              <w:rPr/>
+              <w:t>55</w:t>
+            </w:r>
+          </w:p>
+        </w:tc>
+        <w:tc>
+          <w:tcPr>
+            <w:tcW w:type="dxa" w:w="1938"/>
+          </w:tcPr>
+          <w:p/>
+        </w:tc>
+        <w:tc>
+          <w:tcPr>
+            <w:tcW w:type="dxa" w:w="1938"/>
+          </w:tcPr>
+          <w:p/>
+        </w:tc>
+        <w:tc>
+          <w:tcPr>
+            <w:tcW w:type="dxa" w:w="1938"/>
+          </w:tcPr>
+          <w:p/>
+        </w:tc>
+        <w:tc>
+          <w:tcPr>
+            <w:tcW w:type="dxa" w:w="1938"/>
+          </w:tcPr>
+          <w:p/>
+        </w:tc>
+      </w:tr>
+      <w:tr>
+        <w:tc>
+          <w:tcPr>
+            <w:tcW w:type="dxa" w:w="1938"/>
+          </w:tcPr>
+          <w:p>
+            <w:r>
+              <w:rPr/>
+              <w:t>56</w:t>
+            </w:r>
+          </w:p>
+        </w:tc>
+        <w:tc>
+          <w:tcPr>
+            <w:tcW w:type="dxa" w:w="1938"/>
+          </w:tcPr>
+          <w:p/>
+        </w:tc>
+        <w:tc>
+          <w:tcPr>
+            <w:tcW w:type="dxa" w:w="1938"/>
+          </w:tcPr>
+          <w:p/>
+        </w:tc>
+        <w:tc>
+          <w:tcPr>
+            <w:tcW w:type="dxa" w:w="1938"/>
+          </w:tcPr>
+          <w:p/>
+        </w:tc>
+        <w:tc>
+          <w:tcPr>
+            <w:tcW w:type="dxa" w:w="1938"/>
+          </w:tcPr>
+          <w:p/>
+        </w:tc>
+      </w:tr>
+      <w:tr>
+        <w:tc>
+          <w:tcPr>
+            <w:tcW w:type="dxa" w:w="1938"/>
+          </w:tcPr>
+          <w:p>
+            <w:r>
+              <w:rPr/>
+              <w:t>57</w:t>
+            </w:r>
+          </w:p>
+        </w:tc>
+        <w:tc>
+          <w:tcPr>
+            <w:tcW w:type="dxa" w:w="1938"/>
+          </w:tcPr>
+          <w:p/>
+        </w:tc>
+        <w:tc>
+          <w:tcPr>
+            <w:tcW w:type="dxa" w:w="1938"/>
+          </w:tcPr>
+          <w:p/>
+        </w:tc>
+        <w:tc>
+          <w:tcPr>
+            <w:tcW w:type="dxa" w:w="1938"/>
+          </w:tcPr>
+          <w:p/>
+        </w:tc>
+        <w:tc>
+          <w:tcPr>
+            <w:tcW w:type="dxa" w:w="1938"/>
+          </w:tcPr>
+          <w:p/>
+        </w:tc>
+      </w:tr>
+      <w:tr>
+        <w:tc>
+          <w:tcPr>
+            <w:tcW w:type="dxa" w:w="1938"/>
+          </w:tcPr>
+          <w:p>
+            <w:r>
+              <w:rPr/>
+              <w:t>58</w:t>
+            </w:r>
+          </w:p>
+        </w:tc>
+        <w:tc>
+          <w:tcPr>
+            <w:tcW w:type="dxa" w:w="1938"/>
+          </w:tcPr>
+          <w:p/>
+        </w:tc>
+        <w:tc>
+          <w:tcPr>
+            <w:tcW w:type="dxa" w:w="1938"/>
+          </w:tcPr>
+          <w:p/>
+        </w:tc>
+        <w:tc>
+          <w:tcPr>
+            <w:tcW w:type="dxa" w:w="1938"/>
+          </w:tcPr>
+          <w:p/>
+        </w:tc>
+        <w:tc>
+          <w:tcPr>
+            <w:tcW w:type="dxa" w:w="1938"/>
+          </w:tcPr>
+          <w:p/>
+        </w:tc>
+      </w:tr>
+      <w:tr>
+        <w:tc>
+          <w:tcPr>
+            <w:tcW w:type="dxa" w:w="1938"/>
+          </w:tcPr>
+          <w:p>
+            <w:r>
+              <w:rPr/>
+              <w:t>59</w:t>
+            </w:r>
+          </w:p>
+        </w:tc>
+        <w:tc>
+          <w:tcPr>
+            <w:tcW w:type="dxa" w:w="1938"/>
+          </w:tcPr>
+          <w:p/>
+        </w:tc>
+        <w:tc>
+          <w:tcPr>
+            <w:tcW w:type="dxa" w:w="1938"/>
+          </w:tcPr>
+          <w:p/>
+        </w:tc>
+        <w:tc>
+          <w:tcPr>
+            <w:tcW w:type="dxa" w:w="1938"/>
+          </w:tcPr>
+          <w:p/>
+        </w:tc>
+        <w:tc>
+          <w:tcPr>
+            <w:tcW w:type="dxa" w:w="1938"/>
+          </w:tcPr>
+          <w:p/>
+        </w:tc>
+      </w:tr>
+      <w:tr>
+        <w:tc>
+          <w:tcPr>
+            <w:tcW w:type="dxa" w:w="1938"/>
+          </w:tcPr>
+          <w:p>
+            <w:r>
+              <w:rPr/>
+              <w:t>60</w:t>
+            </w:r>
+          </w:p>
+        </w:tc>
+        <w:tc>
+          <w:tcPr>
+            <w:tcW w:type="dxa" w:w="1938"/>
+          </w:tcPr>
+          <w:p/>
+        </w:tc>
+        <w:tc>
+          <w:tcPr>
+            <w:tcW w:type="dxa" w:w="1938"/>
+          </w:tcPr>
+          <w:p/>
+        </w:tc>
+        <w:tc>
+          <w:tcPr>
+            <w:tcW w:type="dxa" w:w="1938"/>
+          </w:tcPr>
+          <w:p/>
+        </w:tc>
+        <w:tc>
+          <w:tcPr>
+            <w:tcW w:type="dxa" w:w="1938"/>
+          </w:tcPr>
+          <w:p/>
+        </w:tc>
+      </w:tr>
+      <w:tr>
+        <w:tc>
+          <w:tcPr>
+            <w:tcW w:type="dxa" w:w="1938"/>
+          </w:tcPr>
+          <w:p>
+            <w:r>
+              <w:rPr/>
+              <w:t>61</w:t>
+            </w:r>
+          </w:p>
+        </w:tc>
+        <w:tc>
+          <w:tcPr>
+            <w:tcW w:type="dxa" w:w="1938"/>
+          </w:tcPr>
+          <w:p/>
+        </w:tc>
+        <w:tc>
+          <w:tcPr>
+            <w:tcW w:type="dxa" w:w="1938"/>
+          </w:tcPr>
+          <w:p/>
+        </w:tc>
+        <w:tc>
+          <w:tcPr>
+            <w:tcW w:type="dxa" w:w="1938"/>
+          </w:tcPr>
+          <w:p/>
+        </w:tc>
+        <w:tc>
+          <w:tcPr>
+            <w:tcW w:type="dxa" w:w="1938"/>
+          </w:tcPr>
+          <w:p/>
+        </w:tc>
+      </w:tr>
+      <w:tr>
+        <w:tc>
+          <w:tcPr>
+            <w:tcW w:type="dxa" w:w="1938"/>
+          </w:tcPr>
+          <w:p>
+            <w:r>
+              <w:rPr/>
+              <w:t>62</w:t>
+            </w:r>
+          </w:p>
+        </w:tc>
+        <w:tc>
+          <w:tcPr>
+            <w:tcW w:type="dxa" w:w="1938"/>
+          </w:tcPr>
+          <w:p/>
+        </w:tc>
+        <w:tc>
+          <w:tcPr>
+            <w:tcW w:type="dxa" w:w="1938"/>
+          </w:tcPr>
+          <w:p/>
+        </w:tc>
+        <w:tc>
+          <w:tcPr>
+            <w:tcW w:type="dxa" w:w="1938"/>
+          </w:tcPr>
+          <w:p/>
+        </w:tc>
+        <w:tc>
+          <w:tcPr>
+            <w:tcW w:type="dxa" w:w="1938"/>
+          </w:tcPr>
+          <w:p/>
+        </w:tc>
+      </w:tr>
+      <w:tr>
+        <w:tc>
+          <w:tcPr>
+            <w:tcW w:type="dxa" w:w="1938"/>
+          </w:tcPr>
+          <w:p>
+            <w:r>
+              <w:rPr/>
+              <w:t>63</w:t>
+            </w:r>
+          </w:p>
+        </w:tc>
+        <w:tc>
+          <w:tcPr>
+            <w:tcW w:type="dxa" w:w="1938"/>
+          </w:tcPr>
+          <w:p/>
+        </w:tc>
+        <w:tc>
+          <w:tcPr>
+            <w:tcW w:type="dxa" w:w="1938"/>
+          </w:tcPr>
+          <w:p/>
+        </w:tc>
+        <w:tc>
+          <w:tcPr>
+            <w:tcW w:type="dxa" w:w="1938"/>
+          </w:tcPr>
+          <w:p/>
+        </w:tc>
+        <w:tc>
+          <w:tcPr>
+            <w:tcW w:type="dxa" w:w="1938"/>
+          </w:tcPr>
+          <w:p/>
+        </w:tc>
+      </w:tr>
+      <w:tr>
+        <w:tc>
+          <w:tcPr>
+            <w:tcW w:type="dxa" w:w="1938"/>
+          </w:tcPr>
+          <w:p>
+            <w:r>
+              <w:rPr/>
+              <w:t>64</w:t>
+            </w:r>
+          </w:p>
+        </w:tc>
+        <w:tc>
+          <w:tcPr>
+            <w:tcW w:type="dxa" w:w="1938"/>
+          </w:tcPr>
+          <w:p/>
+        </w:tc>
+        <w:tc>
+          <w:tcPr>
+            <w:tcW w:type="dxa" w:w="1938"/>
+          </w:tcPr>
+          <w:p/>
+        </w:tc>
+        <w:tc>
+          <w:tcPr>
+            <w:tcW w:type="dxa" w:w="1938"/>
+          </w:tcPr>
+          <w:p/>
+        </w:tc>
+        <w:tc>
+          <w:tcPr>
+            <w:tcW w:type="dxa" w:w="1938"/>
+          </w:tcPr>
+          <w:p/>
+        </w:tc>
+      </w:tr>
+      <w:tr>
+        <w:tc>
+          <w:tcPr>
+            <w:tcW w:type="dxa" w:w="1938"/>
+          </w:tcPr>
+          <w:p>
+            <w:r>
+              <w:rPr/>
+              <w:t>65</w:t>
+            </w:r>
+          </w:p>
+        </w:tc>
+        <w:tc>
+          <w:tcPr>
+            <w:tcW w:type="dxa" w:w="1938"/>
+          </w:tcPr>
+          <w:p/>
+        </w:tc>
+        <w:tc>
+          <w:tcPr>
+            <w:tcW w:type="dxa" w:w="1938"/>
+          </w:tcPr>
+          <w:p/>
+        </w:tc>
+        <w:tc>
+          <w:tcPr>
+            <w:tcW w:type="dxa" w:w="1938"/>
+          </w:tcPr>
+          <w:p/>
+        </w:tc>
+        <w:tc>
+          <w:tcPr>
+            <w:tcW w:type="dxa" w:w="1938"/>
+          </w:tcPr>
+          <w:p/>
+        </w:tc>
+      </w:tr>
+      <w:tr>
+        <w:tc>
+          <w:tcPr>
+            <w:tcW w:type="dxa" w:w="1938"/>
+          </w:tcPr>
+          <w:p>
+            <w:r>
+              <w:rPr/>
+              <w:t>66</w:t>
+            </w:r>
+          </w:p>
+        </w:tc>
+        <w:tc>
+          <w:tcPr>
+            <w:tcW w:type="dxa" w:w="1938"/>
+          </w:tcPr>
+          <w:p/>
+        </w:tc>
+        <w:tc>
+          <w:tcPr>
+            <w:tcW w:type="dxa" w:w="1938"/>
+          </w:tcPr>
+          <w:p/>
+        </w:tc>
+        <w:tc>
+          <w:tcPr>
+            <w:tcW w:type="dxa" w:w="1938"/>
+          </w:tcPr>
+          <w:p/>
+        </w:tc>
+        <w:tc>
+          <w:tcPr>
+            <w:tcW w:type="dxa" w:w="1938"/>
+          </w:tcPr>
+          <w:p/>
+        </w:tc>
+      </w:tr>
+      <w:tr>
+        <w:tc>
+          <w:tcPr>
+            <w:tcW w:type="dxa" w:w="1938"/>
+          </w:tcPr>
+          <w:p>
+            <w:r>
+              <w:rPr/>
+              <w:t>67</w:t>
+            </w:r>
+          </w:p>
+        </w:tc>
+        <w:tc>
+          <w:tcPr>
+            <w:tcW w:type="dxa" w:w="1938"/>
+          </w:tcPr>
+          <w:p/>
+        </w:tc>
+        <w:tc>
+          <w:tcPr>
+            <w:tcW w:type="dxa" w:w="1938"/>
+          </w:tcPr>
+          <w:p/>
+        </w:tc>
+        <w:tc>
+          <w:tcPr>
+            <w:tcW w:type="dxa" w:w="1938"/>
+          </w:tcPr>
+          <w:p/>
+        </w:tc>
+        <w:tc>
+          <w:tcPr>
+            <w:tcW w:type="dxa" w:w="1938"/>
+          </w:tcPr>
+          <w:p/>
+        </w:tc>
+      </w:tr>
+      <w:tr>
+        <w:tc>
+          <w:tcPr>
+            <w:tcW w:type="dxa" w:w="1938"/>
+          </w:tcPr>
+          <w:p>
+            <w:r>
+              <w:rPr/>
+              <w:t>68</w:t>
+            </w:r>
+          </w:p>
+        </w:tc>
+        <w:tc>
+          <w:tcPr>
+            <w:tcW w:type="dxa" w:w="1938"/>
+          </w:tcPr>
+          <w:p/>
+        </w:tc>
+        <w:tc>
+          <w:tcPr>
+            <w:tcW w:type="dxa" w:w="1938"/>
+          </w:tcPr>
+          <w:p/>
+        </w:tc>
+        <w:tc>
+          <w:tcPr>
+            <w:tcW w:type="dxa" w:w="1938"/>
+          </w:tcPr>
+          <w:p/>
+        </w:tc>
+        <w:tc>
+          <w:tcPr>
+            <w:tcW w:type="dxa" w:w="1938"/>
+          </w:tcPr>
+          <w:p/>
+        </w:tc>
+      </w:tr>
+      <w:tr>
+        <w:tc>
+          <w:tcPr>
+            <w:tcW w:type="dxa" w:w="1938"/>
+          </w:tcPr>
+          <w:p>
+            <w:r>
+              <w:rPr/>
+              <w:t>69</w:t>
+            </w:r>
+          </w:p>
+        </w:tc>
+        <w:tc>
+          <w:tcPr>
+            <w:tcW w:type="dxa" w:w="1938"/>
+          </w:tcPr>
+          <w:p/>
+        </w:tc>
+        <w:tc>
+          <w:tcPr>
+            <w:tcW w:type="dxa" w:w="1938"/>
+          </w:tcPr>
+          <w:p/>
+        </w:tc>
+        <w:tc>
+          <w:tcPr>
+            <w:tcW w:type="dxa" w:w="1938"/>
+          </w:tcPr>
+          <w:p/>
+        </w:tc>
+        <w:tc>
+          <w:tcPr>
+            <w:tcW w:type="dxa" w:w="1938"/>
+          </w:tcPr>
+          <w:p/>
+        </w:tc>
+      </w:tr>
+      <w:tr>
+        <w:tc>
+          <w:tcPr>
+            <w:tcW w:type="dxa" w:w="1938"/>
+          </w:tcPr>
+          <w:p>
+            <w:r>
+              <w:rPr/>
+              <w:t>70</w:t>
+            </w:r>
+          </w:p>
+        </w:tc>
+        <w:tc>
+          <w:tcPr>
+            <w:tcW w:type="dxa" w:w="1938"/>
+          </w:tcPr>
+          <w:p/>
+        </w:tc>
+        <w:tc>
+          <w:tcPr>
+            <w:tcW w:type="dxa" w:w="1938"/>
+          </w:tcPr>
+          <w:p/>
+        </w:tc>
+        <w:tc>
+          <w:tcPr>
+            <w:tcW w:type="dxa" w:w="1938"/>
+          </w:tcPr>
+          <w:p/>
+        </w:tc>
+        <w:tc>
+          <w:tcPr>
+            <w:tcW w:type="dxa" w:w="1938"/>
+          </w:tcPr>
+          <w:p/>
+        </w:tc>
+      </w:tr>
+      <w:tr>
+        <w:tc>
+          <w:tcPr>
+            <w:tcW w:type="dxa" w:w="1938"/>
+          </w:tcPr>
+          <w:p>
+            <w:r>
+              <w:rPr/>
+              <w:t>71</w:t>
+            </w:r>
+          </w:p>
+        </w:tc>
+        <w:tc>
+          <w:tcPr>
+            <w:tcW w:type="dxa" w:w="1938"/>
+          </w:tcPr>
+          <w:p/>
+        </w:tc>
+        <w:tc>
+          <w:tcPr>
+            <w:tcW w:type="dxa" w:w="1938"/>
+          </w:tcPr>
+          <w:p/>
+        </w:tc>
+        <w:tc>
+          <w:tcPr>
+            <w:tcW w:type="dxa" w:w="1938"/>
+          </w:tcPr>
+          <w:p/>
+        </w:tc>
+        <w:tc>
+          <w:tcPr>
+            <w:tcW w:type="dxa" w:w="1938"/>
+          </w:tcPr>
+          <w:p/>
+        </w:tc>
+      </w:tr>
+    </w:tbl>
+    <w:p>
+      <w:pPr>
+        <w:spacing w:after="160"/>
+      </w:pPr>
+      <w:r>
+        <w:rPr>
+          <w:i/>
+        </w:rPr>
+        <w:t>Anexar hojas adicionales con la misma tabla si se requiere más espacio. Esta hoja puede circular por separado del folleto de bolsillo y acompañarse con una copia del resumen de la propuesta.</w:t>
       </w:r>
     </w:p>
     <w:sectPr>
@@ -27731,7 +31230,7 @@
         <w:color w:val="7A8796"/>
         <w:sz w:val="16"/>
       </w:rPr>
-      <w:t>Fraccionamiento Sole — El Toro</w:t>
+      <w:t>Propuesta Solé</w:t>
     </w:r>
   </w:p>
 </w:hdr>

</xml_diff>